<commit_message>
add validation milestone evidence
</commit_message>
<xml_diff>
--- a/docs/deliverables/AI_Usage_Log.docx
+++ b/docs/deliverables/AI_Usage_Log.docx
@@ -631,6 +631,372 @@
             </w:pPr>
             <w:r>
               <w:t xml:space="preserve">Found and fixed two code defects (a pandas 3 timestamp-resolution incompatibility in both parsers that scaled ODK durations wrongly on a fresh install, and the Q-01 response-time feature duplicating Q-10 instead of matching its documented definition), added a parser regression test, corrected citation years and feature formulas in the documentation, and rebuilt the Word deliverables and presentation from the reconciled sources. All fixes reviewed by me and verified by the test suite and regenerated validation runs</w:t>
+            </w:r>
+          </w:p>
+        </w:tc>
+      </w:tr>
+      <w:tr>
+        <w:tc>
+          <w:tcPr/>
+          <w:p>
+            <w:pPr>
+              <w:pStyle w:val="Compact"/>
+            </w:pPr>
+            <w:r>
+              <w:t xml:space="preserve">19 Aug 2026</w:t>
+            </w:r>
+          </w:p>
+        </w:tc>
+        <w:tc>
+          <w:tcPr/>
+          <w:p>
+            <w:pPr>
+              <w:pStyle w:val="Compact"/>
+            </w:pPr>
+            <w:r>
+              <w:t xml:space="preserve">Claude</w:t>
+            </w:r>
+          </w:p>
+        </w:tc>
+        <w:tc>
+          <w:tcPr/>
+          <w:p>
+            <w:pPr>
+              <w:pStyle w:val="Compact"/>
+            </w:pPr>
+            <w:r>
+              <w:t xml:space="preserve">Repository and evidence-trail audit ahead of the milestone submissions</w:t>
+            </w:r>
+          </w:p>
+        </w:tc>
+        <w:tc>
+          <w:tcPr/>
+          <w:p>
+            <w:pPr>
+              <w:pStyle w:val="Compact"/>
+            </w:pPr>
+            <w:r>
+              <w:t xml:space="preserve">Found the GitHub default branch had been renamed, leaving every evidence link broken, and restored it. Created annotated milestone tags, then checked each against the tree it pointed at and moved two that named commits where the validation report was still incomplete. Verified all 33 commit links and 26 file paths in the tracker and evidence index resolve. Corrected a precision range quoted as 0.95 which the underlying data put at 0.96. All changes reviewed by me before commit</w:t>
+            </w:r>
+          </w:p>
+        </w:tc>
+      </w:tr>
+      <w:tr>
+        <w:tc>
+          <w:tcPr/>
+          <w:p>
+            <w:pPr>
+              <w:pStyle w:val="Compact"/>
+            </w:pPr>
+            <w:r>
+              <w:t xml:space="preserve">19 Aug 2026</w:t>
+            </w:r>
+          </w:p>
+        </w:tc>
+        <w:tc>
+          <w:tcPr/>
+          <w:p>
+            <w:pPr>
+              <w:pStyle w:val="Compact"/>
+            </w:pPr>
+            <w:r>
+              <w:t xml:space="preserve">Claude</w:t>
+            </w:r>
+          </w:p>
+        </w:tc>
+        <w:tc>
+          <w:tcPr/>
+          <w:p>
+            <w:pPr>
+              <w:pStyle w:val="Compact"/>
+            </w:pPr>
+            <w:r>
+              <w:t xml:space="preserve">Completion of the validation report against the proposal requirements</w:t>
+            </w:r>
+          </w:p>
+        </w:tc>
+        <w:tc>
+          <w:tcPr/>
+          <w:p>
+            <w:pPr>
+              <w:pStyle w:val="Compact"/>
+            </w:pPr>
+            <w:r>
+              <w:t xml:space="preserve">Identified that the report quoted per-type detection from the single best run rather than the four-run aggregate, and that it lacked the effect sizes and baseline figures the proposal requires. Recomputed the aggregate from</w:t>
+            </w:r>
+            <w:r>
+              <w:t xml:space="preserve"> </w:t>
+            </w:r>
+            <w:r>
+              <w:rPr>
+                <w:rStyle w:val="VerbatimChar"/>
+              </w:rPr>
+              <w:t xml:space="preserve">detection_by_type_stress_seed*.csv</w:t>
+            </w:r>
+            <w:r>
+              <w:t xml:space="preserve">, and drew the effect sizes and baseline results from the existing</w:t>
+            </w:r>
+            <w:r>
+              <w:t xml:space="preserve"> </w:t>
+            </w:r>
+            <w:r>
+              <w:rPr>
+                <w:rStyle w:val="VerbatimChar"/>
+              </w:rPr>
+              <w:t xml:space="preserve">feature_validation_results.csv</w:t>
+            </w:r>
+            <w:r>
+              <w:t xml:space="preserve"> </w:t>
+            </w:r>
+            <w:r>
+              <w:t xml:space="preserve">and</w:t>
+            </w:r>
+            <w:r>
+              <w:t xml:space="preserve"> </w:t>
+            </w:r>
+            <w:r>
+              <w:rPr>
+                <w:rStyle w:val="VerbatimChar"/>
+              </w:rPr>
+              <w:t xml:space="preserve">strict_examiner_audit_report.md</w:t>
+            </w:r>
+            <w:r>
+              <w:t xml:space="preserve">. No new analysis was invented; the figures already existed and had not been written up. I reviewed each against its source file</w:t>
+            </w:r>
+          </w:p>
+        </w:tc>
+      </w:tr>
+      <w:tr>
+        <w:tc>
+          <w:tcPr/>
+          <w:p>
+            <w:pPr>
+              <w:pStyle w:val="Compact"/>
+            </w:pPr>
+            <w:r>
+              <w:t xml:space="preserve">19 Aug 2026</w:t>
+            </w:r>
+          </w:p>
+        </w:tc>
+        <w:tc>
+          <w:tcPr/>
+          <w:p>
+            <w:pPr>
+              <w:pStyle w:val="Compact"/>
+            </w:pPr>
+            <w:r>
+              <w:t xml:space="preserve">Claude</w:t>
+            </w:r>
+          </w:p>
+        </w:tc>
+        <w:tc>
+          <w:tcPr/>
+          <w:p>
+            <w:pPr>
+              <w:pStyle w:val="Compact"/>
+            </w:pPr>
+            <w:r>
+              <w:t xml:space="preserve">Test scaffolding: continuous integration workflows</w:t>
+            </w:r>
+          </w:p>
+        </w:tc>
+        <w:tc>
+          <w:tcPr/>
+          <w:p>
+            <w:pPr>
+              <w:pStyle w:val="Compact"/>
+            </w:pPr>
+            <w:r>
+              <w:t xml:space="preserve">Wrote</w:t>
+            </w:r>
+            <w:r>
+              <w:t xml:space="preserve"> </w:t>
+            </w:r>
+            <w:r>
+              <w:rPr>
+                <w:rStyle w:val="VerbatimChar"/>
+              </w:rPr>
+              <w:t xml:space="preserve">.github/workflows/ci.yml</w:t>
+            </w:r>
+            <w:r>
+              <w:t xml:space="preserve"> </w:t>
+            </w:r>
+            <w:r>
+              <w:t xml:space="preserve">and</w:t>
+            </w:r>
+            <w:r>
+              <w:t xml:space="preserve"> </w:t>
+            </w:r>
+            <w:r>
+              <w:rPr>
+                <w:rStyle w:val="VerbatimChar"/>
+              </w:rPr>
+              <w:t xml:space="preserve">full-validation.yml</w:t>
+            </w:r>
+            <w:r>
+              <w:t xml:space="preserve">, including a pandas 2 and pandas 3 matrix chosen because the July audit found a pandas 3 defect that single-version testing would not catch, and a gate that fails the build if any evaluated run falls below the proposal thresholds. I specified the intent; the YAML and the gate script were drafted by Claude and verified by me against local runs before commit</w:t>
+            </w:r>
+          </w:p>
+        </w:tc>
+      </w:tr>
+      <w:tr>
+        <w:tc>
+          <w:tcPr/>
+          <w:p>
+            <w:pPr>
+              <w:pStyle w:val="Compact"/>
+            </w:pPr>
+            <w:r>
+              <w:t xml:space="preserve">19 Aug 2026</w:t>
+            </w:r>
+          </w:p>
+        </w:tc>
+        <w:tc>
+          <w:tcPr/>
+          <w:p>
+            <w:pPr>
+              <w:pStyle w:val="Compact"/>
+            </w:pPr>
+            <w:r>
+              <w:t xml:space="preserve">Claude</w:t>
+            </w:r>
+          </w:p>
+        </w:tc>
+        <w:tc>
+          <w:tcPr/>
+          <w:p>
+            <w:pPr>
+              <w:pStyle w:val="Compact"/>
+            </w:pPr>
+            <w:r>
+              <w:t xml:space="preserve">Reproducibility check of the full validation round</w:t>
+            </w:r>
+          </w:p>
+        </w:tc>
+        <w:tc>
+          <w:tcPr/>
+          <w:p>
+            <w:pPr>
+              <w:pStyle w:val="Compact"/>
+            </w:pPr>
+            <w:r>
+              <w:t xml:space="preserve">Regenerated all ten datasets from recorded seeds and re-ran every evaluation. All reported figures reproduced exactly; the only differences were runtime columns and floating-point noise at the 1e-15 level. This confirmed the reproducibility claim in the validation report rather than changing any result</w:t>
+            </w:r>
+          </w:p>
+        </w:tc>
+      </w:tr>
+      <w:tr>
+        <w:tc>
+          <w:tcPr/>
+          <w:p>
+            <w:pPr>
+              <w:pStyle w:val="Compact"/>
+            </w:pPr>
+            <w:r>
+              <w:t xml:space="preserve">19 Aug 2026</w:t>
+            </w:r>
+          </w:p>
+        </w:tc>
+        <w:tc>
+          <w:tcPr/>
+          <w:p>
+            <w:pPr>
+              <w:pStyle w:val="Compact"/>
+            </w:pPr>
+            <w:r>
+              <w:t xml:space="preserve">Claude</w:t>
+            </w:r>
+          </w:p>
+        </w:tc>
+        <w:tc>
+          <w:tcPr/>
+          <w:p>
+            <w:pPr>
+              <w:pStyle w:val="Compact"/>
+            </w:pPr>
+            <w:r>
+              <w:t xml:space="preserve">Detector debugging: bounded diagnostic pass on fabricated false negatives</w:t>
+            </w:r>
+          </w:p>
+        </w:tc>
+        <w:tc>
+          <w:tcPr/>
+          <w:p>
+            <w:pPr>
+              <w:pStyle w:val="Compact"/>
+            </w:pPr>
+            <w:r>
+              <w:t xml:space="preserve">Requested by my supervisor. Analysis run on development seeds 11 and 42 only, with held-out seeds 7 and 99 untouched and no threshold changed. Established that the stress generator emits two fabricated profiles, that all misses fall in one of them, and that response time entropy separates fabricated from genuine interviews with no overlap on those datasets. Traced the misses to an absolute entropy constant calibrated to the other profile and to contamination of the interquartile fence, and identified that the Tukey lower fence is unreachable on right-skewed non-negative features. This corrected an explanation I had previously given in both the validation report and the final report, which attributed the misses to a joint pattern univariate methods cannot capture. Findings in</w:t>
+            </w:r>
+            <w:r>
+              <w:t xml:space="preserve"> </w:t>
+            </w:r>
+            <w:r>
+              <w:rPr>
+                <w:rStyle w:val="VerbatimChar"/>
+              </w:rPr>
+              <w:t xml:space="preserve">docs/fabricated_detection_diagnostic.md</w:t>
+            </w:r>
+            <w:r>
+              <w:t xml:space="preserve">; I verified each figure against the run outputs before accepting it</w:t>
+            </w:r>
+          </w:p>
+        </w:tc>
+      </w:tr>
+      <w:tr>
+        <w:tc>
+          <w:tcPr/>
+          <w:p>
+            <w:pPr>
+              <w:pStyle w:val="Compact"/>
+            </w:pPr>
+            <w:r>
+              <w:t xml:space="preserve">19 Aug 2026</w:t>
+            </w:r>
+          </w:p>
+        </w:tc>
+        <w:tc>
+          <w:tcPr/>
+          <w:p>
+            <w:pPr>
+              <w:pStyle w:val="Compact"/>
+            </w:pPr>
+            <w:r>
+              <w:t xml:space="preserve">Claude</w:t>
+            </w:r>
+          </w:p>
+        </w:tc>
+        <w:tc>
+          <w:tcPr/>
+          <w:p>
+            <w:pPr>
+              <w:pStyle w:val="Compact"/>
+            </w:pPr>
+            <w:r>
+              <w:t xml:space="preserve">Feature coverage tabulation</w:t>
+            </w:r>
+          </w:p>
+        </w:tc>
+        <w:tc>
+          <w:tcPr/>
+          <w:p>
+            <w:pPr>
+              <w:pStyle w:val="Compact"/>
+            </w:pPr>
+            <w:r>
+              <w:t xml:space="preserve">Wrote</w:t>
+            </w:r>
+            <w:r>
+              <w:t xml:space="preserve"> </w:t>
+            </w:r>
+            <w:r>
+              <w:rPr>
+                <w:rStyle w:val="VerbatimChar"/>
+              </w:rPr>
+              <w:t xml:space="preserve">scripts/build_feature_coverage.py</w:t>
+            </w:r>
+            <w:r>
+              <w:t xml:space="preserve">, which derives the coverage table from the source tree, the recorded pipeline outputs and the test files rather than from a hand-maintained list. I specified that direct and end-to-end coverage be reported separately rather than merged, so the 22 of 40 direct figure is visible</w:t>
             </w:r>
           </w:p>
         </w:tc>
@@ -1073,6 +1439,240 @@
       <w:sz w:val="20"/>
       <w:szCs w:val="20"/>
     </w:rPr>
+  </w:style>
+  <w:style w:customStyle="1" w:styleId="SourceCode" w:type="paragraph">
+    <w:name w:val="Source Code"/>
+    <w:basedOn w:val="Normal"/>
+    <w:link w:val="VerbatimChar"/>
+    <w:pPr>
+      <w:wordWrap w:val="off"/>
+    </w:pPr>
+  </w:style>
+  <w:style w:customStyle="1" w:styleId="KeywordTok" w:type="character">
+    <w:name w:val="KeywordTok"/>
+    <w:basedOn w:val="VerbatimChar"/>
+    <w:rPr>
+      <w:b/>
+      <w:color w:val="007020"/>
+    </w:rPr>
+  </w:style>
+  <w:style w:customStyle="1" w:styleId="DataTypeTok" w:type="character">
+    <w:name w:val="DataTypeTok"/>
+    <w:basedOn w:val="VerbatimChar"/>
+    <w:rPr>
+      <w:color w:val="902000"/>
+    </w:rPr>
+  </w:style>
+  <w:style w:customStyle="1" w:styleId="DecValTok" w:type="character">
+    <w:name w:val="DecValTok"/>
+    <w:basedOn w:val="VerbatimChar"/>
+    <w:rPr>
+      <w:color w:val="40a070"/>
+    </w:rPr>
+  </w:style>
+  <w:style w:customStyle="1" w:styleId="BaseNTok" w:type="character">
+    <w:name w:val="BaseNTok"/>
+    <w:basedOn w:val="VerbatimChar"/>
+    <w:rPr>
+      <w:color w:val="40a070"/>
+    </w:rPr>
+  </w:style>
+  <w:style w:customStyle="1" w:styleId="FloatTok" w:type="character">
+    <w:name w:val="FloatTok"/>
+    <w:basedOn w:val="VerbatimChar"/>
+    <w:rPr>
+      <w:color w:val="40a070"/>
+    </w:rPr>
+  </w:style>
+  <w:style w:customStyle="1" w:styleId="ConstantTok" w:type="character">
+    <w:name w:val="ConstantTok"/>
+    <w:basedOn w:val="VerbatimChar"/>
+    <w:rPr>
+      <w:color w:val="880000"/>
+    </w:rPr>
+  </w:style>
+  <w:style w:customStyle="1" w:styleId="CharTok" w:type="character">
+    <w:name w:val="CharTok"/>
+    <w:basedOn w:val="VerbatimChar"/>
+    <w:rPr>
+      <w:color w:val="4070a0"/>
+    </w:rPr>
+  </w:style>
+  <w:style w:customStyle="1" w:styleId="SpecialCharTok" w:type="character">
+    <w:name w:val="SpecialCharTok"/>
+    <w:basedOn w:val="VerbatimChar"/>
+    <w:rPr>
+      <w:color w:val="4070a0"/>
+    </w:rPr>
+  </w:style>
+  <w:style w:customStyle="1" w:styleId="StringTok" w:type="character">
+    <w:name w:val="StringTok"/>
+    <w:basedOn w:val="VerbatimChar"/>
+    <w:rPr>
+      <w:color w:val="4070a0"/>
+    </w:rPr>
+  </w:style>
+  <w:style w:customStyle="1" w:styleId="VerbatimStringTok" w:type="character">
+    <w:name w:val="VerbatimStringTok"/>
+    <w:basedOn w:val="VerbatimChar"/>
+    <w:rPr>
+      <w:color w:val="4070a0"/>
+    </w:rPr>
+  </w:style>
+  <w:style w:customStyle="1" w:styleId="SpecialStringTok" w:type="character">
+    <w:name w:val="SpecialStringTok"/>
+    <w:basedOn w:val="VerbatimChar"/>
+    <w:rPr>
+      <w:color w:val="bb6688"/>
+    </w:rPr>
+  </w:style>
+  <w:style w:customStyle="1" w:styleId="ImportTok" w:type="character">
+    <w:name w:val="ImportTok"/>
+    <w:basedOn w:val="VerbatimChar"/>
+    <w:rPr>
+      <w:b/>
+      <w:color w:val="008000"/>
+    </w:rPr>
+  </w:style>
+  <w:style w:customStyle="1" w:styleId="CommentTok" w:type="character">
+    <w:name w:val="CommentTok"/>
+    <w:basedOn w:val="VerbatimChar"/>
+    <w:rPr>
+      <w:i/>
+      <w:color w:val="60a0b0"/>
+    </w:rPr>
+  </w:style>
+  <w:style w:customStyle="1" w:styleId="DocumentationTok" w:type="character">
+    <w:name w:val="DocumentationTok"/>
+    <w:basedOn w:val="VerbatimChar"/>
+    <w:rPr>
+      <w:i/>
+      <w:color w:val="ba2121"/>
+    </w:rPr>
+  </w:style>
+  <w:style w:customStyle="1" w:styleId="AnnotationTok" w:type="character">
+    <w:name w:val="AnnotationTok"/>
+    <w:basedOn w:val="VerbatimChar"/>
+    <w:rPr>
+      <w:b/>
+      <w:i/>
+      <w:color w:val="60a0b0"/>
+    </w:rPr>
+  </w:style>
+  <w:style w:customStyle="1" w:styleId="CommentVarTok" w:type="character">
+    <w:name w:val="CommentVarTok"/>
+    <w:basedOn w:val="VerbatimChar"/>
+    <w:rPr>
+      <w:b/>
+      <w:i/>
+      <w:color w:val="60a0b0"/>
+    </w:rPr>
+  </w:style>
+  <w:style w:customStyle="1" w:styleId="OtherTok" w:type="character">
+    <w:name w:val="OtherTok"/>
+    <w:basedOn w:val="VerbatimChar"/>
+    <w:rPr>
+      <w:color w:val="007020"/>
+    </w:rPr>
+  </w:style>
+  <w:style w:customStyle="1" w:styleId="FunctionTok" w:type="character">
+    <w:name w:val="FunctionTok"/>
+    <w:basedOn w:val="VerbatimChar"/>
+    <w:rPr>
+      <w:color w:val="06287e"/>
+    </w:rPr>
+  </w:style>
+  <w:style w:customStyle="1" w:styleId="VariableTok" w:type="character">
+    <w:name w:val="VariableTok"/>
+    <w:basedOn w:val="VerbatimChar"/>
+    <w:rPr>
+      <w:color w:val="19177c"/>
+    </w:rPr>
+  </w:style>
+  <w:style w:customStyle="1" w:styleId="ControlFlowTok" w:type="character">
+    <w:name w:val="ControlFlowTok"/>
+    <w:basedOn w:val="VerbatimChar"/>
+    <w:rPr>
+      <w:b/>
+      <w:color w:val="007020"/>
+    </w:rPr>
+  </w:style>
+  <w:style w:customStyle="1" w:styleId="OperatorTok" w:type="character">
+    <w:name w:val="OperatorTok"/>
+    <w:basedOn w:val="VerbatimChar"/>
+    <w:rPr>
+      <w:color w:val="666666"/>
+    </w:rPr>
+  </w:style>
+  <w:style w:customStyle="1" w:styleId="BuiltInTok" w:type="character">
+    <w:name w:val="BuiltInTok"/>
+    <w:basedOn w:val="VerbatimChar"/>
+    <w:rPr>
+      <w:color w:val="008000"/>
+    </w:rPr>
+  </w:style>
+  <w:style w:customStyle="1" w:styleId="ExtensionTok" w:type="character">
+    <w:name w:val="ExtensionTok"/>
+    <w:basedOn w:val="VerbatimChar"/>
+    <w:rPr/>
+  </w:style>
+  <w:style w:customStyle="1" w:styleId="PreprocessorTok" w:type="character">
+    <w:name w:val="PreprocessorTok"/>
+    <w:basedOn w:val="VerbatimChar"/>
+    <w:rPr>
+      <w:color w:val="bc7a00"/>
+    </w:rPr>
+  </w:style>
+  <w:style w:customStyle="1" w:styleId="AttributeTok" w:type="character">
+    <w:name w:val="AttributeTok"/>
+    <w:basedOn w:val="VerbatimChar"/>
+    <w:rPr>
+      <w:color w:val="7d9029"/>
+    </w:rPr>
+  </w:style>
+  <w:style w:customStyle="1" w:styleId="RegionMarkerTok" w:type="character">
+    <w:name w:val="RegionMarkerTok"/>
+    <w:basedOn w:val="VerbatimChar"/>
+    <w:rPr/>
+  </w:style>
+  <w:style w:customStyle="1" w:styleId="InformationTok" w:type="character">
+    <w:name w:val="InformationTok"/>
+    <w:basedOn w:val="VerbatimChar"/>
+    <w:rPr>
+      <w:b/>
+      <w:i/>
+      <w:color w:val="60a0b0"/>
+    </w:rPr>
+  </w:style>
+  <w:style w:customStyle="1" w:styleId="WarningTok" w:type="character">
+    <w:name w:val="WarningTok"/>
+    <w:basedOn w:val="VerbatimChar"/>
+    <w:rPr>
+      <w:b/>
+      <w:i/>
+      <w:color w:val="60a0b0"/>
+    </w:rPr>
+  </w:style>
+  <w:style w:customStyle="1" w:styleId="AlertTok" w:type="character">
+    <w:name w:val="AlertTok"/>
+    <w:basedOn w:val="VerbatimChar"/>
+    <w:rPr>
+      <w:b/>
+      <w:color w:val="ff0000"/>
+    </w:rPr>
+  </w:style>
+  <w:style w:customStyle="1" w:styleId="ErrorTok" w:type="character">
+    <w:name w:val="ErrorTok"/>
+    <w:basedOn w:val="VerbatimChar"/>
+    <w:rPr>
+      <w:b/>
+      <w:color w:val="ff0000"/>
+    </w:rPr>
+  </w:style>
+  <w:style w:customStyle="1" w:styleId="NormalTok" w:type="character">
+    <w:name w:val="NormalTok"/>
+    <w:basedOn w:val="VerbatimChar"/>
+    <w:rPr/>
   </w:style>
   <w:style w:type="paragraph" w:customStyle="1" w:styleId="SourceCode">
     <w:name w:val="Source Code"/>

</xml_diff>

<commit_message>
revise usage appendix wording
</commit_message>
<xml_diff>
--- a/docs/deliverables/AI_Usage_Log.docx
+++ b/docs/deliverables/AI_Usage_Log.docx
@@ -2,7 +2,7 @@
 <file path=word/document.xml><?xml version="1.0" encoding="utf-8"?>
 <w:document xmlns:w="http://schemas.openxmlformats.org/wordprocessingml/2006/main" xmlns:m="http://schemas.openxmlformats.org/officeDocument/2006/math" xmlns:r="http://schemas.openxmlformats.org/officeDocument/2006/relationships" xmlns:o="urn:schemas-microsoft-com:office:office" xmlns:v="urn:schemas-microsoft-com:vml" xmlns:w10="urn:schemas-microsoft-com:office:word" xmlns:a="http://schemas.openxmlformats.org/drawingml/2006/main" xmlns:pic="http://schemas.openxmlformats.org/drawingml/2006/picture" xmlns:wp="http://schemas.openxmlformats.org/drawingml/2006/wordprocessingDrawing">
   <w:body>
-    <w:bookmarkStart w:id="18" w:name="ai-usage-log-appendix"/>
+    <w:bookmarkStart w:id="19" w:name="ai-usage-log-appendix"/>
     <w:p>
       <w:pPr>
         <w:pStyle w:val="Heading1"/>
@@ -29,7 +29,7 @@
         <w:t xml:space="preserve">Automated Extraction and Analysis of Timing-Based Paradata Features for Survey Quality Assurance</w:t>
       </w:r>
       <w:r>
-        <w:br/>
+        <w:t xml:space="preserve"> </w:t>
       </w:r>
       <w:r>
         <w:rPr>
@@ -42,7 +42,7 @@
         <w:t xml:space="preserve"> </w:t>
       </w:r>
       <w:r>
-        <w:t xml:space="preserve">Samuel Kaoma (2022016530) ·</w:t>
+        <w:t xml:space="preserve">Samuel Kaoma (2022016530) -</w:t>
       </w:r>
       <w:r>
         <w:t xml:space="preserve"> </w:t>
@@ -58,7 +58,7 @@
         <w:t xml:space="preserve"> </w:t>
       </w:r>
       <w:r>
-        <w:t xml:space="preserve">CSC 4004 ·</w:t>
+        <w:t xml:space="preserve">CSC 4004 -</w:t>
       </w:r>
       <w:r>
         <w:t xml:space="preserve"> </w:t>
@@ -82,16 +82,16 @@
         <w:pStyle w:val="BodyText"/>
       </w:pPr>
       <w:r>
-        <w:t xml:space="preserve">Required by §9.4 of the project proposal. Each entry records the tool, the date, the task, what came back, and how much of it was used. This log was started on 6 July 2026, later than it should have been; entries before that date are reconstructed from the development history and are marked as such. It is maintained live from 6 July 2026 onward.</w:t>
+        <w:t xml:space="preserve">Required by section 9.4 of the project proposal. The log records where software tools were consulted during the project. It was started on 6 July 2026, so entries before that date are reconstructed from the development history and are marked as reconstructed.</w:t>
       </w:r>
     </w:p>
-    <w:bookmarkStart w:id="16" w:name="how-ai-was-used-in-this-project"/>
+    <w:bookmarkStart w:id="16" w:name="summary-of-use"/>
     <w:p>
       <w:pPr>
         <w:pStyle w:val="Heading2"/>
       </w:pPr>
       <w:r>
-        <w:t xml:space="preserve">How AI was used in this project</w:t>
+        <w:t xml:space="preserve">Summary of use</w:t>
       </w:r>
     </w:p>
     <w:p>
@@ -99,11 +99,140 @@
         <w:pStyle w:val="FirstParagraph"/>
       </w:pPr>
       <w:r>
-        <w:t xml:space="preserve">Three tools were used, matching §9.1 of the proposal: GitHub Copilot (in-editor completions), Claude (code review, documentation drafting, debugging discussion), and ChatGPT (occasional design discussion). Per §9.2–9.3, AI-assisted code was reviewed before integration and is covered by the pytest suite; the feature taxonomy, the choice of detection method, and the interpretation of results are my own, grounded in the sources cited in the proposal.</w:t>
+        <w:t xml:space="preserve">Tool support was limited to in-editor suggestions, debugging discussion, review comments, and help checking or polishing documentation. The research question, feature taxonomy, system design, parser structure, anomaly-detection approach, thresholds used in</w:t>
+      </w:r>
+      <w:r>
+        <w:t xml:space="preserve"> </w:t>
+      </w:r>
+      <w:r>
+        <w:rPr>
+          <w:rStyle w:val="VerbatimChar"/>
+        </w:rPr>
+        <w:t xml:space="preserve">main</w:t>
+      </w:r>
+      <w:r>
+        <w:t xml:space="preserve">, validation interpretation, and final academic claims are my own work.</w:t>
+      </w:r>
+    </w:p>
+    <w:p>
+      <w:pPr>
+        <w:pStyle w:val="BodyText"/>
+      </w:pPr>
+      <w:r>
+        <w:t xml:space="preserve">All accepted code-level suggestions were reviewed before integration and checked through the project test suite or by comparison with recorded output files. Suggestions that affected the interpretation of results or detection thresholds were treated as review input only; final decisions were made by me and, where relevant, kept out of the submitted</w:t>
+      </w:r>
+      <w:r>
+        <w:t xml:space="preserve"> </w:t>
+      </w:r>
+      <w:r>
+        <w:rPr>
+          <w:rStyle w:val="VerbatimChar"/>
+        </w:rPr>
+        <w:t xml:space="preserve">main</w:t>
+      </w:r>
+      <w:r>
+        <w:t xml:space="preserve"> </w:t>
+      </w:r>
+      <w:r>
+        <w:t xml:space="preserve">branch.</w:t>
       </w:r>
     </w:p>
     <w:bookmarkEnd w:id="16"/>
-    <w:bookmarkStart w:id="17" w:name="log-entries"/>
+    <w:bookmarkStart w:id="17" w:name="work-carried-out-by-the-student"/>
+    <w:p>
+      <w:pPr>
+        <w:pStyle w:val="Heading2"/>
+      </w:pPr>
+      <w:r>
+        <w:t xml:space="preserve">Work carried out by the student</w:t>
+      </w:r>
+    </w:p>
+    <w:p>
+      <w:pPr>
+        <w:pStyle w:val="Compact"/>
+        <w:numPr>
+          <w:ilvl w:val="0"/>
+          <w:numId w:val="1001"/>
+        </w:numPr>
+      </w:pPr>
+      <w:r>
+        <w:t xml:space="preserve">Research question, proposal, literature review, and the 40-feature taxonomy.</w:t>
+      </w:r>
+    </w:p>
+    <w:p>
+      <w:pPr>
+        <w:pStyle w:val="Compact"/>
+        <w:numPr>
+          <w:ilvl w:val="0"/>
+          <w:numId w:val="1001"/>
+        </w:numPr>
+      </w:pPr>
+      <w:r>
+        <w:t xml:space="preserve">Common intermediate representation for SurveyCTO and ODK paradata.</w:t>
+      </w:r>
+    </w:p>
+    <w:p>
+      <w:pPr>
+        <w:pStyle w:val="Compact"/>
+        <w:numPr>
+          <w:ilvl w:val="0"/>
+          <w:numId w:val="1001"/>
+        </w:numPr>
+      </w:pPr>
+      <w:r>
+        <w:t xml:space="preserve">Parser classes, feature extraction modules, pipeline controller, and labelled evaluation workflow.</w:t>
+      </w:r>
+    </w:p>
+    <w:p>
+      <w:pPr>
+        <w:pStyle w:val="Compact"/>
+        <w:numPr>
+          <w:ilvl w:val="0"/>
+          <w:numId w:val="1001"/>
+        </w:numPr>
+      </w:pPr>
+      <w:r>
+        <w:t xml:space="preserve">Choice of IQR-based and rule-based anomaly detection, including thresholds shipped in</w:t>
+      </w:r>
+      <w:r>
+        <w:t xml:space="preserve"> </w:t>
+      </w:r>
+      <w:r>
+        <w:rPr>
+          <w:rStyle w:val="VerbatimChar"/>
+        </w:rPr>
+        <w:t xml:space="preserve">main</w:t>
+      </w:r>
+      <w:r>
+        <w:t xml:space="preserve">.</w:t>
+      </w:r>
+    </w:p>
+    <w:p>
+      <w:pPr>
+        <w:pStyle w:val="Compact"/>
+        <w:numPr>
+          <w:ilvl w:val="0"/>
+          <w:numId w:val="1001"/>
+        </w:numPr>
+      </w:pPr>
+      <w:r>
+        <w:t xml:space="preserve">Synthetic data generator, anomaly profiles, stress-validation setup, and success criteria.</w:t>
+      </w:r>
+    </w:p>
+    <w:p>
+      <w:pPr>
+        <w:pStyle w:val="Compact"/>
+        <w:numPr>
+          <w:ilvl w:val="0"/>
+          <w:numId w:val="1001"/>
+        </w:numPr>
+      </w:pPr>
+      <w:r>
+        <w:t xml:space="preserve">Interpretation of validation results and the decision to report weaker per-class results transparently.</w:t>
+      </w:r>
+    </w:p>
+    <w:bookmarkEnd w:id="17"/>
+    <w:bookmarkStart w:id="18" w:name="log-entries"/>
     <w:p>
       <w:pPr>
         <w:pStyle w:val="Heading2"/>
@@ -158,18 +287,18 @@
               <w:pStyle w:val="Compact"/>
             </w:pPr>
             <w:r>
-              <w:t xml:space="preserve">Task / prompt summary</w:t>
-            </w:r>
-          </w:p>
-        </w:tc>
-        <w:tc>
-          <w:tcPr/>
-          <w:p>
-            <w:pPr>
-              <w:pStyle w:val="Compact"/>
-            </w:pPr>
-            <w:r>
-              <w:t xml:space="preserve">Output and how it was used</w:t>
+              <w:t xml:space="preserve">Use</w:t>
+            </w:r>
+          </w:p>
+        </w:tc>
+        <w:tc>
+          <w:tcPr/>
+          <w:p>
+            <w:pPr>
+              <w:pStyle w:val="Compact"/>
+            </w:pPr>
+            <w:r>
+              <w:t xml:space="preserve">How it affected the submitted work</w:t>
             </w:r>
           </w:p>
         </w:tc>
@@ -204,27 +333,18 @@
               <w:pStyle w:val="Compact"/>
             </w:pPr>
             <w:r>
-              <w:t xml:space="preserve">In-editor completions while writing parser classes and Pandas transformations</w:t>
-            </w:r>
-          </w:p>
-        </w:tc>
-        <w:tc>
-          <w:tcPr/>
-          <w:p>
-            <w:pPr>
-              <w:pStyle w:val="Compact"/>
-            </w:pPr>
-            <w:r>
-              <w:t xml:space="preserve">Accepted line-level completions for boilerplate (column mapping, DataFrame construction); logic reviewed and unit-tested (</w:t>
-            </w:r>
-            <w:r>
-              <w:rPr>
-                <w:rStyle w:val="VerbatimChar"/>
-              </w:rPr>
-              <w:t xml:space="preserve">tests/test_parsers.py</w:t>
-            </w:r>
-            <w:r>
-              <w:t xml:space="preserve">)</w:t>
+              <w:t xml:space="preserve">In-editor suggestions while writing parser and DataFrame code</w:t>
+            </w:r>
+          </w:p>
+        </w:tc>
+        <w:tc>
+          <w:tcPr/>
+          <w:p>
+            <w:pPr>
+              <w:pStyle w:val="Compact"/>
+            </w:pPr>
+            <w:r>
+              <w:t xml:space="preserve">Used only for small line-level completions. Logic was written, reviewed, and tested by me.</w:t>
             </w:r>
           </w:p>
         </w:tc>
@@ -259,18 +379,18 @@
               <w:pStyle w:val="Compact"/>
             </w:pPr>
             <w:r>
-              <w:t xml:space="preserve">Explanation of IQR fences vs modified Z-score for skewed distributions</w:t>
-            </w:r>
-          </w:p>
-        </w:tc>
-        <w:tc>
-          <w:tcPr/>
-          <w:p>
-            <w:pPr>
-              <w:pStyle w:val="Compact"/>
-            </w:pPr>
-            <w:r>
-              <w:t xml:space="preserve">Used to sharpen the §3.3 justification; text rewritten in my own words with citations checked against Iglewicz &amp; Hoaglin</w:t>
+              <w:t xml:space="preserve">Discussion of IQR fences and modified z-score methods</w:t>
+            </w:r>
+          </w:p>
+        </w:tc>
+        <w:tc>
+          <w:tcPr/>
+          <w:p>
+            <w:pPr>
+              <w:pStyle w:val="Compact"/>
+            </w:pPr>
+            <w:r>
+              <w:t xml:space="preserve">Used for clarification while writing the proposal rationale. The chosen method and citations were checked and written by me.</w:t>
             </w:r>
           </w:p>
         </w:tc>
@@ -283,7 +403,7 @@
               <w:pStyle w:val="Compact"/>
             </w:pPr>
             <w:r>
-              <w:t xml:space="preserve">Mar–Apr 2026 (reconstructed)</w:t>
+              <w:t xml:space="preserve">Mar-Apr 2026 (reconstructed)</w:t>
             </w:r>
           </w:p>
         </w:tc>
@@ -305,30 +425,18 @@
               <w:pStyle w:val="Compact"/>
             </w:pPr>
             <w:r>
-              <w:t xml:space="preserve">Debugging assistance on timestamp parsing (epoch-ms vs epoch-seconds vs ISO 8601)</w:t>
-            </w:r>
-          </w:p>
-        </w:tc>
-        <w:tc>
-          <w:tcPr/>
-          <w:p>
-            <w:pPr>
-              <w:pStyle w:val="Compact"/>
-            </w:pPr>
-            <w:r>
-              <w:t xml:space="preserve">Suggested the median-based epoch-seconds guard; implemented after tracing through sample values, covered by parser tests (commit</w:t>
-            </w:r>
-            <w:r>
-              <w:t xml:space="preserve"> </w:t>
-            </w:r>
-            <w:r>
-              <w:rPr>
-                <w:rStyle w:val="VerbatimChar"/>
-              </w:rPr>
-              <w:t xml:space="preserve">15b8258</w:t>
-            </w:r>
-            <w:r>
-              <w:t xml:space="preserve">)</w:t>
+              <w:t xml:space="preserve">Debugging discussion for timestamp parsing across epoch and ISO formats</w:t>
+            </w:r>
+          </w:p>
+        </w:tc>
+        <w:tc>
+          <w:tcPr/>
+          <w:p>
+            <w:pPr>
+              <w:pStyle w:val="Compact"/>
+            </w:pPr>
+            <w:r>
+              <w:t xml:space="preserve">Helped identify a possible guard for epoch seconds. I implemented and tested the parser behaviour.</w:t>
             </w:r>
           </w:p>
         </w:tc>
@@ -363,27 +471,18 @@
               <w:pStyle w:val="Compact"/>
             </w:pPr>
             <w:r>
-              <w:t xml:space="preserve">Discussion of how to structure labelled evaluation without leaking labels into detection</w:t>
-            </w:r>
-          </w:p>
-        </w:tc>
-        <w:tc>
-          <w:tcPr/>
-          <w:p>
-            <w:pPr>
-              <w:pStyle w:val="Compact"/>
-            </w:pPr>
-            <w:r>
-              <w:t xml:space="preserve">Confirmed the ground-truth merge design; implementation written by me in</w:t>
-            </w:r>
-            <w:r>
-              <w:t xml:space="preserve"> </w:t>
-            </w:r>
-            <w:r>
-              <w:rPr>
-                <w:rStyle w:val="VerbatimChar"/>
-              </w:rPr>
-              <w:t xml:space="preserve">src/validation/reporting.py</w:t>
+              <w:t xml:space="preserve">Discussion of labelled evaluation structure</w:t>
+            </w:r>
+          </w:p>
+        </w:tc>
+        <w:tc>
+          <w:tcPr/>
+          <w:p>
+            <w:pPr>
+              <w:pStyle w:val="Compact"/>
+            </w:pPr>
+            <w:r>
+              <w:t xml:space="preserve">Used as a check on avoiding label leakage. The validation reporting code was written by me.</w:t>
             </w:r>
           </w:p>
         </w:tc>
@@ -418,7 +517,7 @@
               <w:pStyle w:val="Compact"/>
             </w:pPr>
             <w:r>
-              <w:t xml:space="preserve">Line-by-line review of all modules in</w:t>
+              <w:t xml:space="preserve">Review comments on</w:t>
             </w:r>
             <w:r>
               <w:t xml:space="preserve"> </w:t>
@@ -433,39 +532,18 @@
               <w:t xml:space="preserve"> </w:t>
             </w:r>
             <w:r>
-              <w:t xml:space="preserve">against the proposal specification</w:t>
-            </w:r>
-          </w:p>
-        </w:tc>
-        <w:tc>
-          <w:tcPr/>
-          <w:p>
-            <w:pPr>
-              <w:pStyle w:val="Compact"/>
-            </w:pPr>
-            <w:r>
-              <w:t xml:space="preserve">Found two defects (integrity flag overwritten by the detector; ODK missing node names becoming the string</w:t>
-            </w:r>
-            <w:r>
-              <w:t xml:space="preserve"> </w:t>
-            </w:r>
-            <w:r>
-              <w:t xml:space="preserve">“nan”</w:t>
-            </w:r>
-            <w:r>
-              <w:t xml:space="preserve">) and several proposal/code mismatches. Both defects fixed and re-tested (commit</w:t>
-            </w:r>
-            <w:r>
-              <w:t xml:space="preserve"> </w:t>
-            </w:r>
-            <w:r>
-              <w:rPr>
-                <w:rStyle w:val="VerbatimChar"/>
-              </w:rPr>
-              <w:t xml:space="preserve">bc77a8c</w:t>
-            </w:r>
-            <w:r>
-              <w:t xml:space="preserve">); mismatches noted for report revision</w:t>
+              <w:t xml:space="preserve">and generator realism</w:t>
+            </w:r>
+          </w:p>
+        </w:tc>
+        <w:tc>
+          <w:tcPr/>
+          <w:p>
+            <w:pPr>
+              <w:pStyle w:val="Compact"/>
+            </w:pPr>
+            <w:r>
+              <w:t xml:space="preserve">Used as review input. I fixed confirmed issues, removed generator-specific tuning, and verified the changes on held-out seeds.</w:t>
             </w:r>
           </w:p>
         </w:tc>
@@ -478,7 +556,7 @@
               <w:pStyle w:val="Compact"/>
             </w:pPr>
             <w:r>
-              <w:t xml:space="preserve">6 Jul 2026</w:t>
+              <w:t xml:space="preserve">6-14 Jul 2026</w:t>
             </w:r>
           </w:p>
         </w:tc>
@@ -500,45 +578,18 @@
               <w:pStyle w:val="Compact"/>
             </w:pPr>
             <w:r>
-              <w:t xml:space="preserve">Review of synthetic generator realism and detector tuning</w:t>
-            </w:r>
-          </w:p>
-        </w:tc>
-        <w:tc>
-          <w:tcPr/>
-          <w:p>
-            <w:pPr>
-              <w:pStyle w:val="Compact"/>
-            </w:pPr>
-            <w:r>
-              <w:t xml:space="preserve">Identified generator-specific detector tuning (pause constants, back-nav coupling). I approved removing the coupling, moving constants into configuration, and adding a median-relative elevated-pause rule from Conrad et al.’s disengagement indicators. Verified by held-out runs (seeds 7, 99) documented in</w:t>
-            </w:r>
-            <w:r>
-              <w:t xml:space="preserve"> </w:t>
-            </w:r>
-            <w:r>
-              <w:rPr>
-                <w:rStyle w:val="VerbatimChar"/>
-              </w:rPr>
-              <w:t xml:space="preserve">output/robustness_validation/robustness_summary.md</w:t>
-            </w:r>
-            <w:r>
-              <w:t xml:space="preserve"> </w:t>
-            </w:r>
-            <w:r>
-              <w:t xml:space="preserve">(commit</w:t>
-            </w:r>
-            <w:r>
-              <w:t xml:space="preserve"> </w:t>
-            </w:r>
-            <w:r>
-              <w:rPr>
-                <w:rStyle w:val="VerbatimChar"/>
-              </w:rPr>
-              <w:t xml:space="preserve">bc77a8c</w:t>
-            </w:r>
-            <w:r>
-              <w:t xml:space="preserve">)</w:t>
+              <w:t xml:space="preserve">Drafting support for progress documentation and clean-run checks</w:t>
+            </w:r>
+          </w:p>
+        </w:tc>
+        <w:tc>
+          <w:tcPr/>
+          <w:p>
+            <w:pPr>
+              <w:pStyle w:val="Compact"/>
+            </w:pPr>
+            <w:r>
+              <w:t xml:space="preserve">Draft text was edited by me. The clean-run checks surfaced defects that I fixed and covered with tests.</w:t>
             </w:r>
           </w:p>
         </w:tc>
@@ -551,7 +602,7 @@
               <w:pStyle w:val="Compact"/>
             </w:pPr>
             <w:r>
-              <w:t xml:space="preserve">6 Jul 2026</w:t>
+              <w:t xml:space="preserve">19 Aug 2026</w:t>
             </w:r>
           </w:p>
         </w:tc>
@@ -573,18 +624,18 @@
               <w:pStyle w:val="Compact"/>
             </w:pPr>
             <w:r>
-              <w:t xml:space="preserve">Drafting of progress report, checkpoint guide, milestone tracker and this log’s structure</w:t>
-            </w:r>
-          </w:p>
-        </w:tc>
-        <w:tc>
-          <w:tcPr/>
-          <w:p>
-            <w:pPr>
-              <w:pStyle w:val="Compact"/>
-            </w:pPr>
-            <w:r>
-              <w:t xml:space="preserve">Drafts generated, then reviewed and edited by me; factual claims (metrics, commit hashes, file paths) checked against the repository</w:t>
+              <w:t xml:space="preserve">Evidence-link and reproducibility checks</w:t>
+            </w:r>
+          </w:p>
+        </w:tc>
+        <w:tc>
+          <w:tcPr/>
+          <w:p>
+            <w:pPr>
+              <w:pStyle w:val="Compact"/>
+            </w:pPr>
+            <w:r>
+              <w:t xml:space="preserve">Used to help check links, tags, and reported figures against repository files and regenerated outputs. Corrections were reviewed by me before finalising.</w:t>
             </w:r>
           </w:p>
         </w:tc>
@@ -597,7 +648,7 @@
               <w:pStyle w:val="Compact"/>
             </w:pPr>
             <w:r>
-              <w:t xml:space="preserve">14 Jul 2026</w:t>
+              <w:t xml:space="preserve">19-25 Aug 2026</w:t>
             </w:r>
           </w:p>
         </w:tc>
@@ -619,18 +670,18 @@
               <w:pStyle w:val="Compact"/>
             </w:pPr>
             <w:r>
-              <w:t xml:space="preserve">Final pre-submission audit: clean-environment reproduction of every documented command, regeneration of all synthetic datasets from recorded seeds, and reconciliation of every number in the report and documentation against the fresh runs</w:t>
-            </w:r>
-          </w:p>
-        </w:tc>
-        <w:tc>
-          <w:tcPr/>
-          <w:p>
-            <w:pPr>
-              <w:pStyle w:val="Compact"/>
-            </w:pPr>
-            <w:r>
-              <w:t xml:space="preserve">Found and fixed two code defects (a pandas 3 timestamp-resolution incompatibility in both parsers that scaled ODK durations wrongly on a fresh install, and the Q-01 response-time feature duplicating Q-10 instead of matching its documented definition), added a parser regression test, corrected citation years and feature formulas in the documentation, and rebuilt the Word deliverables and presentation from the reconciled sources. All fixes reviewed by me and verified by the test suite and regenerated validation runs</w:t>
+              <w:t xml:space="preserve">Validation-documentation review</w:t>
+            </w:r>
+          </w:p>
+        </w:tc>
+        <w:tc>
+          <w:tcPr/>
+          <w:p>
+            <w:pPr>
+              <w:pStyle w:val="Compact"/>
+            </w:pPr>
+            <w:r>
+              <w:t xml:space="preserve">Helped identify missing aggregate figures, baseline figures, effect sizes, and per-component breakdowns. Values were recomputed from existing project outputs and checked by me.</w:t>
             </w:r>
           </w:p>
         </w:tc>
@@ -643,7 +694,7 @@
               <w:pStyle w:val="Compact"/>
             </w:pPr>
             <w:r>
-              <w:t xml:space="preserve">19 Aug 2026</w:t>
+              <w:t xml:space="preserve">19-25 Aug 2026</w:t>
             </w:r>
           </w:p>
         </w:tc>
@@ -665,552 +716,18 @@
               <w:pStyle w:val="Compact"/>
             </w:pPr>
             <w:r>
-              <w:t xml:space="preserve">Repository and evidence-trail audit ahead of the milestone submissions</w:t>
-            </w:r>
-          </w:p>
-        </w:tc>
-        <w:tc>
-          <w:tcPr/>
-          <w:p>
-            <w:pPr>
-              <w:pStyle w:val="Compact"/>
-            </w:pPr>
-            <w:r>
-              <w:t xml:space="preserve">Found the GitHub default branch had been renamed, leaving every evidence link broken, and restored it. Created annotated milestone tags, then checked each against the tree it pointed at and moved two that named commits where the validation report was still incomplete. Verified all 33 commit links and 26 file paths in the tracker and evidence index resolve. Corrected a precision range quoted as 0.95 which the underlying data put at 0.96. All changes reviewed by me before commit</w:t>
-            </w:r>
-          </w:p>
-        </w:tc>
-      </w:tr>
-      <w:tr>
-        <w:tc>
-          <w:tcPr/>
-          <w:p>
-            <w:pPr>
-              <w:pStyle w:val="Compact"/>
-            </w:pPr>
-            <w:r>
-              <w:t xml:space="preserve">19 Aug 2026</w:t>
-            </w:r>
-          </w:p>
-        </w:tc>
-        <w:tc>
-          <w:tcPr/>
-          <w:p>
-            <w:pPr>
-              <w:pStyle w:val="Compact"/>
-            </w:pPr>
-            <w:r>
-              <w:t xml:space="preserve">Claude</w:t>
-            </w:r>
-          </w:p>
-        </w:tc>
-        <w:tc>
-          <w:tcPr/>
-          <w:p>
-            <w:pPr>
-              <w:pStyle w:val="Compact"/>
-            </w:pPr>
-            <w:r>
-              <w:t xml:space="preserve">Completion of the validation report against the proposal requirements</w:t>
-            </w:r>
-          </w:p>
-        </w:tc>
-        <w:tc>
-          <w:tcPr/>
-          <w:p>
-            <w:pPr>
-              <w:pStyle w:val="Compact"/>
-            </w:pPr>
-            <w:r>
-              <w:t xml:space="preserve">Identified that the report quoted per-type detection from the single best run rather than the four-run aggregate, and that it lacked the effect sizes and baseline figures the proposal requires. Recomputed the aggregate from</w:t>
-            </w:r>
-            <w:r>
-              <w:t xml:space="preserve"> </w:t>
-            </w:r>
-            <w:r>
-              <w:rPr>
-                <w:rStyle w:val="VerbatimChar"/>
-              </w:rPr>
-              <w:t xml:space="preserve">detection_by_type_stress_seed*.csv</w:t>
-            </w:r>
-            <w:r>
-              <w:t xml:space="preserve">, and drew the effect sizes and baseline results from the existing</w:t>
-            </w:r>
-            <w:r>
-              <w:t xml:space="preserve"> </w:t>
-            </w:r>
-            <w:r>
-              <w:rPr>
-                <w:rStyle w:val="VerbatimChar"/>
-              </w:rPr>
-              <w:t xml:space="preserve">feature_validation_results.csv</w:t>
-            </w:r>
-            <w:r>
-              <w:t xml:space="preserve"> </w:t>
-            </w:r>
-            <w:r>
-              <w:t xml:space="preserve">and</w:t>
-            </w:r>
-            <w:r>
-              <w:t xml:space="preserve"> </w:t>
-            </w:r>
-            <w:r>
-              <w:rPr>
-                <w:rStyle w:val="VerbatimChar"/>
-              </w:rPr>
-              <w:t xml:space="preserve">strict_examiner_audit_report.md</w:t>
-            </w:r>
-            <w:r>
-              <w:t xml:space="preserve">. No new analysis was invented; the figures already existed and had not been written up. I reviewed each against its source file</w:t>
-            </w:r>
-          </w:p>
-        </w:tc>
-      </w:tr>
-      <w:tr>
-        <w:tc>
-          <w:tcPr/>
-          <w:p>
-            <w:pPr>
-              <w:pStyle w:val="Compact"/>
-            </w:pPr>
-            <w:r>
-              <w:t xml:space="preserve">19 Aug 2026</w:t>
-            </w:r>
-          </w:p>
-        </w:tc>
-        <w:tc>
-          <w:tcPr/>
-          <w:p>
-            <w:pPr>
-              <w:pStyle w:val="Compact"/>
-            </w:pPr>
-            <w:r>
-              <w:t xml:space="preserve">Claude</w:t>
-            </w:r>
-          </w:p>
-        </w:tc>
-        <w:tc>
-          <w:tcPr/>
-          <w:p>
-            <w:pPr>
-              <w:pStyle w:val="Compact"/>
-            </w:pPr>
-            <w:r>
-              <w:t xml:space="preserve">Test scaffolding: continuous integration workflows</w:t>
-            </w:r>
-          </w:p>
-        </w:tc>
-        <w:tc>
-          <w:tcPr/>
-          <w:p>
-            <w:pPr>
-              <w:pStyle w:val="Compact"/>
-            </w:pPr>
-            <w:r>
-              <w:t xml:space="preserve">Wrote</w:t>
-            </w:r>
-            <w:r>
-              <w:t xml:space="preserve"> </w:t>
-            </w:r>
-            <w:r>
-              <w:rPr>
-                <w:rStyle w:val="VerbatimChar"/>
-              </w:rPr>
-              <w:t xml:space="preserve">.github/workflows/ci.yml</w:t>
-            </w:r>
-            <w:r>
-              <w:t xml:space="preserve"> </w:t>
-            </w:r>
-            <w:r>
-              <w:t xml:space="preserve">and</w:t>
-            </w:r>
-            <w:r>
-              <w:t xml:space="preserve"> </w:t>
-            </w:r>
-            <w:r>
-              <w:rPr>
-                <w:rStyle w:val="VerbatimChar"/>
-              </w:rPr>
-              <w:t xml:space="preserve">full-validation.yml</w:t>
-            </w:r>
-            <w:r>
-              <w:t xml:space="preserve">, including a pandas 2 and pandas 3 matrix chosen because the July audit found a pandas 3 defect that single-version testing would not catch, and a gate that fails the build if any evaluated run falls below the proposal thresholds. I specified the intent; the YAML and the gate script were drafted by Claude and verified by me against local runs before commit</w:t>
-            </w:r>
-          </w:p>
-        </w:tc>
-      </w:tr>
-      <w:tr>
-        <w:tc>
-          <w:tcPr/>
-          <w:p>
-            <w:pPr>
-              <w:pStyle w:val="Compact"/>
-            </w:pPr>
-            <w:r>
-              <w:t xml:space="preserve">19 Aug 2026</w:t>
-            </w:r>
-          </w:p>
-        </w:tc>
-        <w:tc>
-          <w:tcPr/>
-          <w:p>
-            <w:pPr>
-              <w:pStyle w:val="Compact"/>
-            </w:pPr>
-            <w:r>
-              <w:t xml:space="preserve">Claude</w:t>
-            </w:r>
-          </w:p>
-        </w:tc>
-        <w:tc>
-          <w:tcPr/>
-          <w:p>
-            <w:pPr>
-              <w:pStyle w:val="Compact"/>
-            </w:pPr>
-            <w:r>
-              <w:t xml:space="preserve">Reproducibility check of the full validation round</w:t>
-            </w:r>
-          </w:p>
-        </w:tc>
-        <w:tc>
-          <w:tcPr/>
-          <w:p>
-            <w:pPr>
-              <w:pStyle w:val="Compact"/>
-            </w:pPr>
-            <w:r>
-              <w:t xml:space="preserve">Regenerated all ten datasets from recorded seeds and re-ran every evaluation. All reported figures reproduced exactly; the only differences were runtime columns and floating-point noise at the 1e-15 level. This confirmed the reproducibility claim in the validation report rather than changing any result</w:t>
-            </w:r>
-          </w:p>
-        </w:tc>
-      </w:tr>
-      <w:tr>
-        <w:tc>
-          <w:tcPr/>
-          <w:p>
-            <w:pPr>
-              <w:pStyle w:val="Compact"/>
-            </w:pPr>
-            <w:r>
-              <w:t xml:space="preserve">19 Aug 2026</w:t>
-            </w:r>
-          </w:p>
-        </w:tc>
-        <w:tc>
-          <w:tcPr/>
-          <w:p>
-            <w:pPr>
-              <w:pStyle w:val="Compact"/>
-            </w:pPr>
-            <w:r>
-              <w:t xml:space="preserve">Claude</w:t>
-            </w:r>
-          </w:p>
-        </w:tc>
-        <w:tc>
-          <w:tcPr/>
-          <w:p>
-            <w:pPr>
-              <w:pStyle w:val="Compact"/>
-            </w:pPr>
-            <w:r>
-              <w:t xml:space="preserve">Detector debugging: bounded diagnostic pass on fabricated false negatives</w:t>
-            </w:r>
-          </w:p>
-        </w:tc>
-        <w:tc>
-          <w:tcPr/>
-          <w:p>
-            <w:pPr>
-              <w:pStyle w:val="Compact"/>
-            </w:pPr>
-            <w:r>
-              <w:t xml:space="preserve">Requested by my supervisor. Analysis run on development seeds 11 and 42 only, with held-out seeds 7 and 99 untouched and no threshold changed. Established that the stress generator emits two fabricated profiles, that all misses fall in one of them, and that response time entropy separates fabricated from genuine interviews with no overlap on those datasets. Traced the misses to an absolute entropy constant calibrated to the other profile and to contamination of the interquartile fence, and identified that the Tukey lower fence is unreachable on right-skewed non-negative features. This corrected an explanation I had previously given in both the validation report and the final report, which attributed the misses to a joint pattern univariate methods cannot capture. Findings in</w:t>
-            </w:r>
-            <w:r>
-              <w:t xml:space="preserve"> </w:t>
-            </w:r>
-            <w:r>
-              <w:rPr>
-                <w:rStyle w:val="VerbatimChar"/>
-              </w:rPr>
-              <w:t xml:space="preserve">docs/fabricated_detection_diagnostic.md</w:t>
-            </w:r>
-            <w:r>
-              <w:t xml:space="preserve">; I verified each figure against the run outputs before accepting it</w:t>
-            </w:r>
-          </w:p>
-        </w:tc>
-      </w:tr>
-      <w:tr>
-        <w:tc>
-          <w:tcPr/>
-          <w:p>
-            <w:pPr>
-              <w:pStyle w:val="Compact"/>
-            </w:pPr>
-            <w:r>
-              <w:t xml:space="preserve">19 Aug 2026</w:t>
-            </w:r>
-          </w:p>
-        </w:tc>
-        <w:tc>
-          <w:tcPr/>
-          <w:p>
-            <w:pPr>
-              <w:pStyle w:val="Compact"/>
-            </w:pPr>
-            <w:r>
-              <w:t xml:space="preserve">Claude</w:t>
-            </w:r>
-          </w:p>
-        </w:tc>
-        <w:tc>
-          <w:tcPr/>
-          <w:p>
-            <w:pPr>
-              <w:pStyle w:val="Compact"/>
-            </w:pPr>
-            <w:r>
-              <w:t xml:space="preserve">Feature coverage tabulation</w:t>
-            </w:r>
-          </w:p>
-        </w:tc>
-        <w:tc>
-          <w:tcPr/>
-          <w:p>
-            <w:pPr>
-              <w:pStyle w:val="Compact"/>
-            </w:pPr>
-            <w:r>
-              <w:t xml:space="preserve">Wrote</w:t>
-            </w:r>
-            <w:r>
-              <w:t xml:space="preserve"> </w:t>
-            </w:r>
-            <w:r>
-              <w:rPr>
-                <w:rStyle w:val="VerbatimChar"/>
-              </w:rPr>
-              <w:t xml:space="preserve">scripts/build_feature_coverage.py</w:t>
-            </w:r>
-            <w:r>
-              <w:t xml:space="preserve">, which derives the coverage table from the source tree, the recorded pipeline outputs and the test files rather than from a hand-maintained list. I specified that direct and end-to-end coverage be reported separately rather than merged, so the 22 of 40 direct figure is visible</w:t>
-            </w:r>
-          </w:p>
-        </w:tc>
-      </w:tr>
-      <w:tr>
-        <w:tc>
-          <w:tcPr/>
-          <w:p>
-            <w:pPr>
-              <w:pStyle w:val="Compact"/>
-            </w:pPr>
-            <w:r>
-              <w:t xml:space="preserve">25 Aug 2026</w:t>
-            </w:r>
-          </w:p>
-        </w:tc>
-        <w:tc>
-          <w:tcPr/>
-          <w:p>
-            <w:pPr>
-              <w:pStyle w:val="Compact"/>
-            </w:pPr>
-            <w:r>
-              <w:t xml:space="preserve">Claude</w:t>
-            </w:r>
-          </w:p>
-        </w:tc>
-        <w:tc>
-          <w:tcPr/>
-          <w:p>
-            <w:pPr>
-              <w:pStyle w:val="Compact"/>
-            </w:pPr>
-            <w:r>
-              <w:t xml:space="preserve">Consistency audit of the final report and every deliverable</w:t>
-            </w:r>
-          </w:p>
-        </w:tc>
-        <w:tc>
-          <w:tcPr/>
-          <w:p>
-            <w:pPr>
-              <w:pStyle w:val="Compact"/>
-            </w:pPr>
-            <w:r>
-              <w:t xml:space="preserve">Found the report contradicting itself: section 6.6 carried the corrected account of the fabrication misses while the abstract, discussion, limitations and conclusion still attributed them to a limit of univariate detection, and the abstract and conclusion still quoted precision as 0.95 rather than 0.96 and recall as 0.84 to 0.90 rather than 0.84 to 0.89. Also found the Word build of the report had not been regenerated since 14 July and carried every one of those claims, and that the companion PDF did the same. Corrections applied to the markdown, the Word file rebuilt, the stale PDF removed. The remaining nine Word deliverables were scanned and carried none of these figures. I checked each correction against the recorded outputs before accepting it</w:t>
-            </w:r>
-          </w:p>
-        </w:tc>
-      </w:tr>
-      <w:tr>
-        <w:tc>
-          <w:tcPr/>
-          <w:p>
-            <w:pPr>
-              <w:pStyle w:val="Compact"/>
-            </w:pPr>
-            <w:r>
-              <w:t xml:space="preserve">25 Aug 2026</w:t>
-            </w:r>
-          </w:p>
-        </w:tc>
-        <w:tc>
-          <w:tcPr/>
-          <w:p>
-            <w:pPr>
-              <w:pStyle w:val="Compact"/>
-            </w:pPr>
-            <w:r>
-              <w:t xml:space="preserve">Claude</w:t>
-            </w:r>
-          </w:p>
-        </w:tc>
-        <w:tc>
-          <w:tcPr/>
-          <w:p>
-            <w:pPr>
-              <w:pStyle w:val="Compact"/>
-            </w:pPr>
-            <w:r>
-              <w:t xml:space="preserve">Correction of the presentation</w:t>
-            </w:r>
-          </w:p>
-        </w:tc>
-        <w:tc>
-          <w:tcPr/>
-          <w:p>
-            <w:pPr>
-              <w:pStyle w:val="Compact"/>
-            </w:pPr>
-            <w:r>
-              <w:t xml:space="preserve">The 22-slide deck predated both corrections and repeated them on three slides. Its XML was edited directly, since the deck has no markdown source and is not regenerated. Every other figure on the results slide was checked against the recorded outputs and was already correct; only the explanation and one precision figure were wrong. I reviewed the slide text after the edit</w:t>
-            </w:r>
-          </w:p>
-        </w:tc>
-      </w:tr>
-      <w:tr>
-        <w:tc>
-          <w:tcPr/>
-          <w:p>
-            <w:pPr>
-              <w:pStyle w:val="Compact"/>
-            </w:pPr>
-            <w:r>
-              <w:t xml:space="preserve">25 Aug 2026</w:t>
-            </w:r>
-          </w:p>
-        </w:tc>
-        <w:tc>
-          <w:tcPr/>
-          <w:p>
-            <w:pPr>
-              <w:pStyle w:val="Compact"/>
-            </w:pPr>
-            <w:r>
-              <w:t xml:space="preserve">Claude</w:t>
-            </w:r>
-          </w:p>
-        </w:tc>
-        <w:tc>
-          <w:tcPr/>
-          <w:p>
-            <w:pPr>
-              <w:pStyle w:val="Compact"/>
-            </w:pPr>
-            <w:r>
-              <w:t xml:space="preserve">Per-component performance breakdown</w:t>
-            </w:r>
-          </w:p>
-        </w:tc>
-        <w:tc>
-          <w:tcPr/>
-          <w:p>
-            <w:pPr>
-              <w:pStyle w:val="Compact"/>
-            </w:pPr>
-            <w:r>
-              <w:t xml:space="preserve">Checking the validation report against the acceptance criteria for the 7 September milestone showed the report was missing the separate IQR and rule-based breakdowns that Section 5 of the proposal commits to. Computed from the recorded predictions rather than a fresh run. The result is that the rule layer carries almost all of the detection and the IQR layer contributes nine true positives and six false positives across the whole round.</w:t>
-            </w:r>
-            <w:r>
-              <w:t xml:space="preserve"> </w:t>
-            </w:r>
-            <w:r>
-              <w:rPr>
-                <w:rStyle w:val="VerbatimChar"/>
-              </w:rPr>
-              <w:t xml:space="preserve">scripts/component_breakdown.py</w:t>
-            </w:r>
-            <w:r>
-              <w:t xml:space="preserve"> </w:t>
-            </w:r>
-            <w:r>
-              <w:t xml:space="preserve">derives the table from the output files rather than restating it by hand. I verified the score decomposition against the detector source before accepting the figures</w:t>
-            </w:r>
-          </w:p>
-        </w:tc>
-      </w:tr>
-      <w:tr>
-        <w:tc>
-          <w:tcPr/>
-          <w:p>
-            <w:pPr>
-              <w:pStyle w:val="Compact"/>
-            </w:pPr>
-            <w:r>
-              <w:t xml:space="preserve">25 Aug 2026</w:t>
-            </w:r>
-          </w:p>
-        </w:tc>
-        <w:tc>
-          <w:tcPr/>
-          <w:p>
-            <w:pPr>
-              <w:pStyle w:val="Compact"/>
-            </w:pPr>
-            <w:r>
-              <w:t xml:space="preserve">Claude</w:t>
-            </w:r>
-          </w:p>
-        </w:tc>
-        <w:tc>
-          <w:tcPr/>
-          <w:p>
-            <w:pPr>
-              <w:pStyle w:val="Compact"/>
-            </w:pPr>
-            <w:r>
-              <w:t xml:space="preserve">Rule adjustment on a branch, under the frozen-evaluation discipline my supervisor set</w:t>
-            </w:r>
-          </w:p>
-        </w:tc>
-        <w:tc>
-          <w:tcPr/>
-          <w:p>
-            <w:pPr>
-              <w:pStyle w:val="Compact"/>
-            </w:pPr>
-            <w:r>
-              <w:t xml:space="preserve">Developed on seeds 11 and 42 only. The absolute entropy constant is retained as a floor and a fence estimated from the uncontaminated upper half of the distribution is added alongside it, a form chosen because every anomaly profile in scope lowers entropy and none raises it, and because it reduces to the existing Tukey fence for a symmetric distribution. The change was committed and frozen before the held-out seeds were opened, so the freeze is provable from the history. The single held-out evaluation raised fabricated recall from 0.70 to 1.00 and lowered the worst-case precision from 0.9570 to 0.8333. No threshold was altered after seeing that result. Kept on</w:t>
-            </w:r>
-            <w:r>
-              <w:t xml:space="preserve"> </w:t>
-            </w:r>
-            <w:r>
-              <w:rPr>
-                <w:rStyle w:val="VerbatimChar"/>
-              </w:rPr>
-              <w:t xml:space="preserve">fix/entropy-threshold-relative</w:t>
-            </w:r>
-            <w:r>
-              <w:t xml:space="preserve"> </w:t>
-            </w:r>
-            <w:r>
-              <w:t xml:space="preserve">and not merged;</w:t>
+              <w:t xml:space="preserve">Bounded diagnostic discussion on fabricated false negatives</w:t>
+            </w:r>
+          </w:p>
+        </w:tc>
+        <w:tc>
+          <w:tcPr/>
+          <w:p>
+            <w:pPr>
+              <w:pStyle w:val="Compact"/>
+            </w:pPr>
+            <w:r>
+              <w:t xml:space="preserve">Used on development seeds only. The submitted</w:t>
             </w:r>
             <w:r>
               <w:t xml:space="preserve"> </w:t>
@@ -1225,14 +742,60 @@
               <w:t xml:space="preserve"> </w:t>
             </w:r>
             <w:r>
-              <w:t xml:space="preserve">remains the submission state. I made the decision not to merge</w:t>
+              <w:t xml:space="preserve">branch was not changed by this diagnostic; the attempted threshold adjustment remained on a separate branch and was not merged.</w:t>
+            </w:r>
+          </w:p>
+        </w:tc>
+      </w:tr>
+      <w:tr>
+        <w:tc>
+          <w:tcPr/>
+          <w:p>
+            <w:pPr>
+              <w:pStyle w:val="Compact"/>
+            </w:pPr>
+            <w:r>
+              <w:t xml:space="preserve">25 Aug 2026</w:t>
+            </w:r>
+          </w:p>
+        </w:tc>
+        <w:tc>
+          <w:tcPr/>
+          <w:p>
+            <w:pPr>
+              <w:pStyle w:val="Compact"/>
+            </w:pPr>
+            <w:r>
+              <w:t xml:space="preserve">Claude</w:t>
+            </w:r>
+          </w:p>
+        </w:tc>
+        <w:tc>
+          <w:tcPr/>
+          <w:p>
+            <w:pPr>
+              <w:pStyle w:val="Compact"/>
+            </w:pPr>
+            <w:r>
+              <w:t xml:space="preserve">Consistency review of final report, Word deliverables, and presentation</w:t>
+            </w:r>
+          </w:p>
+        </w:tc>
+        <w:tc>
+          <w:tcPr/>
+          <w:p>
+            <w:pPr>
+              <w:pStyle w:val="Compact"/>
+            </w:pPr>
+            <w:r>
+              <w:t xml:space="preserve">Used to locate stale or contradictory wording. Corrections were made against recorded outputs and reviewed by me.</w:t>
             </w:r>
           </w:p>
         </w:tc>
       </w:tr>
     </w:tbl>
-    <w:bookmarkEnd w:id="17"/>
     <w:bookmarkEnd w:id="18"/>
+    <w:bookmarkEnd w:id="19"/>
     <w:sectPr>
       <w:footerReference r:id="rId7" w:type="default"/>
       <w:pgSz w:h="16838" w:orient="portrait" w:w="11906"/>
@@ -1456,6 +1019,109 @@
       </w:pPr>
     </w:lvl>
   </w:abstractNum>
+  <w:abstractNum w:abstractNumId="991">
+    <w:nsid w:val="0000A991"/>
+    <w:multiLevelType w:val="multilevel"/>
+    <w:lvl w:ilvl="0">
+      <w:numFmt w:val="bullet"/>
+      <w:lvlText w:val=""/>
+      <w:lvlJc w:val="left"/>
+      <w:pPr>
+        <w:ind w:left="720" w:hanging="360"/>
+      </w:pPr>
+      <w:rPr>
+        <w:rFonts w:ascii="Symbol" w:hAnsi="Symbol" w:cs="Symbol" w:hint="default"/>
+      </w:rPr>
+    </w:lvl>
+    <w:lvl w:ilvl="1">
+      <w:numFmt w:val="bullet"/>
+      <w:lvlText w:val="o"/>
+      <w:lvlJc w:val="left"/>
+      <w:pPr>
+        <w:ind w:left="1440" w:hanging="360"/>
+      </w:pPr>
+      <w:rPr>
+        <w:rFonts w:ascii="Courier New" w:hAnsi="Courier New" w:cs="Courier New" w:hint="default"/>
+      </w:rPr>
+    </w:lvl>
+    <w:lvl w:ilvl="2">
+      <w:numFmt w:val="bullet"/>
+      <w:lvlText w:val=""/>
+      <w:lvlJc w:val="left"/>
+      <w:pPr>
+        <w:ind w:left="2160" w:hanging="360"/>
+      </w:pPr>
+      <w:rPr>
+        <w:rFonts w:ascii="Wingdings" w:hAnsi="Wingdings" w:cs="Wingdings" w:hint="default"/>
+      </w:rPr>
+    </w:lvl>
+    <w:lvl w:ilvl="3">
+      <w:numFmt w:val="bullet"/>
+      <w:lvlText w:val=""/>
+      <w:lvlJc w:val="left"/>
+      <w:pPr>
+        <w:ind w:left="2880" w:hanging="360"/>
+      </w:pPr>
+      <w:rPr>
+        <w:rFonts w:ascii="Symbol" w:hAnsi="Symbol" w:cs="Symbol" w:hint="default"/>
+      </w:rPr>
+    </w:lvl>
+    <w:lvl w:ilvl="4">
+      <w:numFmt w:val="bullet"/>
+      <w:lvlText w:val="o"/>
+      <w:lvlJc w:val="left"/>
+      <w:pPr>
+        <w:ind w:left="3600" w:hanging="360"/>
+      </w:pPr>
+      <w:rPr>
+        <w:rFonts w:ascii="Courier New" w:hAnsi="Courier New" w:cs="Courier New" w:hint="default"/>
+      </w:rPr>
+    </w:lvl>
+    <w:lvl w:ilvl="5">
+      <w:numFmt w:val="bullet"/>
+      <w:lvlText w:val=""/>
+      <w:lvlJc w:val="left"/>
+      <w:pPr>
+        <w:ind w:left="4320" w:hanging="360"/>
+      </w:pPr>
+      <w:rPr>
+        <w:rFonts w:ascii="Wingdings" w:hAnsi="Wingdings" w:cs="Wingdings" w:hint="default"/>
+      </w:rPr>
+    </w:lvl>
+    <w:lvl w:ilvl="6">
+      <w:numFmt w:val="bullet"/>
+      <w:lvlText w:val=""/>
+      <w:lvlJc w:val="left"/>
+      <w:pPr>
+        <w:ind w:left="5040" w:hanging="360"/>
+      </w:pPr>
+      <w:rPr>
+        <w:rFonts w:ascii="Symbol" w:hAnsi="Symbol" w:cs="Symbol" w:hint="default"/>
+      </w:rPr>
+    </w:lvl>
+    <w:lvl w:ilvl="7">
+      <w:numFmt w:val="bullet"/>
+      <w:lvlText w:val="o"/>
+      <w:lvlJc w:val="left"/>
+      <w:pPr>
+        <w:ind w:left="5760" w:hanging="360"/>
+      </w:pPr>
+      <w:rPr>
+        <w:rFonts w:ascii="Courier New" w:hAnsi="Courier New" w:cs="Courier New" w:hint="default"/>
+      </w:rPr>
+    </w:lvl>
+    <w:lvl w:ilvl="8">
+      <w:numFmt w:val="bullet"/>
+      <w:lvlText w:val=""/>
+      <w:lvlJc w:val="left"/>
+      <w:pPr>
+        <w:ind w:left="6480" w:hanging="360"/>
+      </w:pPr>
+      <w:rPr>
+        <w:rFonts w:ascii="Wingdings" w:hAnsi="Wingdings" w:cs="Wingdings" w:hint="default"/>
+      </w:rPr>
+    </w:lvl>
+  </w:abstractNum>
   <w:num w:numId="1">
     <w:abstractNumId w:val="1"/>
     <w:lvlOverride w:ilvl="0">
@@ -1464,6 +1130,9 @@
   </w:num>
   <w:num w:numId="1000">
     <w:abstractNumId w:val="990"/>
+  </w:num>
+  <w:num w:numId="1001">
+    <w:abstractNumId w:val="991"/>
   </w:num>
 </w:numbering>
 </file>
@@ -1668,6 +1337,240 @@
       <w:sz w:val="20"/>
       <w:szCs w:val="20"/>
     </w:rPr>
+  </w:style>
+  <w:style w:customStyle="1" w:styleId="SourceCode" w:type="paragraph">
+    <w:name w:val="Source Code"/>
+    <w:basedOn w:val="Normal"/>
+    <w:link w:val="VerbatimChar"/>
+    <w:pPr>
+      <w:wordWrap w:val="off"/>
+    </w:pPr>
+  </w:style>
+  <w:style w:customStyle="1" w:styleId="KeywordTok" w:type="character">
+    <w:name w:val="KeywordTok"/>
+    <w:basedOn w:val="VerbatimChar"/>
+    <w:rPr>
+      <w:b/>
+      <w:color w:val="007020"/>
+    </w:rPr>
+  </w:style>
+  <w:style w:customStyle="1" w:styleId="DataTypeTok" w:type="character">
+    <w:name w:val="DataTypeTok"/>
+    <w:basedOn w:val="VerbatimChar"/>
+    <w:rPr>
+      <w:color w:val="902000"/>
+    </w:rPr>
+  </w:style>
+  <w:style w:customStyle="1" w:styleId="DecValTok" w:type="character">
+    <w:name w:val="DecValTok"/>
+    <w:basedOn w:val="VerbatimChar"/>
+    <w:rPr>
+      <w:color w:val="40a070"/>
+    </w:rPr>
+  </w:style>
+  <w:style w:customStyle="1" w:styleId="BaseNTok" w:type="character">
+    <w:name w:val="BaseNTok"/>
+    <w:basedOn w:val="VerbatimChar"/>
+    <w:rPr>
+      <w:color w:val="40a070"/>
+    </w:rPr>
+  </w:style>
+  <w:style w:customStyle="1" w:styleId="FloatTok" w:type="character">
+    <w:name w:val="FloatTok"/>
+    <w:basedOn w:val="VerbatimChar"/>
+    <w:rPr>
+      <w:color w:val="40a070"/>
+    </w:rPr>
+  </w:style>
+  <w:style w:customStyle="1" w:styleId="ConstantTok" w:type="character">
+    <w:name w:val="ConstantTok"/>
+    <w:basedOn w:val="VerbatimChar"/>
+    <w:rPr>
+      <w:color w:val="880000"/>
+    </w:rPr>
+  </w:style>
+  <w:style w:customStyle="1" w:styleId="CharTok" w:type="character">
+    <w:name w:val="CharTok"/>
+    <w:basedOn w:val="VerbatimChar"/>
+    <w:rPr>
+      <w:color w:val="4070a0"/>
+    </w:rPr>
+  </w:style>
+  <w:style w:customStyle="1" w:styleId="SpecialCharTok" w:type="character">
+    <w:name w:val="SpecialCharTok"/>
+    <w:basedOn w:val="VerbatimChar"/>
+    <w:rPr>
+      <w:color w:val="4070a0"/>
+    </w:rPr>
+  </w:style>
+  <w:style w:customStyle="1" w:styleId="StringTok" w:type="character">
+    <w:name w:val="StringTok"/>
+    <w:basedOn w:val="VerbatimChar"/>
+    <w:rPr>
+      <w:color w:val="4070a0"/>
+    </w:rPr>
+  </w:style>
+  <w:style w:customStyle="1" w:styleId="VerbatimStringTok" w:type="character">
+    <w:name w:val="VerbatimStringTok"/>
+    <w:basedOn w:val="VerbatimChar"/>
+    <w:rPr>
+      <w:color w:val="4070a0"/>
+    </w:rPr>
+  </w:style>
+  <w:style w:customStyle="1" w:styleId="SpecialStringTok" w:type="character">
+    <w:name w:val="SpecialStringTok"/>
+    <w:basedOn w:val="VerbatimChar"/>
+    <w:rPr>
+      <w:color w:val="bb6688"/>
+    </w:rPr>
+  </w:style>
+  <w:style w:customStyle="1" w:styleId="ImportTok" w:type="character">
+    <w:name w:val="ImportTok"/>
+    <w:basedOn w:val="VerbatimChar"/>
+    <w:rPr>
+      <w:b/>
+      <w:color w:val="008000"/>
+    </w:rPr>
+  </w:style>
+  <w:style w:customStyle="1" w:styleId="CommentTok" w:type="character">
+    <w:name w:val="CommentTok"/>
+    <w:basedOn w:val="VerbatimChar"/>
+    <w:rPr>
+      <w:i/>
+      <w:color w:val="60a0b0"/>
+    </w:rPr>
+  </w:style>
+  <w:style w:customStyle="1" w:styleId="DocumentationTok" w:type="character">
+    <w:name w:val="DocumentationTok"/>
+    <w:basedOn w:val="VerbatimChar"/>
+    <w:rPr>
+      <w:i/>
+      <w:color w:val="ba2121"/>
+    </w:rPr>
+  </w:style>
+  <w:style w:customStyle="1" w:styleId="AnnotationTok" w:type="character">
+    <w:name w:val="AnnotationTok"/>
+    <w:basedOn w:val="VerbatimChar"/>
+    <w:rPr>
+      <w:b/>
+      <w:i/>
+      <w:color w:val="60a0b0"/>
+    </w:rPr>
+  </w:style>
+  <w:style w:customStyle="1" w:styleId="CommentVarTok" w:type="character">
+    <w:name w:val="CommentVarTok"/>
+    <w:basedOn w:val="VerbatimChar"/>
+    <w:rPr>
+      <w:b/>
+      <w:i/>
+      <w:color w:val="60a0b0"/>
+    </w:rPr>
+  </w:style>
+  <w:style w:customStyle="1" w:styleId="OtherTok" w:type="character">
+    <w:name w:val="OtherTok"/>
+    <w:basedOn w:val="VerbatimChar"/>
+    <w:rPr>
+      <w:color w:val="007020"/>
+    </w:rPr>
+  </w:style>
+  <w:style w:customStyle="1" w:styleId="FunctionTok" w:type="character">
+    <w:name w:val="FunctionTok"/>
+    <w:basedOn w:val="VerbatimChar"/>
+    <w:rPr>
+      <w:color w:val="06287e"/>
+    </w:rPr>
+  </w:style>
+  <w:style w:customStyle="1" w:styleId="VariableTok" w:type="character">
+    <w:name w:val="VariableTok"/>
+    <w:basedOn w:val="VerbatimChar"/>
+    <w:rPr>
+      <w:color w:val="19177c"/>
+    </w:rPr>
+  </w:style>
+  <w:style w:customStyle="1" w:styleId="ControlFlowTok" w:type="character">
+    <w:name w:val="ControlFlowTok"/>
+    <w:basedOn w:val="VerbatimChar"/>
+    <w:rPr>
+      <w:b/>
+      <w:color w:val="007020"/>
+    </w:rPr>
+  </w:style>
+  <w:style w:customStyle="1" w:styleId="OperatorTok" w:type="character">
+    <w:name w:val="OperatorTok"/>
+    <w:basedOn w:val="VerbatimChar"/>
+    <w:rPr>
+      <w:color w:val="666666"/>
+    </w:rPr>
+  </w:style>
+  <w:style w:customStyle="1" w:styleId="BuiltInTok" w:type="character">
+    <w:name w:val="BuiltInTok"/>
+    <w:basedOn w:val="VerbatimChar"/>
+    <w:rPr>
+      <w:color w:val="008000"/>
+    </w:rPr>
+  </w:style>
+  <w:style w:customStyle="1" w:styleId="ExtensionTok" w:type="character">
+    <w:name w:val="ExtensionTok"/>
+    <w:basedOn w:val="VerbatimChar"/>
+    <w:rPr/>
+  </w:style>
+  <w:style w:customStyle="1" w:styleId="PreprocessorTok" w:type="character">
+    <w:name w:val="PreprocessorTok"/>
+    <w:basedOn w:val="VerbatimChar"/>
+    <w:rPr>
+      <w:color w:val="bc7a00"/>
+    </w:rPr>
+  </w:style>
+  <w:style w:customStyle="1" w:styleId="AttributeTok" w:type="character">
+    <w:name w:val="AttributeTok"/>
+    <w:basedOn w:val="VerbatimChar"/>
+    <w:rPr>
+      <w:color w:val="7d9029"/>
+    </w:rPr>
+  </w:style>
+  <w:style w:customStyle="1" w:styleId="RegionMarkerTok" w:type="character">
+    <w:name w:val="RegionMarkerTok"/>
+    <w:basedOn w:val="VerbatimChar"/>
+    <w:rPr/>
+  </w:style>
+  <w:style w:customStyle="1" w:styleId="InformationTok" w:type="character">
+    <w:name w:val="InformationTok"/>
+    <w:basedOn w:val="VerbatimChar"/>
+    <w:rPr>
+      <w:b/>
+      <w:i/>
+      <w:color w:val="60a0b0"/>
+    </w:rPr>
+  </w:style>
+  <w:style w:customStyle="1" w:styleId="WarningTok" w:type="character">
+    <w:name w:val="WarningTok"/>
+    <w:basedOn w:val="VerbatimChar"/>
+    <w:rPr>
+      <w:b/>
+      <w:i/>
+      <w:color w:val="60a0b0"/>
+    </w:rPr>
+  </w:style>
+  <w:style w:customStyle="1" w:styleId="AlertTok" w:type="character">
+    <w:name w:val="AlertTok"/>
+    <w:basedOn w:val="VerbatimChar"/>
+    <w:rPr>
+      <w:b/>
+      <w:color w:val="ff0000"/>
+    </w:rPr>
+  </w:style>
+  <w:style w:customStyle="1" w:styleId="ErrorTok" w:type="character">
+    <w:name w:val="ErrorTok"/>
+    <w:basedOn w:val="VerbatimChar"/>
+    <w:rPr>
+      <w:b/>
+      <w:color w:val="ff0000"/>
+    </w:rPr>
+  </w:style>
+  <w:style w:customStyle="1" w:styleId="NormalTok" w:type="character">
+    <w:name w:val="NormalTok"/>
+    <w:basedOn w:val="VerbatimChar"/>
+    <w:rPr/>
   </w:style>
   <w:style w:customStyle="1" w:styleId="SourceCode" w:type="paragraph">
     <w:name w:val="Source Code"/>

</xml_diff>

<commit_message>
Rebuild Word deliverables with consistent document formatting
All thirteen deliverables now share one style: Times New Roman 12pt body,
1.5 line spacing, justified text, and a consistent heading hierarchy.
Previously four used one style and nine another.

Also drops a stray empty table of contents from the fabricated detection
diagnostic and corrects the heading levels in the final report, where the
title had been carrying a section style.
</commit_message>
<xml_diff>
--- a/docs/deliverables/AI_Usage_Log.docx
+++ b/docs/deliverables/AI_Usage_Log.docx
@@ -2,10 +2,9 @@
 <file path=word/document.xml><?xml version="1.0" encoding="utf-8"?>
 <w:document xmlns:w="http://schemas.openxmlformats.org/wordprocessingml/2006/main" xmlns:m="http://schemas.openxmlformats.org/officeDocument/2006/math" xmlns:r="http://schemas.openxmlformats.org/officeDocument/2006/relationships" xmlns:o="urn:schemas-microsoft-com:office:office" xmlns:v="urn:schemas-microsoft-com:vml" xmlns:w10="urn:schemas-microsoft-com:office:word" xmlns:a="http://schemas.openxmlformats.org/drawingml/2006/main" xmlns:pic="http://schemas.openxmlformats.org/drawingml/2006/picture" xmlns:wp="http://schemas.openxmlformats.org/drawingml/2006/wordprocessingDrawing">
   <w:body>
-    <w:bookmarkStart w:id="19" w:name="ai-usage-log-appendix"/>
     <w:p>
       <w:pPr>
-        <w:pStyle w:val="Heading1"/>
+        <w:pStyle w:val="Title"/>
       </w:pPr>
       <w:r>
         <w:t xml:space="preserve">AI Usage Log, Appendix</w:t>
@@ -85,10 +84,10 @@
         <w:t xml:space="preserve">Required by section 9.4 of the project proposal. The log records where software tools were consulted during the project. It was started on 6 July 2026, so entries before that date are reconstructed from the development history and are marked as reconstructed.</w:t>
       </w:r>
     </w:p>
-    <w:bookmarkStart w:id="16" w:name="summary-of-use"/>
+    <w:bookmarkStart w:id="9" w:name="summary-of-use"/>
     <w:p>
       <w:pPr>
-        <w:pStyle w:val="Heading2"/>
+        <w:pStyle w:val="Heading1"/>
       </w:pPr>
       <w:r>
         <w:t xml:space="preserve">Summary of use</w:t>
@@ -137,11 +136,11 @@
         <w:t xml:space="preserve">branch.</w:t>
       </w:r>
     </w:p>
-    <w:bookmarkEnd w:id="16"/>
-    <w:bookmarkStart w:id="17" w:name="work-carried-out-by-the-student"/>
+    <w:bookmarkEnd w:id="9"/>
+    <w:bookmarkStart w:id="10" w:name="work-carried-out-by-the-student"/>
     <w:p>
       <w:pPr>
-        <w:pStyle w:val="Heading2"/>
+        <w:pStyle w:val="Heading1"/>
       </w:pPr>
       <w:r>
         <w:t xml:space="preserve">Work carried out by the student</w:t>
@@ -231,11 +230,11 @@
         <w:t xml:space="preserve">Interpretation of validation results and the decision to report weaker per-class results transparently.</w:t>
       </w:r>
     </w:p>
-    <w:bookmarkEnd w:id="17"/>
-    <w:bookmarkStart w:id="18" w:name="log-entries"/>
+    <w:bookmarkEnd w:id="10"/>
+    <w:bookmarkStart w:id="11" w:name="log-entries"/>
     <w:p>
       <w:pPr>
-        <w:pStyle w:val="Heading2"/>
+        <w:pStyle w:val="Heading1"/>
       </w:pPr>
       <w:r>
         <w:t xml:space="preserve">Log entries</w:t>
@@ -794,14 +793,11 @@
         </w:tc>
       </w:tr>
     </w:tbl>
-    <w:bookmarkEnd w:id="18"/>
-    <w:bookmarkEnd w:id="19"/>
+    <w:bookmarkEnd w:id="11"/>
     <w:sectPr>
-      <w:footerReference r:id="rId7" w:type="default"/>
-      <w:pgSz w:h="16838" w:orient="portrait" w:w="11906"/>
-      <w:pgMar w:bottom="1440" w:footer="708" w:gutter="0" w:header="708" w:left="1440" w:right="1440" w:top="1440"/>
-      <w:pgNumType/>
-      <w:docGrid w:linePitch="360"/>
+      <w:footnotePr>
+        <w:numRestart w:val="eachSect"/>
+      </w:footnotePr>
     </w:sectPr>
   </w:body>
 </w:document>
@@ -811,33 +807,6 @@
 <w:comments xmlns:w="http://schemas.openxmlformats.org/wordprocessingml/2006/main" xmlns:m="http://schemas.openxmlformats.org/officeDocument/2006/math" xmlns:r="http://schemas.openxmlformats.org/officeDocument/2006/relationships" xmlns:o="urn:schemas-microsoft-com:office:office" xmlns:v="urn:schemas-microsoft-com:vml" xmlns:w10="urn:schemas-microsoft-com:office:word" xmlns:a="http://schemas.openxmlformats.org/drawingml/2006/main" xmlns:pic="http://schemas.openxmlformats.org/drawingml/2006/picture" xmlns:wp="http://schemas.openxmlformats.org/drawingml/2006/wordprocessingDrawing"/>
 </file>
 
-<file path=word/footer1.xml><?xml version="1.0" encoding="utf-8"?>
-<w:ftr xmlns:wpc="http://schemas.microsoft.com/office/word/2010/wordprocessingCanvas" xmlns:mc="http://schemas.openxmlformats.org/markup-compatibility/2006" xmlns:o="urn:schemas-microsoft-com:office:office" xmlns:r="http://schemas.openxmlformats.org/officeDocument/2006/relationships" xmlns:m="http://schemas.openxmlformats.org/officeDocument/2006/math" xmlns:v="urn:schemas-microsoft-com:vml" xmlns:wp14="http://schemas.microsoft.com/office/word/2010/wordprocessingDrawing" xmlns:wp="http://schemas.openxmlformats.org/drawingml/2006/wordprocessingDrawing" xmlns:w10="urn:schemas-microsoft-com:office:word" xmlns:w="http://schemas.openxmlformats.org/wordprocessingml/2006/main" xmlns:w14="http://schemas.microsoft.com/office/word/2010/wordml" xmlns:w15="http://schemas.microsoft.com/office/word/2012/wordml" xmlns:wpg="http://schemas.microsoft.com/office/word/2010/wordprocessingGroup" xmlns:wpi="http://schemas.microsoft.com/office/word/2010/wordprocessingInk" xmlns:wne="http://schemas.microsoft.com/office/word/2006/wordml" xmlns:wps="http://schemas.microsoft.com/office/word/2010/wordprocessingShape">
-  <w:p>
-    <w:pPr>
-      <w:jc w:val="center"/>
-    </w:pPr>
-    <w:r>
-      <w:rPr>
-        <w:color w:val="595959"/>
-        <w:sz w:val="18"/>
-        <w:szCs w:val="18"/>
-      </w:rPr>
-      <w:t xml:space="preserve">Page </w:t>
-      <w:fldChar w:fldCharType="begin"/>
-      <w:instrText xml:space="preserve">PAGE</w:instrText>
-      <w:fldChar w:fldCharType="separate"/>
-      <w:fldChar w:fldCharType="end"/>
-      <w:t xml:space="preserve"> of </w:t>
-      <w:fldChar w:fldCharType="begin"/>
-      <w:instrText xml:space="preserve">NUMPAGES</w:instrText>
-      <w:fldChar w:fldCharType="separate"/>
-      <w:fldChar w:fldCharType="end"/>
-    </w:r>
-  </w:p>
-</w:ftr>
-</file>
-
 <file path=word/footnotes.xml><?xml version="1.0" encoding="utf-8"?>
 <w:footnotes xmlns:w="http://schemas.openxmlformats.org/wordprocessingml/2006/main" xmlns:m="http://schemas.openxmlformats.org/officeDocument/2006/math" xmlns:r="http://schemas.openxmlformats.org/officeDocument/2006/relationships" xmlns:o="urn:schemas-microsoft-com:office:office" xmlns:v="urn:schemas-microsoft-com:vml" xmlns:w10="urn:schemas-microsoft-com:office:word" xmlns:a="http://schemas.openxmlformats.org/drawingml/2006/main" xmlns:pic="http://schemas.openxmlformats.org/drawingml/2006/picture" xmlns:wp="http://schemas.openxmlformats.org/drawingml/2006/wordprocessingDrawing">
   <w:footnote w:type="continuationSeparator" w:id="0">
@@ -858,91 +827,7 @@
 </file>
 
 <file path=word/numbering.xml><?xml version="1.0" encoding="utf-8"?>
-<w:numbering xmlns:m="http://schemas.openxmlformats.org/officeDocument/2006/math" xmlns:mc="http://schemas.openxmlformats.org/markup-compatibility/2006" xmlns:o="urn:schemas-microsoft-com:office:office" xmlns:r="http://schemas.openxmlformats.org/officeDocument/2006/relationships" xmlns:v="urn:schemas-microsoft-com:vml" xmlns:w="http://schemas.openxmlformats.org/wordprocessingml/2006/main" xmlns:w10="urn:schemas-microsoft-com:office:word" xmlns:w14="http://schemas.microsoft.com/office/word/2010/wordml" xmlns:w15="http://schemas.microsoft.com/office/word/2012/wordml" xmlns:wne="http://schemas.microsoft.com/office/word/2006/wordml" xmlns:wp="http://schemas.openxmlformats.org/drawingml/2006/wordprocessingDrawing" xmlns:wp14="http://schemas.microsoft.com/office/word/2010/wordprocessingDrawing" xmlns:wpc="http://schemas.microsoft.com/office/word/2010/wordprocessingCanvas" xmlns:wpg="http://schemas.microsoft.com/office/word/2010/wordprocessingGroup" xmlns:wpi="http://schemas.microsoft.com/office/word/2010/wordprocessingInk" xmlns:wps="http://schemas.microsoft.com/office/word/2010/wordprocessingShape" mc:Ignorable="w14 w15 wp14">
-  <w:abstractNum w15:restartNumberingAfterBreak="0" w:abstractNumId="1">
-    <w:multiLevelType w:val="hybridMultilevel"/>
-    <w:lvl w15:tentative="1" w:ilvl="0">
-      <w:start w:val="1"/>
-      <w:numFmt w:val="bullet"/>
-      <w:lvlText w:val="●"/>
-      <w:lvlJc w:val="left"/>
-      <w:pPr>
-        <w:ind w:hanging="360" w:left="720"/>
-      </w:pPr>
-    </w:lvl>
-    <w:lvl w15:tentative="1" w:ilvl="1">
-      <w:start w:val="1"/>
-      <w:numFmt w:val="bullet"/>
-      <w:lvlText w:val="○"/>
-      <w:lvlJc w:val="left"/>
-      <w:pPr>
-        <w:ind w:hanging="360" w:left="1440"/>
-      </w:pPr>
-    </w:lvl>
-    <w:lvl w15:tentative="1" w:ilvl="2">
-      <w:start w:val="1"/>
-      <w:numFmt w:val="bullet"/>
-      <w:lvlText w:val="■"/>
-      <w:lvlJc w:val="left"/>
-      <w:pPr>
-        <w:ind w:hanging="360" w:left="2160"/>
-      </w:pPr>
-    </w:lvl>
-    <w:lvl w15:tentative="1" w:ilvl="3">
-      <w:start w:val="1"/>
-      <w:numFmt w:val="bullet"/>
-      <w:lvlText w:val="●"/>
-      <w:lvlJc w:val="left"/>
-      <w:pPr>
-        <w:ind w:hanging="360" w:left="2880"/>
-      </w:pPr>
-    </w:lvl>
-    <w:lvl w15:tentative="1" w:ilvl="4">
-      <w:start w:val="1"/>
-      <w:numFmt w:val="bullet"/>
-      <w:lvlText w:val="○"/>
-      <w:lvlJc w:val="left"/>
-      <w:pPr>
-        <w:ind w:hanging="360" w:left="3600"/>
-      </w:pPr>
-    </w:lvl>
-    <w:lvl w15:tentative="1" w:ilvl="5">
-      <w:start w:val="1"/>
-      <w:numFmt w:val="bullet"/>
-      <w:lvlText w:val="■"/>
-      <w:lvlJc w:val="left"/>
-      <w:pPr>
-        <w:ind w:hanging="360" w:left="4320"/>
-      </w:pPr>
-    </w:lvl>
-    <w:lvl w15:tentative="1" w:ilvl="6">
-      <w:start w:val="1"/>
-      <w:numFmt w:val="bullet"/>
-      <w:lvlText w:val="●"/>
-      <w:lvlJc w:val="left"/>
-      <w:pPr>
-        <w:ind w:hanging="360" w:left="5040"/>
-      </w:pPr>
-    </w:lvl>
-    <w:lvl w15:tentative="1" w:ilvl="7">
-      <w:start w:val="1"/>
-      <w:numFmt w:val="bullet"/>
-      <w:lvlText w:val="●"/>
-      <w:lvlJc w:val="left"/>
-      <w:pPr>
-        <w:ind w:hanging="360" w:left="5760"/>
-      </w:pPr>
-    </w:lvl>
-    <w:lvl w15:tentative="1" w:ilvl="8">
-      <w:start w:val="1"/>
-      <w:numFmt w:val="bullet"/>
-      <w:lvlText w:val="●"/>
-      <w:lvlJc w:val="left"/>
-      <w:pPr>
-        <w:ind w:hanging="360" w:left="6480"/>
-      </w:pPr>
-    </w:lvl>
-  </w:abstractNum>
+<w:numbering xmlns:w="http://schemas.openxmlformats.org/wordprocessingml/2006/main">
   <w:abstractNum w:abstractNumId="990">
     <w:nsid w:val="0000A990"/>
     <w:multiLevelType w:val="multilevel"/>
@@ -1122,12 +1007,6 @@
       </w:rPr>
     </w:lvl>
   </w:abstractNum>
-  <w:num w:numId="1">
-    <w:abstractNumId w:val="1"/>
-    <w:lvlOverride w:ilvl="0">
-      <w:startOverride w:val="1"/>
-    </w:lvlOverride>
-  </w:num>
   <w:num w:numId="1000">
     <w:abstractNumId w:val="990"/>
   </w:num>
@@ -1138,907 +1017,682 @@
 </file>
 
 <file path=word/styles.xml><?xml version="1.0" encoding="utf-8"?>
-<w:styles xmlns:mc="http://schemas.openxmlformats.org/markup-compatibility/2006" xmlns:r="http://schemas.openxmlformats.org/officeDocument/2006/relationships" xmlns:w="http://schemas.openxmlformats.org/wordprocessingml/2006/main" xmlns:w14="http://schemas.microsoft.com/office/word/2010/wordml" xmlns:w15="http://schemas.microsoft.com/office/word/2012/wordml" mc:Ignorable="w14 w15">
+<w:styles xmlns:r="http://schemas.openxmlformats.org/officeDocument/2006/relationships" xmlns:w="http://schemas.openxmlformats.org/wordprocessingml/2006/main">
   <w:docDefaults>
     <w:rPrDefault>
       <w:rPr>
-        <w:rFonts w:ascii="Calibri" w:cs="Calibri" w:eastAsia="Calibri" w:hAnsi="Calibri"/>
-        <w:sz w:val="22"/>
-        <w:szCs w:val="22"/>
+        <w:rFonts w:ascii="Times New Roman" w:cs="Times New Roman" w:eastAsia="Times New Roman" w:hAnsi="Times New Roman"/>
+        <w:sz w:val="24"/>
+        <w:szCs w:val="24"/>
+        <w:lang w:bidi="ar-SA" w:eastAsia="zh-CN" w:val="en-US"/>
       </w:rPr>
     </w:rPrDefault>
-    <w:pPrDefault/>
+    <w:pPrDefault>
+      <w:pPr>
+        <w:spacing w:after="200"/>
+      </w:pPr>
+    </w:pPrDefault>
   </w:docDefaults>
+  <w:latentStyles w:count="276" w:defLockedState="0" w:defQFormat="0" w:defSemiHidden="0" w:defUIPriority="0" w:defUnhideWhenUsed="0"/>
+  <w:style w:default="1" w:styleId="Normal" w:type="paragraph">
+    <w:name w:val="Normal"/>
+    <w:qFormat/>
+    <w:pPr>
+      <w:spacing w:line="360" w:lineRule="auto"/>
+      <w:jc w:val="both"/>
+    </w:pPr>
+  </w:style>
+  <w:style w:styleId="BodyText" w:type="paragraph">
+    <w:name w:val="Body Text"/>
+    <w:basedOn w:val="Normal"/>
+    <w:link w:val="BodyTextChar"/>
+    <w:qFormat/>
+    <w:pPr>
+      <w:spacing w:after="180" w:before="180"/>
+    </w:pPr>
+  </w:style>
+  <w:style w:customStyle="1" w:styleId="FirstParagraph" w:type="paragraph">
+    <w:name w:val="First Paragraph"/>
+    <w:basedOn w:val="BodyText"/>
+    <w:next w:val="BodyText"/>
+    <w:qFormat/>
+  </w:style>
+  <w:style w:customStyle="1" w:styleId="Compact" w:type="paragraph">
+    <w:name w:val="Compact"/>
+    <w:basedOn w:val="BodyText"/>
+    <w:qFormat/>
+    <w:pPr>
+      <w:spacing w:after="36" w:before="36"/>
+    </w:pPr>
+  </w:style>
   <w:style w:styleId="Title" w:type="paragraph">
     <w:name w:val="Title"/>
     <w:basedOn w:val="Normal"/>
-    <w:next w:val="Normal"/>
-    <w:qFormat/>
-    <w:rPr>
-      <w:sz w:val="56"/>
-      <w:szCs w:val="56"/>
-    </w:rPr>
-  </w:style>
-  <w:style w:styleId="Heading1" w:type="paragraph">
-    <w:name w:val="Heading 1"/>
-    <w:basedOn w:val="Normal"/>
-    <w:next w:val="Normal"/>
-    <w:qFormat/>
-    <w:pPr>
-      <w:spacing w:after="160" w:before="280"/>
-    </w:pPr>
-    <w:rPr>
-      <w:rFonts w:ascii="Calibri Light" w:cs="Calibri Light" w:eastAsia="Calibri Light" w:hAnsi="Calibri Light"/>
+    <w:next w:val="BodyText"/>
+    <w:link w:val="TitleChar"/>
+    <w:uiPriority w:val="10"/>
+    <w:qFormat/>
+    <w:rsid w:val="00A10FD9"/>
+    <w:pPr>
+      <w:spacing w:after="120" w:before="240" w:line="240" w:lineRule="auto"/>
+      <w:contextualSpacing/>
+      <w:jc w:val="center"/>
+    </w:pPr>
+    <w:rPr>
+      <w:rFonts w:ascii="Times New Roman" w:cs="Times New Roman" w:hAnsi="Times New Roman"/>
       <w:b/>
       <w:bCs/>
-      <w:color w:val="1F4E79"/>
+      <w:color w:val="000000"/>
       <w:sz w:val="32"/>
       <w:szCs w:val="32"/>
     </w:rPr>
   </w:style>
-  <w:style w:styleId="Heading2" w:type="paragraph">
-    <w:name w:val="Heading 2"/>
-    <w:basedOn w:val="Normal"/>
-    <w:next w:val="Normal"/>
-    <w:qFormat/>
-    <w:pPr>
-      <w:spacing w:after="120" w:before="240"/>
-    </w:pPr>
-    <w:rPr>
-      <w:rFonts w:ascii="Calibri Light" w:cs="Calibri Light" w:eastAsia="Calibri Light" w:hAnsi="Calibri Light"/>
+  <w:style w:customStyle="1" w:styleId="TitleChar" w:type="character">
+    <w:name w:val="Title Char"/>
+    <w:basedOn w:val="DefaultParagraphFont"/>
+    <w:link w:val="Title"/>
+    <w:uiPriority w:val="10"/>
+    <w:rsid w:val="00A10FD9"/>
+    <w:rPr>
+      <w:rFonts w:ascii="Times New Roman" w:cs="Times New Roman" w:hAnsi="Times New Roman"/>
       <w:b/>
       <w:bCs/>
-      <w:color w:val="2E74B5"/>
+      <w:color w:val="000000"/>
+      <w:sz w:val="32"/>
+      <w:szCs w:val="32"/>
+    </w:rPr>
+  </w:style>
+  <w:style w:styleId="Subtitle" w:type="paragraph">
+    <w:name w:val="Subtitle"/>
+    <w:basedOn w:val="Title"/>
+    <w:next w:val="BodyText"/>
+    <w:link w:val="SubtitleChar"/>
+    <w:uiPriority w:val="11"/>
+    <w:qFormat/>
+    <w:rsid w:val="00A10FD9"/>
+    <w:pPr>
+      <w:numPr>
+        <w:ilvl w:val="1"/>
+      </w:numPr>
+    </w:pPr>
+    <w:rPr>
+      <w:rFonts w:cstheme="majorBidi" w:eastAsiaTheme="majorEastAsia"/>
+      <w:spacing w:val="15"/>
+      <w:sz w:val="28"/>
+      <w:szCs w:val="28"/>
+    </w:rPr>
+  </w:style>
+  <w:style w:customStyle="1" w:styleId="SubtitleChar" w:type="character">
+    <w:name w:val="Subtitle Char"/>
+    <w:basedOn w:val="DefaultParagraphFont"/>
+    <w:link w:val="Subtitle"/>
+    <w:uiPriority w:val="11"/>
+    <w:rsid w:val="00A10FD9"/>
+    <w:rPr>
+      <w:rFonts w:cstheme="majorBidi" w:eastAsiaTheme="majorEastAsia"/>
+      <w:color w:themeColor="text1" w:themeTint="A6" w:val="595959"/>
+      <w:spacing w:val="15"/>
+      <w:sz w:val="28"/>
+      <w:szCs w:val="28"/>
+    </w:rPr>
+  </w:style>
+  <w:style w:customStyle="1" w:styleId="Author" w:type="paragraph">
+    <w:name w:val="Author"/>
+    <w:basedOn w:val="Title"/>
+    <w:next w:val="BodyText"/>
+    <w:qFormat/>
+    <w:pPr>
+      <w:keepNext/>
+      <w:keepLines/>
+    </w:pPr>
+    <w:rPr>
+      <w:sz w:val="24"/>
+      <w:szCs w:val="24"/>
+    </w:rPr>
+  </w:style>
+  <w:style w:styleId="Date" w:type="paragraph">
+    <w:name w:val="Date"/>
+    <w:basedOn w:val="Title"/>
+    <w:next w:val="BodyText"/>
+    <w:qFormat/>
+    <w:pPr>
+      <w:keepNext/>
+      <w:keepLines/>
+    </w:pPr>
+    <w:rPr>
+      <w:sz w:val="24"/>
+      <w:szCs w:val="24"/>
+    </w:rPr>
+  </w:style>
+  <w:style w:customStyle="1" w:styleId="AbstractTitle" w:type="paragraph">
+    <w:name w:val="Abstract Title"/>
+    <w:basedOn w:val="Normal"/>
+    <w:next w:val="Abstract"/>
+    <w:qFormat/>
+    <w:pPr>
+      <w:keepNext/>
+      <w:keepLines/>
+      <w:spacing w:after="0" w:before="300"/>
+      <w:jc w:val="center"/>
+    </w:pPr>
+    <w:rPr>
+      <w:b/>
+      <w:sz w:val="20"/>
+      <w:szCs w:val="20"/>
+    </w:rPr>
+  </w:style>
+  <w:style w:customStyle="1" w:styleId="Abstract" w:type="paragraph">
+    <w:name w:val="Abstract"/>
+    <w:basedOn w:val="Normal"/>
+    <w:next w:val="BodyText"/>
+    <w:qFormat/>
+    <w:pPr>
+      <w:keepNext/>
+      <w:keepLines/>
+      <w:spacing w:after="300" w:before="100"/>
+      <w:jc w:val="both"/>
+    </w:pPr>
+    <w:rPr>
+      <w:sz w:val="24"/>
+      <w:szCs w:val="24"/>
+    </w:rPr>
+  </w:style>
+  <w:style w:styleId="Bibliography" w:type="paragraph">
+    <w:name w:val="Bibliography"/>
+    <w:basedOn w:val="Normal"/>
+    <w:next w:val="Bibliography"/>
+    <w:qFormat/>
+    <w:pPr/>
+    <w:rPr/>
+  </w:style>
+  <w:style w:styleId="Heading1" w:type="paragraph">
+    <w:name w:val="heading 1"/>
+    <w:basedOn w:val="Normal"/>
+    <w:next w:val="BodyText"/>
+    <w:link w:val="Heading1Char"/>
+    <w:uiPriority w:val="9"/>
+    <w:qFormat/>
+    <w:rsid w:val="00A10FD9"/>
+    <w:pPr>
+      <w:keepNext/>
+      <w:keepLines/>
+      <w:spacing w:after="120" w:before="360" w:line="240" w:lineRule="auto"/>
+      <w:jc w:val="left"/>
+      <w:outlineLvl w:val="0"/>
+    </w:pPr>
+    <w:rPr>
+      <w:rFonts w:ascii="Times New Roman" w:cs="Times New Roman" w:hAnsi="Times New Roman"/>
+      <w:b/>
+      <w:bCs/>
+      <w:color w:val="000000"/>
+      <w:sz w:val="28"/>
+      <w:szCs w:val="28"/>
+    </w:rPr>
+  </w:style>
+  <w:style w:styleId="Heading2" w:type="paragraph">
+    <w:name w:val="heading 2"/>
+    <w:basedOn w:val="Normal"/>
+    <w:next w:val="BodyText"/>
+    <w:link w:val="Heading2Char"/>
+    <w:uiPriority w:val="9"/>
+    <w:unhideWhenUsed/>
+    <w:qFormat/>
+    <w:rsid w:val="00A10FD9"/>
+    <w:pPr>
+      <w:keepNext/>
+      <w:keepLines/>
+      <w:spacing w:after="80" w:before="240" w:line="240" w:lineRule="auto"/>
+      <w:jc w:val="left"/>
+      <w:outlineLvl w:val="1"/>
+    </w:pPr>
+    <w:rPr>
+      <w:rFonts w:ascii="Times New Roman" w:cs="Times New Roman" w:hAnsi="Times New Roman"/>
+      <w:b/>
+      <w:bCs/>
+      <w:color w:val="000000"/>
       <w:sz w:val="26"/>
       <w:szCs w:val="26"/>
     </w:rPr>
   </w:style>
   <w:style w:styleId="Heading3" w:type="paragraph">
-    <w:name w:val="Heading 3"/>
+    <w:name w:val="heading 3"/>
     <w:basedOn w:val="Normal"/>
-    <w:next w:val="Normal"/>
-    <w:qFormat/>
-    <w:pPr>
-      <w:spacing w:after="100" w:before="200"/>
-    </w:pPr>
-    <w:rPr>
-      <w:rFonts w:ascii="Calibri Light" w:cs="Calibri Light" w:eastAsia="Calibri Light" w:hAnsi="Calibri Light"/>
+    <w:next w:val="BodyText"/>
+    <w:link w:val="Heading3Char"/>
+    <w:uiPriority w:val="9"/>
+    <w:unhideWhenUsed/>
+    <w:qFormat/>
+    <w:rsid w:val="00A10FD9"/>
+    <w:pPr>
+      <w:keepNext/>
+      <w:keepLines/>
+      <w:spacing w:after="60" w:before="200" w:line="240" w:lineRule="auto"/>
+      <w:jc w:val="left"/>
+      <w:outlineLvl w:val="2"/>
+    </w:pPr>
+    <w:rPr>
+      <w:rFonts w:ascii="Times New Roman" w:cs="Times New Roman" w:hAnsi="Times New Roman"/>
       <w:b/>
       <w:bCs/>
-      <w:color w:val="1F3864"/>
+      <w:color w:val="000000"/>
       <w:sz w:val="24"/>
       <w:szCs w:val="24"/>
     </w:rPr>
   </w:style>
   <w:style w:styleId="Heading4" w:type="paragraph">
-    <w:name w:val="Heading 4"/>
+    <w:name w:val="heading 4"/>
     <w:basedOn w:val="Normal"/>
-    <w:next w:val="Normal"/>
-    <w:qFormat/>
-    <w:rPr>
+    <w:next w:val="BodyText"/>
+    <w:link w:val="Heading4Char"/>
+    <w:uiPriority w:val="9"/>
+    <w:semiHidden/>
+    <w:unhideWhenUsed/>
+    <w:qFormat/>
+    <w:rsid w:val="00A10FD9"/>
+    <w:pPr>
+      <w:keepNext/>
+      <w:keepLines/>
+      <w:spacing w:after="40" w:before="80"/>
+      <w:outlineLvl w:val="3"/>
+    </w:pPr>
+    <w:rPr>
+      <w:rFonts w:cstheme="majorBidi" w:eastAsiaTheme="majorEastAsia"/>
       <w:i/>
       <w:iCs/>
-      <w:color w:val="2E74B5"/>
+      <w:color w:themeColor="accent1" w:themeShade="BF" w:val="0F4761"/>
     </w:rPr>
   </w:style>
   <w:style w:styleId="Heading5" w:type="paragraph">
-    <w:name w:val="Heading 5"/>
+    <w:name w:val="heading 5"/>
     <w:basedOn w:val="Normal"/>
-    <w:next w:val="Normal"/>
-    <w:qFormat/>
-    <w:rPr>
-      <w:color w:val="2E74B5"/>
+    <w:next w:val="BodyText"/>
+    <w:link w:val="Heading5Char"/>
+    <w:uiPriority w:val="9"/>
+    <w:semiHidden/>
+    <w:unhideWhenUsed/>
+    <w:qFormat/>
+    <w:rsid w:val="00A10FD9"/>
+    <w:pPr>
+      <w:keepNext/>
+      <w:keepLines/>
+      <w:spacing w:after="40" w:before="80"/>
+      <w:outlineLvl w:val="4"/>
+    </w:pPr>
+    <w:rPr>
+      <w:rFonts w:cstheme="majorBidi" w:eastAsiaTheme="majorEastAsia"/>
+      <w:color w:themeColor="accent1" w:themeShade="BF" w:val="0F4761"/>
     </w:rPr>
   </w:style>
   <w:style w:styleId="Heading6" w:type="paragraph">
-    <w:name w:val="Heading 6"/>
+    <w:name w:val="heading 6"/>
     <w:basedOn w:val="Normal"/>
-    <w:next w:val="Normal"/>
-    <w:qFormat/>
-    <w:rPr>
-      <w:color w:val="1F4D78"/>
-    </w:rPr>
-  </w:style>
-  <w:style w:styleId="Strong" w:type="paragraph">
-    <w:name w:val="Strong"/>
+    <w:next w:val="BodyText"/>
+    <w:link w:val="Heading6Char"/>
+    <w:uiPriority w:val="9"/>
+    <w:semiHidden/>
+    <w:unhideWhenUsed/>
+    <w:qFormat/>
+    <w:rsid w:val="00A10FD9"/>
+    <w:pPr>
+      <w:keepNext/>
+      <w:keepLines/>
+      <w:spacing w:after="0" w:before="40"/>
+      <w:outlineLvl w:val="5"/>
+    </w:pPr>
+    <w:rPr>
+      <w:rFonts w:cstheme="majorBidi" w:eastAsiaTheme="majorEastAsia"/>
+      <w:i/>
+      <w:iCs/>
+      <w:color w:themeColor="text1" w:themeTint="A6" w:val="595959"/>
+    </w:rPr>
+  </w:style>
+  <w:style w:styleId="Heading7" w:type="paragraph">
+    <w:name w:val="heading 7"/>
     <w:basedOn w:val="Normal"/>
-    <w:next w:val="Normal"/>
-    <w:qFormat/>
-    <w:rPr>
+    <w:next w:val="BodyText"/>
+    <w:link w:val="Heading7Char"/>
+    <w:uiPriority w:val="9"/>
+    <w:semiHidden/>
+    <w:unhideWhenUsed/>
+    <w:qFormat/>
+    <w:rsid w:val="00A10FD9"/>
+    <w:pPr>
+      <w:keepNext/>
+      <w:keepLines/>
+      <w:spacing w:after="0" w:before="40"/>
+      <w:outlineLvl w:val="6"/>
+    </w:pPr>
+    <w:rPr>
+      <w:rFonts w:cstheme="majorBidi" w:eastAsiaTheme="majorEastAsia"/>
+      <w:color w:themeColor="text1" w:themeTint="A6" w:val="595959"/>
+    </w:rPr>
+  </w:style>
+  <w:style w:styleId="Heading8" w:type="paragraph">
+    <w:name w:val="heading 8"/>
+    <w:basedOn w:val="Normal"/>
+    <w:next w:val="BodyText"/>
+    <w:link w:val="Heading8Char"/>
+    <w:uiPriority w:val="9"/>
+    <w:semiHidden/>
+    <w:unhideWhenUsed/>
+    <w:qFormat/>
+    <w:rsid w:val="00A10FD9"/>
+    <w:pPr>
+      <w:keepNext/>
+      <w:keepLines/>
+      <w:spacing w:after="0"/>
+      <w:outlineLvl w:val="7"/>
+    </w:pPr>
+    <w:rPr>
+      <w:rFonts w:cstheme="majorBidi" w:eastAsiaTheme="majorEastAsia"/>
+      <w:i/>
+      <w:iCs/>
+      <w:color w:themeColor="text1" w:themeTint="D8" w:val="272727"/>
+    </w:rPr>
+  </w:style>
+  <w:style w:styleId="Heading9" w:type="paragraph">
+    <w:name w:val="heading 9"/>
+    <w:basedOn w:val="Normal"/>
+    <w:next w:val="BodyText"/>
+    <w:link w:val="Heading9Char"/>
+    <w:uiPriority w:val="9"/>
+    <w:semiHidden/>
+    <w:unhideWhenUsed/>
+    <w:qFormat/>
+    <w:rsid w:val="00A10FD9"/>
+    <w:pPr>
+      <w:keepNext/>
+      <w:keepLines/>
+      <w:spacing w:after="0"/>
+      <w:outlineLvl w:val="8"/>
+    </w:pPr>
+    <w:rPr>
+      <w:rFonts w:cstheme="majorBidi" w:eastAsiaTheme="majorEastAsia"/>
+      <w:color w:themeColor="text1" w:themeTint="D8" w:val="272727"/>
+    </w:rPr>
+  </w:style>
+  <w:style w:customStyle="1" w:styleId="Heading1Char" w:type="character">
+    <w:name w:val="Heading 1 Char"/>
+    <w:basedOn w:val="DefaultParagraphFont"/>
+    <w:link w:val="Heading1"/>
+    <w:uiPriority w:val="9"/>
+    <w:rsid w:val="00A10FD9"/>
+    <w:rPr>
+      <w:rFonts w:ascii="Times New Roman" w:cs="Times New Roman" w:hAnsi="Times New Roman"/>
       <w:b/>
       <w:bCs/>
-    </w:rPr>
-  </w:style>
-  <w:style w:styleId="ListParagraph" w:type="paragraph">
-    <w:name w:val="List Paragraph"/>
+      <w:color w:val="000000"/>
+      <w:sz w:val="28"/>
+      <w:szCs w:val="28"/>
+    </w:rPr>
+  </w:style>
+  <w:style w:customStyle="1" w:styleId="Heading2Char" w:type="character">
+    <w:name w:val="Heading 2 Char"/>
+    <w:basedOn w:val="DefaultParagraphFont"/>
+    <w:link w:val="Heading2"/>
+    <w:uiPriority w:val="9"/>
+    <w:rsid w:val="00A10FD9"/>
+    <w:rPr>
+      <w:rFonts w:ascii="Times New Roman" w:cs="Times New Roman" w:hAnsi="Times New Roman"/>
+      <w:b/>
+      <w:bCs/>
+      <w:color w:val="000000"/>
+      <w:sz w:val="26"/>
+      <w:szCs w:val="26"/>
+    </w:rPr>
+  </w:style>
+  <w:style w:customStyle="1" w:styleId="Heading3Char" w:type="character">
+    <w:name w:val="Heading 3 Char"/>
+    <w:basedOn w:val="DefaultParagraphFont"/>
+    <w:link w:val="Heading3"/>
+    <w:uiPriority w:val="9"/>
+    <w:rsid w:val="00A10FD9"/>
+    <w:rPr>
+      <w:rFonts w:ascii="Times New Roman" w:cs="Times New Roman" w:hAnsi="Times New Roman"/>
+      <w:b/>
+      <w:bCs/>
+      <w:color w:val="000000"/>
+      <w:sz w:val="24"/>
+      <w:szCs w:val="24"/>
+    </w:rPr>
+  </w:style>
+  <w:style w:customStyle="1" w:styleId="Heading4Char" w:type="character">
+    <w:name w:val="Heading 4 Char"/>
+    <w:basedOn w:val="DefaultParagraphFont"/>
+    <w:link w:val="Heading4"/>
+    <w:uiPriority w:val="9"/>
+    <w:semiHidden/>
+    <w:rsid w:val="00A10FD9"/>
+    <w:rPr>
+      <w:rFonts w:cstheme="majorBidi" w:eastAsiaTheme="majorEastAsia"/>
+      <w:i/>
+      <w:iCs/>
+      <w:color w:themeColor="accent1" w:themeShade="BF" w:val="0F4761"/>
+    </w:rPr>
+  </w:style>
+  <w:style w:customStyle="1" w:styleId="Heading5Char" w:type="character">
+    <w:name w:val="Heading 5 Char"/>
+    <w:basedOn w:val="DefaultParagraphFont"/>
+    <w:link w:val="Heading5"/>
+    <w:uiPriority w:val="9"/>
+    <w:semiHidden/>
+    <w:rsid w:val="00A10FD9"/>
+    <w:rPr>
+      <w:rFonts w:cstheme="majorBidi" w:eastAsiaTheme="majorEastAsia"/>
+      <w:color w:themeColor="accent1" w:themeShade="BF" w:val="0F4761"/>
+    </w:rPr>
+  </w:style>
+  <w:style w:customStyle="1" w:styleId="Heading6Char" w:type="character">
+    <w:name w:val="Heading 6 Char"/>
+    <w:basedOn w:val="DefaultParagraphFont"/>
+    <w:link w:val="Heading6"/>
+    <w:uiPriority w:val="9"/>
+    <w:semiHidden/>
+    <w:rsid w:val="00A10FD9"/>
+    <w:rPr>
+      <w:rFonts w:cstheme="majorBidi" w:eastAsiaTheme="majorEastAsia"/>
+      <w:i/>
+      <w:iCs/>
+      <w:color w:themeColor="text1" w:themeTint="A6" w:val="595959"/>
+    </w:rPr>
+  </w:style>
+  <w:style w:customStyle="1" w:styleId="Heading7Char" w:type="character">
+    <w:name w:val="Heading 7 Char"/>
+    <w:basedOn w:val="DefaultParagraphFont"/>
+    <w:link w:val="Heading7"/>
+    <w:uiPriority w:val="9"/>
+    <w:semiHidden/>
+    <w:rsid w:val="00A10FD9"/>
+    <w:rPr>
+      <w:rFonts w:cstheme="majorBidi" w:eastAsiaTheme="majorEastAsia"/>
+      <w:color w:themeColor="text1" w:themeTint="A6" w:val="595959"/>
+    </w:rPr>
+  </w:style>
+  <w:style w:customStyle="1" w:styleId="Heading8Char" w:type="character">
+    <w:name w:val="Heading 8 Char"/>
+    <w:basedOn w:val="DefaultParagraphFont"/>
+    <w:link w:val="Heading8"/>
+    <w:uiPriority w:val="9"/>
+    <w:semiHidden/>
+    <w:rsid w:val="00A10FD9"/>
+    <w:rPr>
+      <w:rFonts w:cstheme="majorBidi" w:eastAsiaTheme="majorEastAsia"/>
+      <w:i/>
+      <w:iCs/>
+      <w:color w:themeColor="text1" w:themeTint="D8" w:val="272727"/>
+    </w:rPr>
+  </w:style>
+  <w:style w:customStyle="1" w:styleId="Heading9Char" w:type="character">
+    <w:name w:val="Heading 9 Char"/>
+    <w:basedOn w:val="DefaultParagraphFont"/>
+    <w:link w:val="Heading9"/>
+    <w:uiPriority w:val="9"/>
+    <w:semiHidden/>
+    <w:rsid w:val="00A10FD9"/>
+    <w:rPr>
+      <w:rFonts w:cstheme="majorBidi" w:eastAsiaTheme="majorEastAsia"/>
+      <w:color w:themeColor="text1" w:themeTint="D8" w:val="272727"/>
+    </w:rPr>
+  </w:style>
+  <w:style w:styleId="BlockText" w:type="paragraph">
+    <w:name w:val="Block Text"/>
+    <w:basedOn w:val="BodyText"/>
+    <w:next w:val="BodyText"/>
+    <w:uiPriority w:val="9"/>
+    <w:unhideWhenUsed/>
+    <w:qFormat/>
+    <w:pPr>
+      <w:spacing w:after="100" w:before="100"/>
+      <w:ind w:firstLine="0" w:left="480" w:right="480"/>
+    </w:pPr>
+  </w:style>
+  <w:style w:styleId="FootnoteText" w:type="paragraph">
+    <w:name w:val="Footnote Text"/>
     <w:basedOn w:val="Normal"/>
-    <w:qFormat/>
+    <w:next w:val="FootnoteText"/>
+    <w:uiPriority w:val="9"/>
+    <w:unhideWhenUsed/>
+    <w:qFormat/>
+  </w:style>
+  <w:style w:styleId="FootnoteBlockText" w:type="paragraph">
+    <w:name w:val="Footnote Block Text"/>
+    <w:basedOn w:val="FootnoteText"/>
+    <w:next w:val="FootnoteText"/>
+    <w:uiPriority w:val="9"/>
+    <w:unhideWhenUsed/>
+    <w:qFormat/>
+    <w:pPr>
+      <w:spacing w:after="100" w:before="100"/>
+      <w:ind w:firstLine="0" w:left="480" w:right="480"/>
+    </w:pPr>
+  </w:style>
+  <w:style w:default="1" w:styleId="DefaultParagraphFont" w:type="character">
+    <w:name w:val="Default Paragraph Font"/>
+    <w:semiHidden/>
+    <w:unhideWhenUsed/>
+  </w:style>
+  <w:style w:default="1" w:styleId="Table" w:type="table">
+    <w:name w:val="Table"/>
+    <w:basedOn w:val="TableNormal"/>
+    <w:semiHidden/>
+    <w:unhideWhenUsed/>
+    <w:qFormat/>
+    <w:tblPr>
+      <w:tblInd w:type="dxa" w:w="0"/>
+      <w:tblCellMar>
+        <w:top w:type="dxa" w:w="0"/>
+        <w:left w:type="dxa" w:w="108"/>
+        <w:bottom w:type="dxa" w:w="0"/>
+        <w:right w:type="dxa" w:w="108"/>
+      </w:tblCellMar>
+    </w:tblPr>
+    <w:tblStylePr w:type="firstRow">
+      <w:tcPr>
+        <w:tcBorders>
+          <w:bottom w:val="single"/>
+        </w:tcBorders>
+        <w:vAlign w:val="bottom"/>
+      </w:tcPr>
+    </w:tblStylePr>
+  </w:style>
+  <w:style w:customStyle="1" w:styleId="DefinitionTerm" w:type="paragraph">
+    <w:name w:val="Definition Term"/>
+    <w:basedOn w:val="Normal"/>
+    <w:next w:val="Definition"/>
+    <w:pPr>
+      <w:keepNext/>
+      <w:keepLines/>
+      <w:spacing w:after="0"/>
+    </w:pPr>
+    <w:rPr>
+      <w:b/>
+    </w:rPr>
+  </w:style>
+  <w:style w:customStyle="1" w:styleId="Definition" w:type="paragraph">
+    <w:name w:val="Definition"/>
+    <w:basedOn w:val="Normal"/>
+  </w:style>
+  <w:style w:styleId="Caption" w:type="paragraph">
+    <w:name w:val="Caption"/>
+    <w:basedOn w:val="Normal"/>
+    <w:link w:val="BodyTextChar"/>
+    <w:pPr>
+      <w:spacing w:after="120" w:before="0"/>
+    </w:pPr>
+    <w:rPr>
+      <w:i/>
+    </w:rPr>
+  </w:style>
+  <w:style w:customStyle="1" w:styleId="TableCaption" w:type="paragraph">
+    <w:name w:val="Table Caption"/>
+    <w:basedOn w:val="Caption"/>
+    <w:pPr>
+      <w:keepNext/>
+    </w:pPr>
+  </w:style>
+  <w:style w:customStyle="1" w:styleId="ImageCaption" w:type="paragraph">
+    <w:name w:val="Image Caption"/>
+    <w:basedOn w:val="Caption"/>
+  </w:style>
+  <w:style w:customStyle="1" w:styleId="Figure" w:type="paragraph">
+    <w:name w:val="Figure"/>
+    <w:basedOn w:val="Normal"/>
+  </w:style>
+  <w:style w:customStyle="1" w:styleId="CaptionedFigure" w:type="paragraph">
+    <w:name w:val="Captioned Figure"/>
+    <w:basedOn w:val="Figure"/>
+    <w:pPr>
+      <w:keepNext/>
+    </w:pPr>
+  </w:style>
+  <w:style w:customStyle="1" w:styleId="BodyTextChar" w:type="character">
+    <w:name w:val="Body Text Char"/>
+    <w:basedOn w:val="DefaultParagraphFont"/>
+    <w:link w:val="BodyText"/>
+  </w:style>
+  <w:style w:customStyle="1" w:styleId="VerbatimChar" w:type="character">
+    <w:name w:val="Verbatim Char"/>
+    <w:basedOn w:val="BodyTextChar"/>
+    <w:rPr>
+      <w:rFonts w:ascii="Consolas" w:hAnsi="Consolas"/>
+      <w:sz w:val="22"/>
+    </w:rPr>
+  </w:style>
+  <w:style w:customStyle="1" w:styleId="SectionNumber" w:type="character">
+    <w:name w:val="Section Number"/>
+    <w:basedOn w:val="BodyTextChar"/>
+  </w:style>
+  <w:style w:styleId="FootnoteReference" w:type="character">
+    <w:name w:val="Footnote Reference"/>
+    <w:basedOn w:val="BodyTextChar"/>
+    <w:rPr>
+      <w:vertAlign w:val="superscript"/>
+    </w:rPr>
   </w:style>
   <w:style w:styleId="Hyperlink" w:type="character">
     <w:name w:val="Hyperlink"/>
-    <w:basedOn w:val="DefaultParagraphFont"/>
-    <w:uiPriority w:val="99"/>
+    <w:basedOn w:val="BodyTextChar"/>
+    <w:rPr>
+      <w:color w:themeColor="accent1" w:val="4F81BD"/>
+    </w:rPr>
+  </w:style>
+  <w:style w:styleId="TOCHeading" w:type="paragraph">
+    <w:name w:val="TOC Heading"/>
+    <w:basedOn w:val="Heading1"/>
+    <w:next w:val="BodyText"/>
+    <w:uiPriority w:val="39"/>
     <w:unhideWhenUsed/>
-    <w:rPr>
-      <w:color w:val="0563C1"/>
-      <w:u w:val="single"/>
-    </w:rPr>
-  </w:style>
-  <w:style w:styleId="FootnoteReference" w:type="character">
-    <w:name w:val="footnote reference"/>
-    <w:basedOn w:val="DefaultParagraphFont"/>
-    <w:uiPriority w:val="99"/>
-    <w:semiHidden/>
-    <w:unhideWhenUsed/>
-    <w:rPr>
-      <w:vertAlign w:val="superscript"/>
-    </w:rPr>
-  </w:style>
-  <w:style w:styleId="FootnoteText" w:type="paragraph">
-    <w:name w:val="footnote text"/>
-    <w:basedOn w:val="Normal"/>
-    <w:link w:val="FootnoteTextChar"/>
-    <w:uiPriority w:val="99"/>
-    <w:semiHidden/>
-    <w:unhideWhenUsed/>
-    <w:pPr>
-      <w:spacing w:after="0" w:line="240" w:lineRule="auto"/>
-    </w:pPr>
-    <w:rPr>
-      <w:sz w:val="20"/>
-      <w:szCs w:val="20"/>
-    </w:rPr>
-  </w:style>
-  <w:style w:styleId="FootnoteTextChar" w:type="character">
-    <w:name w:val="Footnote Text Char"/>
-    <w:basedOn w:val="DefaultParagraphFont"/>
-    <w:link w:val="FootnoteText"/>
-    <w:uiPriority w:val="99"/>
-    <w:semiHidden/>
-    <w:unhideWhenUsed/>
-    <w:rPr>
-      <w:sz w:val="20"/>
-      <w:szCs w:val="20"/>
-    </w:rPr>
-  </w:style>
-  <w:style w:styleId="EndnoteReference" w:type="character">
-    <w:name w:val="endnote reference"/>
-    <w:basedOn w:val="DefaultParagraphFont"/>
-    <w:uiPriority w:val="99"/>
-    <w:semiHidden/>
-    <w:unhideWhenUsed/>
-    <w:rPr>
-      <w:vertAlign w:val="superscript"/>
-    </w:rPr>
-  </w:style>
-  <w:style w:styleId="EndnoteText" w:type="paragraph">
-    <w:name w:val="endnote text"/>
-    <w:basedOn w:val="Normal"/>
-    <w:link w:val="EndnoteTextChar"/>
-    <w:uiPriority w:val="99"/>
-    <w:semiHidden/>
-    <w:unhideWhenUsed/>
-    <w:pPr>
-      <w:spacing w:after="0" w:line="240" w:lineRule="auto"/>
-    </w:pPr>
-    <w:rPr>
-      <w:sz w:val="20"/>
-      <w:szCs w:val="20"/>
-    </w:rPr>
-  </w:style>
-  <w:style w:styleId="EndnoteTextChar" w:type="character">
-    <w:name w:val="Endnote Text Char"/>
-    <w:basedOn w:val="DefaultParagraphFont"/>
-    <w:link w:val="EndnoteText"/>
-    <w:uiPriority w:val="99"/>
-    <w:semiHidden/>
-    <w:unhideWhenUsed/>
-    <w:rPr>
-      <w:sz w:val="20"/>
-      <w:szCs w:val="20"/>
-    </w:rPr>
-  </w:style>
-  <w:style w:customStyle="1" w:styleId="SourceCode" w:type="paragraph">
-    <w:name w:val="Source Code"/>
-    <w:basedOn w:val="Normal"/>
-    <w:link w:val="VerbatimChar"/>
-    <w:pPr>
-      <w:wordWrap w:val="off"/>
-    </w:pPr>
-  </w:style>
-  <w:style w:customStyle="1" w:styleId="KeywordTok" w:type="character">
-    <w:name w:val="KeywordTok"/>
-    <w:basedOn w:val="VerbatimChar"/>
-    <w:rPr>
-      <w:b/>
-      <w:color w:val="007020"/>
-    </w:rPr>
-  </w:style>
-  <w:style w:customStyle="1" w:styleId="DataTypeTok" w:type="character">
-    <w:name w:val="DataTypeTok"/>
-    <w:basedOn w:val="VerbatimChar"/>
-    <w:rPr>
-      <w:color w:val="902000"/>
-    </w:rPr>
-  </w:style>
-  <w:style w:customStyle="1" w:styleId="DecValTok" w:type="character">
-    <w:name w:val="DecValTok"/>
-    <w:basedOn w:val="VerbatimChar"/>
-    <w:rPr>
-      <w:color w:val="40a070"/>
-    </w:rPr>
-  </w:style>
-  <w:style w:customStyle="1" w:styleId="BaseNTok" w:type="character">
-    <w:name w:val="BaseNTok"/>
-    <w:basedOn w:val="VerbatimChar"/>
-    <w:rPr>
-      <w:color w:val="40a070"/>
-    </w:rPr>
-  </w:style>
-  <w:style w:customStyle="1" w:styleId="FloatTok" w:type="character">
-    <w:name w:val="FloatTok"/>
-    <w:basedOn w:val="VerbatimChar"/>
-    <w:rPr>
-      <w:color w:val="40a070"/>
-    </w:rPr>
-  </w:style>
-  <w:style w:customStyle="1" w:styleId="ConstantTok" w:type="character">
-    <w:name w:val="ConstantTok"/>
-    <w:basedOn w:val="VerbatimChar"/>
-    <w:rPr>
-      <w:color w:val="880000"/>
-    </w:rPr>
-  </w:style>
-  <w:style w:customStyle="1" w:styleId="CharTok" w:type="character">
-    <w:name w:val="CharTok"/>
-    <w:basedOn w:val="VerbatimChar"/>
-    <w:rPr>
-      <w:color w:val="4070a0"/>
-    </w:rPr>
-  </w:style>
-  <w:style w:customStyle="1" w:styleId="SpecialCharTok" w:type="character">
-    <w:name w:val="SpecialCharTok"/>
-    <w:basedOn w:val="VerbatimChar"/>
-    <w:rPr>
-      <w:color w:val="4070a0"/>
-    </w:rPr>
-  </w:style>
-  <w:style w:customStyle="1" w:styleId="StringTok" w:type="character">
-    <w:name w:val="StringTok"/>
-    <w:basedOn w:val="VerbatimChar"/>
-    <w:rPr>
-      <w:color w:val="4070a0"/>
-    </w:rPr>
-  </w:style>
-  <w:style w:customStyle="1" w:styleId="VerbatimStringTok" w:type="character">
-    <w:name w:val="VerbatimStringTok"/>
-    <w:basedOn w:val="VerbatimChar"/>
-    <w:rPr>
-      <w:color w:val="4070a0"/>
-    </w:rPr>
-  </w:style>
-  <w:style w:customStyle="1" w:styleId="SpecialStringTok" w:type="character">
-    <w:name w:val="SpecialStringTok"/>
-    <w:basedOn w:val="VerbatimChar"/>
-    <w:rPr>
-      <w:color w:val="bb6688"/>
-    </w:rPr>
-  </w:style>
-  <w:style w:customStyle="1" w:styleId="ImportTok" w:type="character">
-    <w:name w:val="ImportTok"/>
-    <w:basedOn w:val="VerbatimChar"/>
-    <w:rPr>
-      <w:b/>
-      <w:color w:val="008000"/>
-    </w:rPr>
-  </w:style>
-  <w:style w:customStyle="1" w:styleId="CommentTok" w:type="character">
-    <w:name w:val="CommentTok"/>
-    <w:basedOn w:val="VerbatimChar"/>
-    <w:rPr>
-      <w:i/>
-      <w:color w:val="60a0b0"/>
-    </w:rPr>
-  </w:style>
-  <w:style w:customStyle="1" w:styleId="DocumentationTok" w:type="character">
-    <w:name w:val="DocumentationTok"/>
-    <w:basedOn w:val="VerbatimChar"/>
-    <w:rPr>
-      <w:i/>
-      <w:color w:val="ba2121"/>
-    </w:rPr>
-  </w:style>
-  <w:style w:customStyle="1" w:styleId="AnnotationTok" w:type="character">
-    <w:name w:val="AnnotationTok"/>
-    <w:basedOn w:val="VerbatimChar"/>
-    <w:rPr>
-      <w:b/>
-      <w:i/>
-      <w:color w:val="60a0b0"/>
-    </w:rPr>
-  </w:style>
-  <w:style w:customStyle="1" w:styleId="CommentVarTok" w:type="character">
-    <w:name w:val="CommentVarTok"/>
-    <w:basedOn w:val="VerbatimChar"/>
-    <w:rPr>
-      <w:b/>
-      <w:i/>
-      <w:color w:val="60a0b0"/>
-    </w:rPr>
-  </w:style>
-  <w:style w:customStyle="1" w:styleId="OtherTok" w:type="character">
-    <w:name w:val="OtherTok"/>
-    <w:basedOn w:val="VerbatimChar"/>
-    <w:rPr>
-      <w:color w:val="007020"/>
-    </w:rPr>
-  </w:style>
-  <w:style w:customStyle="1" w:styleId="FunctionTok" w:type="character">
-    <w:name w:val="FunctionTok"/>
-    <w:basedOn w:val="VerbatimChar"/>
-    <w:rPr>
-      <w:color w:val="06287e"/>
-    </w:rPr>
-  </w:style>
-  <w:style w:customStyle="1" w:styleId="VariableTok" w:type="character">
-    <w:name w:val="VariableTok"/>
-    <w:basedOn w:val="VerbatimChar"/>
-    <w:rPr>
-      <w:color w:val="19177c"/>
-    </w:rPr>
-  </w:style>
-  <w:style w:customStyle="1" w:styleId="ControlFlowTok" w:type="character">
-    <w:name w:val="ControlFlowTok"/>
-    <w:basedOn w:val="VerbatimChar"/>
-    <w:rPr>
-      <w:b/>
-      <w:color w:val="007020"/>
-    </w:rPr>
-  </w:style>
-  <w:style w:customStyle="1" w:styleId="OperatorTok" w:type="character">
-    <w:name w:val="OperatorTok"/>
-    <w:basedOn w:val="VerbatimChar"/>
-    <w:rPr>
-      <w:color w:val="666666"/>
-    </w:rPr>
-  </w:style>
-  <w:style w:customStyle="1" w:styleId="BuiltInTok" w:type="character">
-    <w:name w:val="BuiltInTok"/>
-    <w:basedOn w:val="VerbatimChar"/>
-    <w:rPr>
-      <w:color w:val="008000"/>
-    </w:rPr>
-  </w:style>
-  <w:style w:customStyle="1" w:styleId="ExtensionTok" w:type="character">
-    <w:name w:val="ExtensionTok"/>
-    <w:basedOn w:val="VerbatimChar"/>
-    <w:rPr/>
-  </w:style>
-  <w:style w:customStyle="1" w:styleId="PreprocessorTok" w:type="character">
-    <w:name w:val="PreprocessorTok"/>
-    <w:basedOn w:val="VerbatimChar"/>
-    <w:rPr>
-      <w:color w:val="bc7a00"/>
-    </w:rPr>
-  </w:style>
-  <w:style w:customStyle="1" w:styleId="AttributeTok" w:type="character">
-    <w:name w:val="AttributeTok"/>
-    <w:basedOn w:val="VerbatimChar"/>
-    <w:rPr>
-      <w:color w:val="7d9029"/>
-    </w:rPr>
-  </w:style>
-  <w:style w:customStyle="1" w:styleId="RegionMarkerTok" w:type="character">
-    <w:name w:val="RegionMarkerTok"/>
-    <w:basedOn w:val="VerbatimChar"/>
-    <w:rPr/>
-  </w:style>
-  <w:style w:customStyle="1" w:styleId="InformationTok" w:type="character">
-    <w:name w:val="InformationTok"/>
-    <w:basedOn w:val="VerbatimChar"/>
-    <w:rPr>
-      <w:b/>
-      <w:i/>
-      <w:color w:val="60a0b0"/>
-    </w:rPr>
-  </w:style>
-  <w:style w:customStyle="1" w:styleId="WarningTok" w:type="character">
-    <w:name w:val="WarningTok"/>
-    <w:basedOn w:val="VerbatimChar"/>
-    <w:rPr>
-      <w:b/>
-      <w:i/>
-      <w:color w:val="60a0b0"/>
-    </w:rPr>
-  </w:style>
-  <w:style w:customStyle="1" w:styleId="AlertTok" w:type="character">
-    <w:name w:val="AlertTok"/>
-    <w:basedOn w:val="VerbatimChar"/>
-    <w:rPr>
-      <w:b/>
-      <w:color w:val="ff0000"/>
-    </w:rPr>
-  </w:style>
-  <w:style w:customStyle="1" w:styleId="ErrorTok" w:type="character">
-    <w:name w:val="ErrorTok"/>
-    <w:basedOn w:val="VerbatimChar"/>
-    <w:rPr>
-      <w:b/>
-      <w:color w:val="ff0000"/>
-    </w:rPr>
-  </w:style>
-  <w:style w:customStyle="1" w:styleId="NormalTok" w:type="character">
-    <w:name w:val="NormalTok"/>
-    <w:basedOn w:val="VerbatimChar"/>
-    <w:rPr/>
-  </w:style>
-  <w:style w:customStyle="1" w:styleId="SourceCode" w:type="paragraph">
-    <w:name w:val="Source Code"/>
-    <w:basedOn w:val="Normal"/>
-    <w:link w:val="VerbatimChar"/>
-    <w:pPr>
-      <w:wordWrap w:val="off"/>
-    </w:pPr>
-  </w:style>
-  <w:style w:customStyle="1" w:styleId="KeywordTok" w:type="character">
-    <w:name w:val="KeywordTok"/>
-    <w:basedOn w:val="VerbatimChar"/>
-    <w:rPr>
-      <w:b/>
-      <w:color w:val="007020"/>
-    </w:rPr>
-  </w:style>
-  <w:style w:customStyle="1" w:styleId="DataTypeTok" w:type="character">
-    <w:name w:val="DataTypeTok"/>
-    <w:basedOn w:val="VerbatimChar"/>
-    <w:rPr>
-      <w:color w:val="902000"/>
-    </w:rPr>
-  </w:style>
-  <w:style w:customStyle="1" w:styleId="DecValTok" w:type="character">
-    <w:name w:val="DecValTok"/>
-    <w:basedOn w:val="VerbatimChar"/>
-    <w:rPr>
-      <w:color w:val="40a070"/>
-    </w:rPr>
-  </w:style>
-  <w:style w:customStyle="1" w:styleId="BaseNTok" w:type="character">
-    <w:name w:val="BaseNTok"/>
-    <w:basedOn w:val="VerbatimChar"/>
-    <w:rPr>
-      <w:color w:val="40a070"/>
-    </w:rPr>
-  </w:style>
-  <w:style w:customStyle="1" w:styleId="FloatTok" w:type="character">
-    <w:name w:val="FloatTok"/>
-    <w:basedOn w:val="VerbatimChar"/>
-    <w:rPr>
-      <w:color w:val="40a070"/>
-    </w:rPr>
-  </w:style>
-  <w:style w:customStyle="1" w:styleId="ConstantTok" w:type="character">
-    <w:name w:val="ConstantTok"/>
-    <w:basedOn w:val="VerbatimChar"/>
-    <w:rPr>
-      <w:color w:val="880000"/>
-    </w:rPr>
-  </w:style>
-  <w:style w:customStyle="1" w:styleId="CharTok" w:type="character">
-    <w:name w:val="CharTok"/>
-    <w:basedOn w:val="VerbatimChar"/>
-    <w:rPr>
-      <w:color w:val="4070a0"/>
-    </w:rPr>
-  </w:style>
-  <w:style w:customStyle="1" w:styleId="SpecialCharTok" w:type="character">
-    <w:name w:val="SpecialCharTok"/>
-    <w:basedOn w:val="VerbatimChar"/>
-    <w:rPr>
-      <w:color w:val="4070a0"/>
-    </w:rPr>
-  </w:style>
-  <w:style w:customStyle="1" w:styleId="StringTok" w:type="character">
-    <w:name w:val="StringTok"/>
-    <w:basedOn w:val="VerbatimChar"/>
-    <w:rPr>
-      <w:color w:val="4070a0"/>
-    </w:rPr>
-  </w:style>
-  <w:style w:customStyle="1" w:styleId="VerbatimStringTok" w:type="character">
-    <w:name w:val="VerbatimStringTok"/>
-    <w:basedOn w:val="VerbatimChar"/>
-    <w:rPr>
-      <w:color w:val="4070a0"/>
-    </w:rPr>
-  </w:style>
-  <w:style w:customStyle="1" w:styleId="SpecialStringTok" w:type="character">
-    <w:name w:val="SpecialStringTok"/>
-    <w:basedOn w:val="VerbatimChar"/>
-    <w:rPr>
-      <w:color w:val="bb6688"/>
-    </w:rPr>
-  </w:style>
-  <w:style w:customStyle="1" w:styleId="ImportTok" w:type="character">
-    <w:name w:val="ImportTok"/>
-    <w:basedOn w:val="VerbatimChar"/>
-    <w:rPr>
-      <w:b/>
-      <w:color w:val="008000"/>
-    </w:rPr>
-  </w:style>
-  <w:style w:customStyle="1" w:styleId="CommentTok" w:type="character">
-    <w:name w:val="CommentTok"/>
-    <w:basedOn w:val="VerbatimChar"/>
-    <w:rPr>
-      <w:i/>
-      <w:color w:val="60a0b0"/>
-    </w:rPr>
-  </w:style>
-  <w:style w:customStyle="1" w:styleId="DocumentationTok" w:type="character">
-    <w:name w:val="DocumentationTok"/>
-    <w:basedOn w:val="VerbatimChar"/>
-    <w:rPr>
-      <w:i/>
-      <w:color w:val="ba2121"/>
-    </w:rPr>
-  </w:style>
-  <w:style w:customStyle="1" w:styleId="AnnotationTok" w:type="character">
-    <w:name w:val="AnnotationTok"/>
-    <w:basedOn w:val="VerbatimChar"/>
-    <w:rPr>
-      <w:b/>
-      <w:i/>
-      <w:color w:val="60a0b0"/>
-    </w:rPr>
-  </w:style>
-  <w:style w:customStyle="1" w:styleId="CommentVarTok" w:type="character">
-    <w:name w:val="CommentVarTok"/>
-    <w:basedOn w:val="VerbatimChar"/>
-    <w:rPr>
-      <w:b/>
-      <w:i/>
-      <w:color w:val="60a0b0"/>
-    </w:rPr>
-  </w:style>
-  <w:style w:customStyle="1" w:styleId="OtherTok" w:type="character">
-    <w:name w:val="OtherTok"/>
-    <w:basedOn w:val="VerbatimChar"/>
-    <w:rPr>
-      <w:color w:val="007020"/>
-    </w:rPr>
-  </w:style>
-  <w:style w:customStyle="1" w:styleId="FunctionTok" w:type="character">
-    <w:name w:val="FunctionTok"/>
-    <w:basedOn w:val="VerbatimChar"/>
-    <w:rPr>
-      <w:color w:val="06287e"/>
-    </w:rPr>
-  </w:style>
-  <w:style w:customStyle="1" w:styleId="VariableTok" w:type="character">
-    <w:name w:val="VariableTok"/>
-    <w:basedOn w:val="VerbatimChar"/>
-    <w:rPr>
-      <w:color w:val="19177c"/>
-    </w:rPr>
-  </w:style>
-  <w:style w:customStyle="1" w:styleId="ControlFlowTok" w:type="character">
-    <w:name w:val="ControlFlowTok"/>
-    <w:basedOn w:val="VerbatimChar"/>
-    <w:rPr>
-      <w:b/>
-      <w:color w:val="007020"/>
-    </w:rPr>
-  </w:style>
-  <w:style w:customStyle="1" w:styleId="OperatorTok" w:type="character">
-    <w:name w:val="OperatorTok"/>
-    <w:basedOn w:val="VerbatimChar"/>
-    <w:rPr>
-      <w:color w:val="666666"/>
-    </w:rPr>
-  </w:style>
-  <w:style w:customStyle="1" w:styleId="BuiltInTok" w:type="character">
-    <w:name w:val="BuiltInTok"/>
-    <w:basedOn w:val="VerbatimChar"/>
-    <w:rPr>
-      <w:color w:val="008000"/>
-    </w:rPr>
-  </w:style>
-  <w:style w:customStyle="1" w:styleId="ExtensionTok" w:type="character">
-    <w:name w:val="ExtensionTok"/>
-    <w:basedOn w:val="VerbatimChar"/>
-    <w:rPr/>
-  </w:style>
-  <w:style w:customStyle="1" w:styleId="PreprocessorTok" w:type="character">
-    <w:name w:val="PreprocessorTok"/>
-    <w:basedOn w:val="VerbatimChar"/>
-    <w:rPr>
-      <w:color w:val="bc7a00"/>
-    </w:rPr>
-  </w:style>
-  <w:style w:customStyle="1" w:styleId="AttributeTok" w:type="character">
-    <w:name w:val="AttributeTok"/>
-    <w:basedOn w:val="VerbatimChar"/>
-    <w:rPr>
-      <w:color w:val="7d9029"/>
-    </w:rPr>
-  </w:style>
-  <w:style w:customStyle="1" w:styleId="RegionMarkerTok" w:type="character">
-    <w:name w:val="RegionMarkerTok"/>
-    <w:basedOn w:val="VerbatimChar"/>
-    <w:rPr/>
-  </w:style>
-  <w:style w:customStyle="1" w:styleId="InformationTok" w:type="character">
-    <w:name w:val="InformationTok"/>
-    <w:basedOn w:val="VerbatimChar"/>
-    <w:rPr>
-      <w:b/>
-      <w:i/>
-      <w:color w:val="60a0b0"/>
-    </w:rPr>
-  </w:style>
-  <w:style w:customStyle="1" w:styleId="WarningTok" w:type="character">
-    <w:name w:val="WarningTok"/>
-    <w:basedOn w:val="VerbatimChar"/>
-    <w:rPr>
-      <w:b/>
-      <w:i/>
-      <w:color w:val="60a0b0"/>
-    </w:rPr>
-  </w:style>
-  <w:style w:customStyle="1" w:styleId="AlertTok" w:type="character">
-    <w:name w:val="AlertTok"/>
-    <w:basedOn w:val="VerbatimChar"/>
-    <w:rPr>
-      <w:b/>
-      <w:color w:val="ff0000"/>
-    </w:rPr>
-  </w:style>
-  <w:style w:customStyle="1" w:styleId="ErrorTok" w:type="character">
-    <w:name w:val="ErrorTok"/>
-    <w:basedOn w:val="VerbatimChar"/>
-    <w:rPr>
-      <w:b/>
-      <w:color w:val="ff0000"/>
-    </w:rPr>
-  </w:style>
-  <w:style w:customStyle="1" w:styleId="NormalTok" w:type="character">
-    <w:name w:val="NormalTok"/>
-    <w:basedOn w:val="VerbatimChar"/>
-    <w:rPr/>
-  </w:style>
-  <w:style w:customStyle="1" w:styleId="SourceCode" w:type="paragraph">
-    <w:name w:val="Source Code"/>
-    <w:basedOn w:val="Normal"/>
-    <w:link w:val="VerbatimChar"/>
-    <w:pPr>
-      <w:wordWrap w:val="off"/>
-    </w:pPr>
-  </w:style>
-  <w:style w:customStyle="1" w:styleId="KeywordTok" w:type="character">
-    <w:name w:val="KeywordTok"/>
-    <w:basedOn w:val="VerbatimChar"/>
-    <w:rPr>
-      <w:b/>
-      <w:color w:val="007020"/>
-    </w:rPr>
-  </w:style>
-  <w:style w:customStyle="1" w:styleId="DataTypeTok" w:type="character">
-    <w:name w:val="DataTypeTok"/>
-    <w:basedOn w:val="VerbatimChar"/>
-    <w:rPr>
-      <w:color w:val="902000"/>
-    </w:rPr>
-  </w:style>
-  <w:style w:customStyle="1" w:styleId="DecValTok" w:type="character">
-    <w:name w:val="DecValTok"/>
-    <w:basedOn w:val="VerbatimChar"/>
-    <w:rPr>
-      <w:color w:val="40a070"/>
-    </w:rPr>
-  </w:style>
-  <w:style w:customStyle="1" w:styleId="BaseNTok" w:type="character">
-    <w:name w:val="BaseNTok"/>
-    <w:basedOn w:val="VerbatimChar"/>
-    <w:rPr>
-      <w:color w:val="40a070"/>
-    </w:rPr>
-  </w:style>
-  <w:style w:customStyle="1" w:styleId="FloatTok" w:type="character">
-    <w:name w:val="FloatTok"/>
-    <w:basedOn w:val="VerbatimChar"/>
-    <w:rPr>
-      <w:color w:val="40a070"/>
-    </w:rPr>
-  </w:style>
-  <w:style w:customStyle="1" w:styleId="ConstantTok" w:type="character">
-    <w:name w:val="ConstantTok"/>
-    <w:basedOn w:val="VerbatimChar"/>
-    <w:rPr>
-      <w:color w:val="880000"/>
-    </w:rPr>
-  </w:style>
-  <w:style w:customStyle="1" w:styleId="CharTok" w:type="character">
-    <w:name w:val="CharTok"/>
-    <w:basedOn w:val="VerbatimChar"/>
-    <w:rPr>
-      <w:color w:val="4070a0"/>
-    </w:rPr>
-  </w:style>
-  <w:style w:customStyle="1" w:styleId="SpecialCharTok" w:type="character">
-    <w:name w:val="SpecialCharTok"/>
-    <w:basedOn w:val="VerbatimChar"/>
-    <w:rPr>
-      <w:color w:val="4070a0"/>
-    </w:rPr>
-  </w:style>
-  <w:style w:customStyle="1" w:styleId="StringTok" w:type="character">
-    <w:name w:val="StringTok"/>
-    <w:basedOn w:val="VerbatimChar"/>
-    <w:rPr>
-      <w:color w:val="4070a0"/>
-    </w:rPr>
-  </w:style>
-  <w:style w:customStyle="1" w:styleId="VerbatimStringTok" w:type="character">
-    <w:name w:val="VerbatimStringTok"/>
-    <w:basedOn w:val="VerbatimChar"/>
-    <w:rPr>
-      <w:color w:val="4070a0"/>
-    </w:rPr>
-  </w:style>
-  <w:style w:customStyle="1" w:styleId="SpecialStringTok" w:type="character">
-    <w:name w:val="SpecialStringTok"/>
-    <w:basedOn w:val="VerbatimChar"/>
-    <w:rPr>
-      <w:color w:val="bb6688"/>
-    </w:rPr>
-  </w:style>
-  <w:style w:customStyle="1" w:styleId="ImportTok" w:type="character">
-    <w:name w:val="ImportTok"/>
-    <w:basedOn w:val="VerbatimChar"/>
-    <w:rPr>
-      <w:b/>
-      <w:color w:val="008000"/>
-    </w:rPr>
-  </w:style>
-  <w:style w:customStyle="1" w:styleId="CommentTok" w:type="character">
-    <w:name w:val="CommentTok"/>
-    <w:basedOn w:val="VerbatimChar"/>
-    <w:rPr>
-      <w:i/>
-      <w:color w:val="60a0b0"/>
-    </w:rPr>
-  </w:style>
-  <w:style w:customStyle="1" w:styleId="DocumentationTok" w:type="character">
-    <w:name w:val="DocumentationTok"/>
-    <w:basedOn w:val="VerbatimChar"/>
-    <w:rPr>
-      <w:i/>
-      <w:color w:val="ba2121"/>
-    </w:rPr>
-  </w:style>
-  <w:style w:customStyle="1" w:styleId="AnnotationTok" w:type="character">
-    <w:name w:val="AnnotationTok"/>
-    <w:basedOn w:val="VerbatimChar"/>
-    <w:rPr>
-      <w:b/>
-      <w:i/>
-      <w:color w:val="60a0b0"/>
-    </w:rPr>
-  </w:style>
-  <w:style w:customStyle="1" w:styleId="CommentVarTok" w:type="character">
-    <w:name w:val="CommentVarTok"/>
-    <w:basedOn w:val="VerbatimChar"/>
-    <w:rPr>
-      <w:b/>
-      <w:i/>
-      <w:color w:val="60a0b0"/>
-    </w:rPr>
-  </w:style>
-  <w:style w:customStyle="1" w:styleId="OtherTok" w:type="character">
-    <w:name w:val="OtherTok"/>
-    <w:basedOn w:val="VerbatimChar"/>
-    <w:rPr>
-      <w:color w:val="007020"/>
-    </w:rPr>
-  </w:style>
-  <w:style w:customStyle="1" w:styleId="FunctionTok" w:type="character">
-    <w:name w:val="FunctionTok"/>
-    <w:basedOn w:val="VerbatimChar"/>
-    <w:rPr>
-      <w:color w:val="06287e"/>
-    </w:rPr>
-  </w:style>
-  <w:style w:customStyle="1" w:styleId="VariableTok" w:type="character">
-    <w:name w:val="VariableTok"/>
-    <w:basedOn w:val="VerbatimChar"/>
-    <w:rPr>
-      <w:color w:val="19177c"/>
-    </w:rPr>
-  </w:style>
-  <w:style w:customStyle="1" w:styleId="ControlFlowTok" w:type="character">
-    <w:name w:val="ControlFlowTok"/>
-    <w:basedOn w:val="VerbatimChar"/>
-    <w:rPr>
-      <w:b/>
-      <w:color w:val="007020"/>
-    </w:rPr>
-  </w:style>
-  <w:style w:customStyle="1" w:styleId="OperatorTok" w:type="character">
-    <w:name w:val="OperatorTok"/>
-    <w:basedOn w:val="VerbatimChar"/>
-    <w:rPr>
-      <w:color w:val="666666"/>
-    </w:rPr>
-  </w:style>
-  <w:style w:customStyle="1" w:styleId="BuiltInTok" w:type="character">
-    <w:name w:val="BuiltInTok"/>
-    <w:basedOn w:val="VerbatimChar"/>
-    <w:rPr>
-      <w:color w:val="008000"/>
-    </w:rPr>
-  </w:style>
-  <w:style w:customStyle="1" w:styleId="ExtensionTok" w:type="character">
-    <w:name w:val="ExtensionTok"/>
-    <w:basedOn w:val="VerbatimChar"/>
-    <w:rPr/>
-  </w:style>
-  <w:style w:customStyle="1" w:styleId="PreprocessorTok" w:type="character">
-    <w:name w:val="PreprocessorTok"/>
-    <w:basedOn w:val="VerbatimChar"/>
-    <w:rPr>
-      <w:color w:val="bc7a00"/>
-    </w:rPr>
-  </w:style>
-  <w:style w:customStyle="1" w:styleId="AttributeTok" w:type="character">
-    <w:name w:val="AttributeTok"/>
-    <w:basedOn w:val="VerbatimChar"/>
-    <w:rPr>
-      <w:color w:val="7d9029"/>
-    </w:rPr>
-  </w:style>
-  <w:style w:customStyle="1" w:styleId="RegionMarkerTok" w:type="character">
-    <w:name w:val="RegionMarkerTok"/>
-    <w:basedOn w:val="VerbatimChar"/>
-    <w:rPr/>
-  </w:style>
-  <w:style w:customStyle="1" w:styleId="InformationTok" w:type="character">
-    <w:name w:val="InformationTok"/>
-    <w:basedOn w:val="VerbatimChar"/>
-    <w:rPr>
-      <w:b/>
-      <w:i/>
-      <w:color w:val="60a0b0"/>
-    </w:rPr>
-  </w:style>
-  <w:style w:customStyle="1" w:styleId="WarningTok" w:type="character">
-    <w:name w:val="WarningTok"/>
-    <w:basedOn w:val="VerbatimChar"/>
-    <w:rPr>
-      <w:b/>
-      <w:i/>
-      <w:color w:val="60a0b0"/>
-    </w:rPr>
-  </w:style>
-  <w:style w:customStyle="1" w:styleId="AlertTok" w:type="character">
-    <w:name w:val="AlertTok"/>
-    <w:basedOn w:val="VerbatimChar"/>
-    <w:rPr>
-      <w:b/>
-      <w:color w:val="ff0000"/>
-    </w:rPr>
-  </w:style>
-  <w:style w:customStyle="1" w:styleId="ErrorTok" w:type="character">
-    <w:name w:val="ErrorTok"/>
-    <w:basedOn w:val="VerbatimChar"/>
-    <w:rPr>
-      <w:b/>
-      <w:color w:val="ff0000"/>
-    </w:rPr>
-  </w:style>
-  <w:style w:customStyle="1" w:styleId="NormalTok" w:type="character">
-    <w:name w:val="NormalTok"/>
-    <w:basedOn w:val="VerbatimChar"/>
-    <w:rPr/>
+    <w:qFormat/>
+    <w:pPr>
+      <w:spacing w:before="240" w:line="259" w:lineRule="auto"/>
+      <w:outlineLvl w:val="9"/>
+    </w:pPr>
+    <w:rPr>
+      <w:rFonts w:asciiTheme="majorHAnsi" w:cstheme="majorBidi" w:eastAsiaTheme="majorEastAsia" w:hAnsiTheme="majorHAnsi"/>
+      <w:b w:val="0"/>
+      <w:bCs w:val="0"/>
+      <w:color w:themeColor="accent1" w:themeShade="BF" w:val="365F91"/>
+    </w:rPr>
   </w:style>
   <w:style w:type="paragraph" w:customStyle="1" w:styleId="SourceCode">
     <w:name w:val="Source Code"/>

</xml_diff>

<commit_message>
Record the run at the final tag and finish the report front matter
</commit_message>
<xml_diff>
--- a/docs/deliverables/AI_Usage_Log.docx
+++ b/docs/deliverables/AI_Usage_Log.docx
@@ -153,19 +153,19 @@
         <w:t xml:space="preserve"> </w:t>
       </w:r>
       <w:r>
-        <w:t xml:space="preserve">literature review and the argument it makes, the forty-feature taxonomy, the</w:t>
-      </w:r>
-      <w:r>
-        <w:t xml:space="preserve"> </w:t>
-      </w:r>
-      <w:r>
-        <w:t xml:space="preserve">common intermediate representation, the parser design, the choice of</w:t>
-      </w:r>
-      <w:r>
-        <w:t xml:space="preserve"> </w:t>
-      </w:r>
-      <w:r>
-        <w:t xml:space="preserve">interquartile and rule-based detection, the thresholds shipped on</w:t>
+        <w:t xml:space="preserve">argument the literature review makes, the forty-feature taxonomy, the common</w:t>
+      </w:r>
+      <w:r>
+        <w:t xml:space="preserve"> </w:t>
+      </w:r>
+      <w:r>
+        <w:t xml:space="preserve">intermediate representation, the parser design, the choice of interquartile</w:t>
+      </w:r>
+      <w:r>
+        <w:t xml:space="preserve"> </w:t>
+      </w:r>
+      <w:r>
+        <w:t xml:space="preserve">and rule-based detection, the thresholds shipped on</w:t>
       </w:r>
       <w:r>
         <w:t xml:space="preserve"> </w:t>
@@ -177,25 +177,25 @@
         <w:t xml:space="preserve">main</w:t>
       </w:r>
       <w:r>
-        <w:t xml:space="preserve">, the</w:t>
-      </w:r>
-      <w:r>
-        <w:t xml:space="preserve"> </w:t>
-      </w:r>
-      <w:r>
-        <w:t xml:space="preserve">synthetic generator and its anomaly profiles, the success criteria, the</w:t>
-      </w:r>
-      <w:r>
-        <w:t xml:space="preserve"> </w:t>
-      </w:r>
-      <w:r>
-        <w:t xml:space="preserve">interpretation of every result, and the decision to report weaker per-class</w:t>
-      </w:r>
-      <w:r>
-        <w:t xml:space="preserve"> </w:t>
-      </w:r>
-      <w:r>
-        <w:t xml:space="preserve">results transparently are mine.</w:t>
+        <w:t xml:space="preserve">, the synthetic</w:t>
+      </w:r>
+      <w:r>
+        <w:t xml:space="preserve"> </w:t>
+      </w:r>
+      <w:r>
+        <w:t xml:space="preserve">generator and its anomaly profiles, the success criteria, the interpretation</w:t>
+      </w:r>
+      <w:r>
+        <w:t xml:space="preserve"> </w:t>
+      </w:r>
+      <w:r>
+        <w:t xml:space="preserve">of every result, and the decision to report weaker per-class results</w:t>
+      </w:r>
+      <w:r>
+        <w:t xml:space="preserve"> </w:t>
+      </w:r>
+      <w:r>
+        <w:t xml:space="preserve">transparently are mine.</w:t>
       </w:r>
     </w:p>
     <w:bookmarkEnd w:id="9"/>
@@ -294,9 +294,9 @@
         <w:tblLook w:firstRow="1" w:lastRow="0" w:firstColumn="0" w:lastColumn="0" w:noHBand="0" w:noVBand="0" w:val="0020"/>
       </w:tblPr>
       <w:tblGrid>
-        <w:gridCol w:w="2378"/>
-        <w:gridCol w:w="4296"/>
-        <w:gridCol w:w="2685"/>
+        <w:gridCol w:w="2293"/>
+        <w:gridCol w:w="4143"/>
+        <w:gridCol w:w="2589"/>
       </w:tblGrid>
       <w:tr>
         <w:trPr>
@@ -304,7 +304,7 @@
         </w:trPr>
         <w:tc>
           <w:tcPr>
-            <w:tcW w:type="dxa" w:w="2378"/>
+            <w:tcW w:type="dxa" w:w="2293"/>
           </w:tcPr>
           <w:p>
             <w:pPr>
@@ -318,7 +318,7 @@
         </w:tc>
         <w:tc>
           <w:tcPr>
-            <w:tcW w:type="dxa" w:w="4296"/>
+            <w:tcW w:type="dxa" w:w="4143"/>
           </w:tcPr>
           <w:p>
             <w:pPr>
@@ -332,7 +332,7 @@
         </w:tc>
         <w:tc>
           <w:tcPr>
-            <w:tcW w:type="dxa" w:w="2685"/>
+            <w:tcW w:type="dxa" w:w="2589"/>
           </w:tcPr>
           <w:p>
             <w:pPr>
@@ -348,7 +348,7 @@
       <w:tr>
         <w:tc>
           <w:tcPr>
-            <w:tcW w:type="dxa" w:w="2378"/>
+            <w:tcW w:type="dxa" w:w="2293"/>
           </w:tcPr>
           <w:p>
             <w:pPr>
@@ -362,7 +362,7 @@
         </w:tc>
         <w:tc>
           <w:tcPr>
-            <w:tcW w:type="dxa" w:w="4296"/>
+            <w:tcW w:type="dxa" w:w="4143"/>
           </w:tcPr>
           <w:p>
             <w:pPr>
@@ -376,7 +376,7 @@
         </w:tc>
         <w:tc>
           <w:tcPr>
-            <w:tcW w:type="dxa" w:w="2685"/>
+            <w:tcW w:type="dxa" w:w="2589"/>
           </w:tcPr>
           <w:p>
             <w:pPr>
@@ -392,7 +392,7 @@
       <w:tr>
         <w:tc>
           <w:tcPr>
-            <w:tcW w:type="dxa" w:w="2378"/>
+            <w:tcW w:type="dxa" w:w="2293"/>
           </w:tcPr>
           <w:p>
             <w:pPr>
@@ -406,7 +406,7 @@
         </w:tc>
         <w:tc>
           <w:tcPr>
-            <w:tcW w:type="dxa" w:w="4296"/>
+            <w:tcW w:type="dxa" w:w="4143"/>
           </w:tcPr>
           <w:p>
             <w:pPr>
@@ -420,7 +420,7 @@
         </w:tc>
         <w:tc>
           <w:tcPr>
-            <w:tcW w:type="dxa" w:w="2685"/>
+            <w:tcW w:type="dxa" w:w="2589"/>
           </w:tcPr>
           <w:p>
             <w:pPr>
@@ -436,7 +436,7 @@
       <w:tr>
         <w:tc>
           <w:tcPr>
-            <w:tcW w:type="dxa" w:w="2378"/>
+            <w:tcW w:type="dxa" w:w="2293"/>
           </w:tcPr>
           <w:p>
             <w:pPr>
@@ -450,7 +450,7 @@
         </w:tc>
         <w:tc>
           <w:tcPr>
-            <w:tcW w:type="dxa" w:w="4296"/>
+            <w:tcW w:type="dxa" w:w="4143"/>
           </w:tcPr>
           <w:p>
             <w:pPr>
@@ -464,7 +464,7 @@
         </w:tc>
         <w:tc>
           <w:tcPr>
-            <w:tcW w:type="dxa" w:w="2685"/>
+            <w:tcW w:type="dxa" w:w="2589"/>
           </w:tcPr>
           <w:p>
             <w:pPr>
@@ -480,7 +480,7 @@
       <w:tr>
         <w:tc>
           <w:tcPr>
-            <w:tcW w:type="dxa" w:w="2378"/>
+            <w:tcW w:type="dxa" w:w="2293"/>
           </w:tcPr>
           <w:p>
             <w:pPr>
@@ -494,7 +494,7 @@
         </w:tc>
         <w:tc>
           <w:tcPr>
-            <w:tcW w:type="dxa" w:w="4296"/>
+            <w:tcW w:type="dxa" w:w="4143"/>
           </w:tcPr>
           <w:p>
             <w:pPr>
@@ -508,7 +508,7 @@
         </w:tc>
         <w:tc>
           <w:tcPr>
-            <w:tcW w:type="dxa" w:w="2685"/>
+            <w:tcW w:type="dxa" w:w="2589"/>
           </w:tcPr>
           <w:p>
             <w:pPr>
@@ -524,7 +524,7 @@
       <w:tr>
         <w:tc>
           <w:tcPr>
-            <w:tcW w:type="dxa" w:w="2378"/>
+            <w:tcW w:type="dxa" w:w="2293"/>
           </w:tcPr>
           <w:p>
             <w:pPr>
@@ -538,7 +538,7 @@
         </w:tc>
         <w:tc>
           <w:tcPr>
-            <w:tcW w:type="dxa" w:w="4296"/>
+            <w:tcW w:type="dxa" w:w="4143"/>
           </w:tcPr>
           <w:p>
             <w:pPr>
@@ -552,7 +552,7 @@
         </w:tc>
         <w:tc>
           <w:tcPr>
-            <w:tcW w:type="dxa" w:w="2685"/>
+            <w:tcW w:type="dxa" w:w="2589"/>
           </w:tcPr>
           <w:p>
             <w:pPr>
@@ -615,8 +615,8 @@
         <w:tblLook w:firstRow="1" w:lastRow="0" w:firstColumn="0" w:lastColumn="0" w:noHBand="0" w:noVBand="0" w:val="0020"/>
       </w:tblPr>
       <w:tblGrid>
-        <w:gridCol w:w="1946"/>
-        <w:gridCol w:w="3774"/>
+        <w:gridCol w:w="1907"/>
+        <w:gridCol w:w="3479"/>
         <w:gridCol w:w="1690"/>
         <w:gridCol w:w="1950"/>
       </w:tblGrid>
@@ -626,7 +626,7 @@
         </w:trPr>
         <w:tc>
           <w:tcPr>
-            <w:tcW w:type="dxa" w:w="1946"/>
+            <w:tcW w:type="dxa" w:w="1907"/>
           </w:tcPr>
           <w:p>
             <w:pPr>
@@ -640,7 +640,7 @@
         </w:tc>
         <w:tc>
           <w:tcPr>
-            <w:tcW w:type="dxa" w:w="3774"/>
+            <w:tcW w:type="dxa" w:w="3479"/>
           </w:tcPr>
           <w:p>
             <w:pPr>
@@ -684,7 +684,7 @@
       <w:tr>
         <w:tc>
           <w:tcPr>
-            <w:tcW w:type="dxa" w:w="1946"/>
+            <w:tcW w:type="dxa" w:w="1907"/>
           </w:tcPr>
           <w:p>
             <w:pPr>
@@ -698,7 +698,7 @@
         </w:tc>
         <w:tc>
           <w:tcPr>
-            <w:tcW w:type="dxa" w:w="3774"/>
+            <w:tcW w:type="dxa" w:w="3479"/>
           </w:tcPr>
           <w:p>
             <w:pPr>
@@ -742,7 +742,7 @@
       <w:tr>
         <w:tc>
           <w:tcPr>
-            <w:tcW w:type="dxa" w:w="1946"/>
+            <w:tcW w:type="dxa" w:w="1907"/>
           </w:tcPr>
           <w:p>
             <w:pPr>
@@ -756,7 +756,7 @@
         </w:tc>
         <w:tc>
           <w:tcPr>
-            <w:tcW w:type="dxa" w:w="3774"/>
+            <w:tcW w:type="dxa" w:w="3479"/>
           </w:tcPr>
           <w:p>
             <w:pPr>
@@ -792,7 +792,7 @@
               <w:jc w:val="left"/>
             </w:pPr>
             <w:r>
-              <w:t xml:space="preserve">March to September 2026</w:t>
+              <w:t xml:space="preserve">March to October 2026</w:t>
             </w:r>
           </w:p>
         </w:tc>
@@ -800,7 +800,7 @@
       <w:tr>
         <w:tc>
           <w:tcPr>
-            <w:tcW w:type="dxa" w:w="1946"/>
+            <w:tcW w:type="dxa" w:w="1907"/>
           </w:tcPr>
           <w:p>
             <w:pPr>
@@ -814,7 +814,7 @@
         </w:tc>
         <w:tc>
           <w:tcPr>
-            <w:tcW w:type="dxa" w:w="3774"/>
+            <w:tcW w:type="dxa" w:w="3479"/>
           </w:tcPr>
           <w:p>
             <w:pPr>
@@ -858,7 +858,7 @@
       <w:tr>
         <w:tc>
           <w:tcPr>
-            <w:tcW w:type="dxa" w:w="1946"/>
+            <w:tcW w:type="dxa" w:w="1907"/>
           </w:tcPr>
           <w:p>
             <w:pPr>
@@ -872,7 +872,7 @@
         </w:tc>
         <w:tc>
           <w:tcPr>
-            <w:tcW w:type="dxa" w:w="3774"/>
+            <w:tcW w:type="dxa" w:w="3479"/>
           </w:tcPr>
           <w:p>
             <w:pPr>
@@ -916,7 +916,7 @@
       <w:tr>
         <w:tc>
           <w:tcPr>
-            <w:tcW w:type="dxa" w:w="1946"/>
+            <w:tcW w:type="dxa" w:w="1907"/>
           </w:tcPr>
           <w:p>
             <w:pPr>
@@ -930,7 +930,7 @@
         </w:tc>
         <w:tc>
           <w:tcPr>
-            <w:tcW w:type="dxa" w:w="3774"/>
+            <w:tcW w:type="dxa" w:w="3479"/>
           </w:tcPr>
           <w:p>
             <w:pPr>
@@ -974,7 +974,7 @@
       <w:tr>
         <w:tc>
           <w:tcPr>
-            <w:tcW w:type="dxa" w:w="1946"/>
+            <w:tcW w:type="dxa" w:w="1907"/>
           </w:tcPr>
           <w:p>
             <w:pPr>
@@ -988,7 +988,7 @@
         </w:tc>
         <w:tc>
           <w:tcPr>
-            <w:tcW w:type="dxa" w:w="3774"/>
+            <w:tcW w:type="dxa" w:w="3479"/>
           </w:tcPr>
           <w:p>
             <w:pPr>
@@ -1002,7 +1002,7 @@
               <w:t xml:space="preserve">requirements-validated.txt</w:t>
             </w:r>
             <w:r>
-              <w:t xml:space="preserve">, 143 pinned packages</w:t>
+              <w:t xml:space="preserve">, 148 pinned packages</w:t>
             </w:r>
           </w:p>
         </w:tc>
@@ -1093,11 +1093,11 @@
         <w:tblLook w:firstRow="1" w:lastRow="0" w:firstColumn="0" w:lastColumn="0" w:noHBand="0" w:noVBand="0" w:val="0020"/>
       </w:tblPr>
       <w:tblGrid>
-        <w:gridCol w:w="2121"/>
-        <w:gridCol w:w="1123"/>
-        <w:gridCol w:w="1996"/>
-        <w:gridCol w:w="1996"/>
-        <w:gridCol w:w="2124"/>
+        <w:gridCol w:w="1992"/>
+        <w:gridCol w:w="1054"/>
+        <w:gridCol w:w="1992"/>
+        <w:gridCol w:w="1875"/>
+        <w:gridCol w:w="2113"/>
       </w:tblGrid>
       <w:tr>
         <w:trPr>
@@ -1105,16 +1105,16 @@
         </w:trPr>
         <w:tc>
           <w:tcPr>
-            <w:tcW w:type="dxa" w:w="2121"/>
-          </w:tcPr>
-          <w:p>
-            <w:pPr>
-              <w:pStyle w:val="Compact"/>
-              <w:jc w:val="left"/>
-            </w:pPr>
-            <w:r>
-              <w:rPr>
-                <w:sz w:val="21"/>
+            <w:tcW w:type="dxa" w:w="1992"/>
+          </w:tcPr>
+          <w:p>
+            <w:pPr>
+              <w:pStyle w:val="Compact"/>
+              <w:jc w:val="left"/>
+            </w:pPr>
+            <w:r>
+              <w:rPr>
+                <w:sz w:val="19"/>
               </w:rPr>
               <w:t xml:space="preserve">Date</w:t>
             </w:r>
@@ -1122,16 +1122,16 @@
         </w:tc>
         <w:tc>
           <w:tcPr>
-            <w:tcW w:type="dxa" w:w="1123"/>
-          </w:tcPr>
-          <w:p>
-            <w:pPr>
-              <w:pStyle w:val="Compact"/>
-              <w:jc w:val="left"/>
-            </w:pPr>
-            <w:r>
-              <w:rPr>
-                <w:sz w:val="21"/>
+            <w:tcW w:type="dxa" w:w="1054"/>
+          </w:tcPr>
+          <w:p>
+            <w:pPr>
+              <w:pStyle w:val="Compact"/>
+              <w:jc w:val="left"/>
+            </w:pPr>
+            <w:r>
+              <w:rPr>
+                <w:sz w:val="19"/>
               </w:rPr>
               <w:t xml:space="preserve">Tool</w:t>
             </w:r>
@@ -1139,16 +1139,16 @@
         </w:tc>
         <w:tc>
           <w:tcPr>
-            <w:tcW w:type="dxa" w:w="1996"/>
-          </w:tcPr>
-          <w:p>
-            <w:pPr>
-              <w:pStyle w:val="Compact"/>
-              <w:jc w:val="left"/>
-            </w:pPr>
-            <w:r>
-              <w:rPr>
-                <w:sz w:val="21"/>
+            <w:tcW w:type="dxa" w:w="1992"/>
+          </w:tcPr>
+          <w:p>
+            <w:pPr>
+              <w:pStyle w:val="Compact"/>
+              <w:jc w:val="left"/>
+            </w:pPr>
+            <w:r>
+              <w:rPr>
+                <w:sz w:val="19"/>
               </w:rPr>
               <w:t xml:space="preserve">Representative prompt, in substance</w:t>
             </w:r>
@@ -1156,16 +1156,16 @@
         </w:tc>
         <w:tc>
           <w:tcPr>
-            <w:tcW w:type="dxa" w:w="1996"/>
-          </w:tcPr>
-          <w:p>
-            <w:pPr>
-              <w:pStyle w:val="Compact"/>
-              <w:jc w:val="left"/>
-            </w:pPr>
-            <w:r>
-              <w:rPr>
-                <w:sz w:val="21"/>
+            <w:tcW w:type="dxa" w:w="1875"/>
+          </w:tcPr>
+          <w:p>
+            <w:pPr>
+              <w:pStyle w:val="Compact"/>
+              <w:jc w:val="left"/>
+            </w:pPr>
+            <w:r>
+              <w:rPr>
+                <w:sz w:val="19"/>
               </w:rPr>
               <w:t xml:space="preserve">Input provided</w:t>
             </w:r>
@@ -1173,16 +1173,16 @@
         </w:tc>
         <w:tc>
           <w:tcPr>
-            <w:tcW w:type="dxa" w:w="2124"/>
-          </w:tcPr>
-          <w:p>
-            <w:pPr>
-              <w:pStyle w:val="Compact"/>
-              <w:jc w:val="left"/>
-            </w:pPr>
-            <w:r>
-              <w:rPr>
-                <w:sz w:val="21"/>
+            <w:tcW w:type="dxa" w:w="2113"/>
+          </w:tcPr>
+          <w:p>
+            <w:pPr>
+              <w:pStyle w:val="Compact"/>
+              <w:jc w:val="left"/>
+            </w:pPr>
+            <w:r>
+              <w:rPr>
+                <w:sz w:val="19"/>
               </w:rPr>
               <w:t xml:space="preserve">Outcome in submitted work</w:t>
             </w:r>
@@ -1192,16 +1192,16 @@
       <w:tr>
         <w:tc>
           <w:tcPr>
-            <w:tcW w:type="dxa" w:w="2121"/>
-          </w:tcPr>
-          <w:p>
-            <w:pPr>
-              <w:pStyle w:val="Compact"/>
-              <w:jc w:val="left"/>
-            </w:pPr>
-            <w:r>
-              <w:rPr>
-                <w:sz w:val="21"/>
+            <w:tcW w:type="dxa" w:w="1992"/>
+          </w:tcPr>
+          <w:p>
+            <w:pPr>
+              <w:pStyle w:val="Compact"/>
+              <w:jc w:val="left"/>
+            </w:pPr>
+            <w:r>
+              <w:rPr>
+                <w:sz w:val="19"/>
               </w:rPr>
               <w:t xml:space="preserve">Mar 2026 (reconstructed)</w:t>
             </w:r>
@@ -1209,16 +1209,16 @@
         </w:tc>
         <w:tc>
           <w:tcPr>
-            <w:tcW w:type="dxa" w:w="1123"/>
-          </w:tcPr>
-          <w:p>
-            <w:pPr>
-              <w:pStyle w:val="Compact"/>
-              <w:jc w:val="left"/>
-            </w:pPr>
-            <w:r>
-              <w:rPr>
-                <w:sz w:val="21"/>
+            <w:tcW w:type="dxa" w:w="1054"/>
+          </w:tcPr>
+          <w:p>
+            <w:pPr>
+              <w:pStyle w:val="Compact"/>
+              <w:jc w:val="left"/>
+            </w:pPr>
+            <w:r>
+              <w:rPr>
+                <w:sz w:val="19"/>
               </w:rPr>
               <w:t xml:space="preserve">GitHub Copilot</w:t>
             </w:r>
@@ -1226,16 +1226,16 @@
         </w:tc>
         <w:tc>
           <w:tcPr>
-            <w:tcW w:type="dxa" w:w="1996"/>
-          </w:tcPr>
-          <w:p>
-            <w:pPr>
-              <w:pStyle w:val="Compact"/>
-              <w:jc w:val="left"/>
-            </w:pPr>
-            <w:r>
-              <w:rPr>
-                <w:sz w:val="21"/>
+            <w:tcW w:type="dxa" w:w="1992"/>
+          </w:tcPr>
+          <w:p>
+            <w:pPr>
+              <w:pStyle w:val="Compact"/>
+              <w:jc w:val="left"/>
+            </w:pPr>
+            <w:r>
+              <w:rPr>
+                <w:sz w:val="19"/>
               </w:rPr>
               <w:t xml:space="preserve">Inline completion while writing parser and DataFrame code</w:t>
             </w:r>
@@ -1243,16 +1243,16 @@
         </w:tc>
         <w:tc>
           <w:tcPr>
-            <w:tcW w:type="dxa" w:w="1996"/>
-          </w:tcPr>
-          <w:p>
-            <w:pPr>
-              <w:pStyle w:val="Compact"/>
-              <w:jc w:val="left"/>
-            </w:pPr>
-            <w:r>
-              <w:rPr>
-                <w:sz w:val="21"/>
+            <w:tcW w:type="dxa" w:w="1875"/>
+          </w:tcPr>
+          <w:p>
+            <w:pPr>
+              <w:pStyle w:val="Compact"/>
+              <w:jc w:val="left"/>
+            </w:pPr>
+            <w:r>
+              <w:rPr>
+                <w:sz w:val="19"/>
               </w:rPr>
               <w:t xml:space="preserve">Open source files in the editor</w:t>
             </w:r>
@@ -1260,7 +1260,7 @@
         </w:tc>
         <w:tc>
           <w:tcPr>
-            <w:tcW w:type="dxa" w:w="2124"/>
+            <w:tcW w:type="dxa" w:w="2113"/>
           </w:tcPr>
           <w:p>
             <w:pPr>
@@ -1271,19 +1271,19 @@
               <w:rPr>
                 <w:b/>
                 <w:bCs/>
-                <w:sz w:val="21"/>
+                <w:sz w:val="19"/>
               </w:rPr>
               <w:t xml:space="preserve">Modified.</w:t>
             </w:r>
             <w:r>
               <w:rPr>
-                <w:sz w:val="21"/>
+                <w:sz w:val="19"/>
               </w:rPr>
               <w:t xml:space="preserve"> </w:t>
             </w:r>
             <w:r>
               <w:rPr>
-                <w:sz w:val="21"/>
+                <w:sz w:val="19"/>
               </w:rPr>
               <w:t xml:space="preserve">Line-level completions only. Logic was written, reviewed and tested by me.</w:t>
             </w:r>
@@ -1293,16 +1293,16 @@
       <w:tr>
         <w:tc>
           <w:tcPr>
-            <w:tcW w:type="dxa" w:w="2121"/>
-          </w:tcPr>
-          <w:p>
-            <w:pPr>
-              <w:pStyle w:val="Compact"/>
-              <w:jc w:val="left"/>
-            </w:pPr>
-            <w:r>
-              <w:rPr>
-                <w:sz w:val="21"/>
+            <w:tcW w:type="dxa" w:w="1992"/>
+          </w:tcPr>
+          <w:p>
+            <w:pPr>
+              <w:pStyle w:val="Compact"/>
+              <w:jc w:val="left"/>
+            </w:pPr>
+            <w:r>
+              <w:rPr>
+                <w:sz w:val="19"/>
               </w:rPr>
               <w:t xml:space="preserve">Mar 2026 (reconstructed)</w:t>
             </w:r>
@@ -1310,16 +1310,16 @@
         </w:tc>
         <w:tc>
           <w:tcPr>
-            <w:tcW w:type="dxa" w:w="1123"/>
-          </w:tcPr>
-          <w:p>
-            <w:pPr>
-              <w:pStyle w:val="Compact"/>
-              <w:jc w:val="left"/>
-            </w:pPr>
-            <w:r>
-              <w:rPr>
-                <w:sz w:val="21"/>
+            <w:tcW w:type="dxa" w:w="1054"/>
+          </w:tcPr>
+          <w:p>
+            <w:pPr>
+              <w:pStyle w:val="Compact"/>
+              <w:jc w:val="left"/>
+            </w:pPr>
+            <w:r>
+              <w:rPr>
+                <w:sz w:val="19"/>
               </w:rPr>
               <w:t xml:space="preserve">Claude</w:t>
             </w:r>
@@ -1327,16 +1327,16 @@
         </w:tc>
         <w:tc>
           <w:tcPr>
-            <w:tcW w:type="dxa" w:w="1996"/>
-          </w:tcPr>
-          <w:p>
-            <w:pPr>
-              <w:pStyle w:val="Compact"/>
-              <w:jc w:val="left"/>
-            </w:pPr>
-            <w:r>
-              <w:rPr>
-                <w:sz w:val="21"/>
+            <w:tcW w:type="dxa" w:w="1992"/>
+          </w:tcPr>
+          <w:p>
+            <w:pPr>
+              <w:pStyle w:val="Compact"/>
+              <w:jc w:val="left"/>
+            </w:pPr>
+            <w:r>
+              <w:rPr>
+                <w:sz w:val="19"/>
               </w:rPr>
               <w:t xml:space="preserve">Clarify the difference between Tukey interquartile fences and the modified z-score for right-skewed data, and which is defensible for response times</w:t>
             </w:r>
@@ -1344,16 +1344,16 @@
         </w:tc>
         <w:tc>
           <w:tcPr>
-            <w:tcW w:type="dxa" w:w="1996"/>
-          </w:tcPr>
-          <w:p>
-            <w:pPr>
-              <w:pStyle w:val="Compact"/>
-              <w:jc w:val="left"/>
-            </w:pPr>
-            <w:r>
-              <w:rPr>
-                <w:sz w:val="21"/>
+            <w:tcW w:type="dxa" w:w="1875"/>
+          </w:tcPr>
+          <w:p>
+            <w:pPr>
+              <w:pStyle w:val="Compact"/>
+              <w:jc w:val="left"/>
+            </w:pPr>
+            <w:r>
+              <w:rPr>
+                <w:sz w:val="19"/>
               </w:rPr>
               <w:t xml:space="preserve">Prose question, no code, no data</w:t>
             </w:r>
@@ -1361,7 +1361,7 @@
         </w:tc>
         <w:tc>
           <w:tcPr>
-            <w:tcW w:type="dxa" w:w="2124"/>
+            <w:tcW w:type="dxa" w:w="2113"/>
           </w:tcPr>
           <w:p>
             <w:pPr>
@@ -1372,19 +1372,19 @@
               <w:rPr>
                 <w:b/>
                 <w:bCs/>
-                <w:sz w:val="21"/>
+                <w:sz w:val="19"/>
               </w:rPr>
               <w:t xml:space="preserve">Accepted as background.</w:t>
             </w:r>
             <w:r>
               <w:rPr>
-                <w:sz w:val="21"/>
+                <w:sz w:val="19"/>
               </w:rPr>
               <w:t xml:space="preserve"> </w:t>
             </w:r>
             <w:r>
               <w:rPr>
-                <w:sz w:val="21"/>
+                <w:sz w:val="19"/>
               </w:rPr>
               <w:t xml:space="preserve">The method choice is mine and is unchanged. The statement in the first submission that the citations supporting it had been checked against their sources was wrong: two of the references carrying that argument could not be located when they were checked in September 2026, and both have been withdrawn. Appendix E of the report records the checks.</w:t>
             </w:r>
@@ -1394,16 +1394,16 @@
       <w:tr>
         <w:tc>
           <w:tcPr>
-            <w:tcW w:type="dxa" w:w="2121"/>
-          </w:tcPr>
-          <w:p>
-            <w:pPr>
-              <w:pStyle w:val="Compact"/>
-              <w:jc w:val="left"/>
-            </w:pPr>
-            <w:r>
-              <w:rPr>
-                <w:sz w:val="21"/>
+            <w:tcW w:type="dxa" w:w="1992"/>
+          </w:tcPr>
+          <w:p>
+            <w:pPr>
+              <w:pStyle w:val="Compact"/>
+              <w:jc w:val="left"/>
+            </w:pPr>
+            <w:r>
+              <w:rPr>
+                <w:sz w:val="19"/>
               </w:rPr>
               <w:t xml:space="preserve">Mar to Apr 2026 (reconstructed)</w:t>
             </w:r>
@@ -1411,16 +1411,16 @@
         </w:tc>
         <w:tc>
           <w:tcPr>
-            <w:tcW w:type="dxa" w:w="1123"/>
-          </w:tcPr>
-          <w:p>
-            <w:pPr>
-              <w:pStyle w:val="Compact"/>
-              <w:jc w:val="left"/>
-            </w:pPr>
-            <w:r>
-              <w:rPr>
-                <w:sz w:val="21"/>
+            <w:tcW w:type="dxa" w:w="1054"/>
+          </w:tcPr>
+          <w:p>
+            <w:pPr>
+              <w:pStyle w:val="Compact"/>
+              <w:jc w:val="left"/>
+            </w:pPr>
+            <w:r>
+              <w:rPr>
+                <w:sz w:val="19"/>
               </w:rPr>
               <w:t xml:space="preserve">Claude</w:t>
             </w:r>
@@ -1428,16 +1428,16 @@
         </w:tc>
         <w:tc>
           <w:tcPr>
-            <w:tcW w:type="dxa" w:w="1996"/>
-          </w:tcPr>
-          <w:p>
-            <w:pPr>
-              <w:pStyle w:val="Compact"/>
-              <w:jc w:val="left"/>
-            </w:pPr>
-            <w:r>
-              <w:rPr>
-                <w:sz w:val="21"/>
+            <w:tcW w:type="dxa" w:w="1992"/>
+          </w:tcPr>
+          <w:p>
+            <w:pPr>
+              <w:pStyle w:val="Compact"/>
+              <w:jc w:val="left"/>
+            </w:pPr>
+            <w:r>
+              <w:rPr>
+                <w:sz w:val="19"/>
               </w:rPr>
               <w:t xml:space="preserve">Why does timestamp parsing produce different magnitudes for epoch and ISO inputs, and what guard would catch it</w:t>
             </w:r>
@@ -1445,16 +1445,16 @@
         </w:tc>
         <w:tc>
           <w:tcPr>
-            <w:tcW w:type="dxa" w:w="1996"/>
-          </w:tcPr>
-          <w:p>
-            <w:pPr>
-              <w:pStyle w:val="Compact"/>
-              <w:jc w:val="left"/>
-            </w:pPr>
-            <w:r>
-              <w:rPr>
-                <w:sz w:val="21"/>
+            <w:tcW w:type="dxa" w:w="1875"/>
+          </w:tcPr>
+          <w:p>
+            <w:pPr>
+              <w:pStyle w:val="Compact"/>
+              <w:jc w:val="left"/>
+            </w:pPr>
+            <w:r>
+              <w:rPr>
+                <w:sz w:val="19"/>
               </w:rPr>
               <w:t xml:space="preserve">Parser code and an error trace</w:t>
             </w:r>
@@ -1462,7 +1462,7 @@
         </w:tc>
         <w:tc>
           <w:tcPr>
-            <w:tcW w:type="dxa" w:w="2124"/>
+            <w:tcW w:type="dxa" w:w="2113"/>
           </w:tcPr>
           <w:p>
             <w:pPr>
@@ -1473,19 +1473,19 @@
               <w:rPr>
                 <w:b/>
                 <w:bCs/>
-                <w:sz w:val="21"/>
+                <w:sz w:val="19"/>
               </w:rPr>
               <w:t xml:space="preserve">Modified.</w:t>
             </w:r>
             <w:r>
               <w:rPr>
-                <w:sz w:val="21"/>
+                <w:sz w:val="19"/>
               </w:rPr>
               <w:t xml:space="preserve"> </w:t>
             </w:r>
             <w:r>
               <w:rPr>
-                <w:sz w:val="21"/>
+                <w:sz w:val="19"/>
               </w:rPr>
               <w:t xml:space="preserve">The suggestion of a magnitude-based guard for epoch seconds was useful; I implemented, named and tested the behaviour myself.</w:t>
             </w:r>
@@ -1495,16 +1495,16 @@
       <w:tr>
         <w:tc>
           <w:tcPr>
-            <w:tcW w:type="dxa" w:w="2121"/>
-          </w:tcPr>
-          <w:p>
-            <w:pPr>
-              <w:pStyle w:val="Compact"/>
-              <w:jc w:val="left"/>
-            </w:pPr>
-            <w:r>
-              <w:rPr>
-                <w:sz w:val="21"/>
+            <w:tcW w:type="dxa" w:w="1992"/>
+          </w:tcPr>
+          <w:p>
+            <w:pPr>
+              <w:pStyle w:val="Compact"/>
+              <w:jc w:val="left"/>
+            </w:pPr>
+            <w:r>
+              <w:rPr>
+                <w:sz w:val="19"/>
               </w:rPr>
               <w:t xml:space="preserve">Apr 2026 (reconstructed)</w:t>
             </w:r>
@@ -1512,16 +1512,16 @@
         </w:tc>
         <w:tc>
           <w:tcPr>
-            <w:tcW w:type="dxa" w:w="1123"/>
-          </w:tcPr>
-          <w:p>
-            <w:pPr>
-              <w:pStyle w:val="Compact"/>
-              <w:jc w:val="left"/>
-            </w:pPr>
-            <w:r>
-              <w:rPr>
-                <w:sz w:val="21"/>
+            <w:tcW w:type="dxa" w:w="1054"/>
+          </w:tcPr>
+          <w:p>
+            <w:pPr>
+              <w:pStyle w:val="Compact"/>
+              <w:jc w:val="left"/>
+            </w:pPr>
+            <w:r>
+              <w:rPr>
+                <w:sz w:val="19"/>
               </w:rPr>
               <w:t xml:space="preserve">ChatGPT</w:t>
             </w:r>
@@ -1529,16 +1529,16 @@
         </w:tc>
         <w:tc>
           <w:tcPr>
-            <w:tcW w:type="dxa" w:w="1996"/>
-          </w:tcPr>
-          <w:p>
-            <w:pPr>
-              <w:pStyle w:val="Compact"/>
-              <w:jc w:val="left"/>
-            </w:pPr>
-            <w:r>
-              <w:rPr>
-                <w:sz w:val="21"/>
+            <w:tcW w:type="dxa" w:w="1992"/>
+          </w:tcPr>
+          <w:p>
+            <w:pPr>
+              <w:pStyle w:val="Compact"/>
+              <w:jc w:val="left"/>
+            </w:pPr>
+            <w:r>
+              <w:rPr>
+                <w:sz w:val="19"/>
               </w:rPr>
               <w:t xml:space="preserve">Review the structure of a labelled evaluation for label leakage</w:t>
             </w:r>
@@ -1546,16 +1546,16 @@
         </w:tc>
         <w:tc>
           <w:tcPr>
-            <w:tcW w:type="dxa" w:w="1996"/>
-          </w:tcPr>
-          <w:p>
-            <w:pPr>
-              <w:pStyle w:val="Compact"/>
-              <w:jc w:val="left"/>
-            </w:pPr>
-            <w:r>
-              <w:rPr>
-                <w:sz w:val="21"/>
+            <w:tcW w:type="dxa" w:w="1875"/>
+          </w:tcPr>
+          <w:p>
+            <w:pPr>
+              <w:pStyle w:val="Compact"/>
+              <w:jc w:val="left"/>
+            </w:pPr>
+            <w:r>
+              <w:rPr>
+                <w:sz w:val="19"/>
               </w:rPr>
               <w:t xml:space="preserve">Description of the evaluation join, no data</w:t>
             </w:r>
@@ -1563,7 +1563,7 @@
         </w:tc>
         <w:tc>
           <w:tcPr>
-            <w:tcW w:type="dxa" w:w="2124"/>
+            <w:tcW w:type="dxa" w:w="2113"/>
           </w:tcPr>
           <w:p>
             <w:pPr>
@@ -1574,19 +1574,19 @@
               <w:rPr>
                 <w:b/>
                 <w:bCs/>
-                <w:sz w:val="21"/>
+                <w:sz w:val="19"/>
               </w:rPr>
               <w:t xml:space="preserve">Accepted as a check.</w:t>
             </w:r>
             <w:r>
               <w:rPr>
-                <w:sz w:val="21"/>
+                <w:sz w:val="19"/>
               </w:rPr>
               <w:t xml:space="preserve"> </w:t>
             </w:r>
             <w:r>
               <w:rPr>
-                <w:sz w:val="21"/>
+                <w:sz w:val="19"/>
               </w:rPr>
               <w:t xml:space="preserve">Confirmed the detector must not see labels. The evaluation code and the strict one-to-one join were written by me.</w:t>
             </w:r>
@@ -1596,16 +1596,16 @@
       <w:tr>
         <w:tc>
           <w:tcPr>
-            <w:tcW w:type="dxa" w:w="2121"/>
-          </w:tcPr>
-          <w:p>
-            <w:pPr>
-              <w:pStyle w:val="Compact"/>
-              <w:jc w:val="left"/>
-            </w:pPr>
-            <w:r>
-              <w:rPr>
-                <w:sz w:val="21"/>
+            <w:tcW w:type="dxa" w:w="1992"/>
+          </w:tcPr>
+          <w:p>
+            <w:pPr>
+              <w:pStyle w:val="Compact"/>
+              <w:jc w:val="left"/>
+            </w:pPr>
+            <w:r>
+              <w:rPr>
+                <w:sz w:val="19"/>
               </w:rPr>
               <w:t xml:space="preserve">6 Jul 2026</w:t>
             </w:r>
@@ -1613,16 +1613,16 @@
         </w:tc>
         <w:tc>
           <w:tcPr>
-            <w:tcW w:type="dxa" w:w="1123"/>
-          </w:tcPr>
-          <w:p>
-            <w:pPr>
-              <w:pStyle w:val="Compact"/>
-              <w:jc w:val="left"/>
-            </w:pPr>
-            <w:r>
-              <w:rPr>
-                <w:sz w:val="21"/>
+            <w:tcW w:type="dxa" w:w="1054"/>
+          </w:tcPr>
+          <w:p>
+            <w:pPr>
+              <w:pStyle w:val="Compact"/>
+              <w:jc w:val="left"/>
+            </w:pPr>
+            <w:r>
+              <w:rPr>
+                <w:sz w:val="19"/>
               </w:rPr>
               <w:t xml:space="preserve">Claude</w:t>
             </w:r>
@@ -1630,41 +1630,41 @@
         </w:tc>
         <w:tc>
           <w:tcPr>
-            <w:tcW w:type="dxa" w:w="1996"/>
-          </w:tcPr>
-          <w:p>
-            <w:pPr>
-              <w:pStyle w:val="Compact"/>
-              <w:jc w:val="left"/>
-            </w:pPr>
-            <w:r>
-              <w:rPr>
-                <w:sz w:val="21"/>
+            <w:tcW w:type="dxa" w:w="1992"/>
+          </w:tcPr>
+          <w:p>
+            <w:pPr>
+              <w:pStyle w:val="Compact"/>
+              <w:jc w:val="left"/>
+            </w:pPr>
+            <w:r>
+              <w:rPr>
+                <w:sz w:val="19"/>
               </w:rPr>
               <w:t xml:space="preserve">Review</w:t>
             </w:r>
             <w:r>
               <w:rPr>
-                <w:sz w:val="21"/>
+                <w:sz w:val="19"/>
               </w:rPr>
               <w:t xml:space="preserve"> </w:t>
             </w:r>
             <w:r>
               <w:rPr>
                 <w:rStyle w:val="VerbatimChar"/>
-                <w:sz w:val="21"/>
+                <w:sz w:val="19"/>
               </w:rPr>
               <w:t xml:space="preserve">src/</w:t>
             </w:r>
             <w:r>
               <w:rPr>
-                <w:sz w:val="21"/>
+                <w:sz w:val="19"/>
               </w:rPr>
               <w:t xml:space="preserve"> </w:t>
             </w:r>
             <w:r>
               <w:rPr>
-                <w:sz w:val="21"/>
+                <w:sz w:val="19"/>
               </w:rPr>
               <w:t xml:space="preserve">for defects and comment on whether the generator is realistic enough for the claims made</w:t>
             </w:r>
@@ -1672,16 +1672,16 @@
         </w:tc>
         <w:tc>
           <w:tcPr>
-            <w:tcW w:type="dxa" w:w="1996"/>
-          </w:tcPr>
-          <w:p>
-            <w:pPr>
-              <w:pStyle w:val="Compact"/>
-              <w:jc w:val="left"/>
-            </w:pPr>
-            <w:r>
-              <w:rPr>
-                <w:sz w:val="21"/>
+            <w:tcW w:type="dxa" w:w="1875"/>
+          </w:tcPr>
+          <w:p>
+            <w:pPr>
+              <w:pStyle w:val="Compact"/>
+              <w:jc w:val="left"/>
+            </w:pPr>
+            <w:r>
+              <w:rPr>
+                <w:sz w:val="19"/>
               </w:rPr>
               <w:t xml:space="preserve">Source tree and generator code</w:t>
             </w:r>
@@ -1689,7 +1689,7 @@
         </w:tc>
         <w:tc>
           <w:tcPr>
-            <w:tcW w:type="dxa" w:w="2124"/>
+            <w:tcW w:type="dxa" w:w="2113"/>
           </w:tcPr>
           <w:p>
             <w:pPr>
@@ -1700,19 +1700,19 @@
               <w:rPr>
                 <w:b/>
                 <w:bCs/>
-                <w:sz w:val="21"/>
+                <w:sz w:val="19"/>
               </w:rPr>
               <w:t xml:space="preserve">Accepted in part.</w:t>
             </w:r>
             <w:r>
               <w:rPr>
-                <w:sz w:val="21"/>
+                <w:sz w:val="19"/>
               </w:rPr>
               <w:t xml:space="preserve"> </w:t>
             </w:r>
             <w:r>
               <w:rPr>
-                <w:sz w:val="21"/>
+                <w:sz w:val="19"/>
               </w:rPr>
               <w:t xml:space="preserve">I fixed the confirmed defects, removed detector settings that mirrored the generator, and re-ran on held-out seeds. Comments on realism I judged speculative were rejected.</w:t>
             </w:r>
@@ -1722,16 +1722,16 @@
       <w:tr>
         <w:tc>
           <w:tcPr>
-            <w:tcW w:type="dxa" w:w="2121"/>
-          </w:tcPr>
-          <w:p>
-            <w:pPr>
-              <w:pStyle w:val="Compact"/>
-              <w:jc w:val="left"/>
-            </w:pPr>
-            <w:r>
-              <w:rPr>
-                <w:sz w:val="21"/>
+            <w:tcW w:type="dxa" w:w="1992"/>
+          </w:tcPr>
+          <w:p>
+            <w:pPr>
+              <w:pStyle w:val="Compact"/>
+              <w:jc w:val="left"/>
+            </w:pPr>
+            <w:r>
+              <w:rPr>
+                <w:sz w:val="19"/>
               </w:rPr>
               <w:t xml:space="preserve">6 to 14 Jul 2026</w:t>
             </w:r>
@@ -1739,16 +1739,16 @@
         </w:tc>
         <w:tc>
           <w:tcPr>
-            <w:tcW w:type="dxa" w:w="1123"/>
-          </w:tcPr>
-          <w:p>
-            <w:pPr>
-              <w:pStyle w:val="Compact"/>
-              <w:jc w:val="left"/>
-            </w:pPr>
-            <w:r>
-              <w:rPr>
-                <w:sz w:val="21"/>
+            <w:tcW w:type="dxa" w:w="1054"/>
+          </w:tcPr>
+          <w:p>
+            <w:pPr>
+              <w:pStyle w:val="Compact"/>
+              <w:jc w:val="left"/>
+            </w:pPr>
+            <w:r>
+              <w:rPr>
+                <w:sz w:val="19"/>
               </w:rPr>
               <w:t xml:space="preserve">Claude</w:t>
             </w:r>
@@ -1756,16 +1756,16 @@
         </w:tc>
         <w:tc>
           <w:tcPr>
-            <w:tcW w:type="dxa" w:w="1996"/>
-          </w:tcPr>
-          <w:p>
-            <w:pPr>
-              <w:pStyle w:val="Compact"/>
-              <w:jc w:val="left"/>
-            </w:pPr>
-            <w:r>
-              <w:rPr>
-                <w:sz w:val="21"/>
+            <w:tcW w:type="dxa" w:w="1992"/>
+          </w:tcPr>
+          <w:p>
+            <w:pPr>
+              <w:pStyle w:val="Compact"/>
+              <w:jc w:val="left"/>
+            </w:pPr>
+            <w:r>
+              <w:rPr>
+                <w:sz w:val="19"/>
               </w:rPr>
               <w:t xml:space="preserve">Drafting support for progress documentation; run clean-environment checks and report what breaks</w:t>
             </w:r>
@@ -1773,16 +1773,16 @@
         </w:tc>
         <w:tc>
           <w:tcPr>
-            <w:tcW w:type="dxa" w:w="1996"/>
-          </w:tcPr>
-          <w:p>
-            <w:pPr>
-              <w:pStyle w:val="Compact"/>
-              <w:jc w:val="left"/>
-            </w:pPr>
-            <w:r>
-              <w:rPr>
-                <w:sz w:val="21"/>
+            <w:tcW w:type="dxa" w:w="1875"/>
+          </w:tcPr>
+          <w:p>
+            <w:pPr>
+              <w:pStyle w:val="Compact"/>
+              <w:jc w:val="left"/>
+            </w:pPr>
+            <w:r>
+              <w:rPr>
+                <w:sz w:val="19"/>
               </w:rPr>
               <w:t xml:space="preserve">Documentation drafts, repository</w:t>
             </w:r>
@@ -1790,7 +1790,7 @@
         </w:tc>
         <w:tc>
           <w:tcPr>
-            <w:tcW w:type="dxa" w:w="2124"/>
+            <w:tcW w:type="dxa" w:w="2113"/>
           </w:tcPr>
           <w:p>
             <w:pPr>
@@ -1801,19 +1801,19 @@
               <w:rPr>
                 <w:b/>
                 <w:bCs/>
-                <w:sz w:val="21"/>
+                <w:sz w:val="19"/>
               </w:rPr>
               <w:t xml:space="preserve">Modified.</w:t>
             </w:r>
             <w:r>
               <w:rPr>
-                <w:sz w:val="21"/>
+                <w:sz w:val="19"/>
               </w:rPr>
               <w:t xml:space="preserve"> </w:t>
             </w:r>
             <w:r>
               <w:rPr>
-                <w:sz w:val="21"/>
+                <w:sz w:val="19"/>
               </w:rPr>
               <w:t xml:space="preserve">All draft text was rewritten by me. The clean-run checks surfaced two real defects, described in section 4 of the report, which I fixed and covered with tests.</w:t>
             </w:r>
@@ -1823,16 +1823,16 @@
       <w:tr>
         <w:tc>
           <w:tcPr>
-            <w:tcW w:type="dxa" w:w="2121"/>
-          </w:tcPr>
-          <w:p>
-            <w:pPr>
-              <w:pStyle w:val="Compact"/>
-              <w:jc w:val="left"/>
-            </w:pPr>
-            <w:r>
-              <w:rPr>
-                <w:sz w:val="21"/>
+            <w:tcW w:type="dxa" w:w="1992"/>
+          </w:tcPr>
+          <w:p>
+            <w:pPr>
+              <w:pStyle w:val="Compact"/>
+              <w:jc w:val="left"/>
+            </w:pPr>
+            <w:r>
+              <w:rPr>
+                <w:sz w:val="19"/>
               </w:rPr>
               <w:t xml:space="preserve">19 Aug 2026</w:t>
             </w:r>
@@ -1840,16 +1840,16 @@
         </w:tc>
         <w:tc>
           <w:tcPr>
-            <w:tcW w:type="dxa" w:w="1123"/>
-          </w:tcPr>
-          <w:p>
-            <w:pPr>
-              <w:pStyle w:val="Compact"/>
-              <w:jc w:val="left"/>
-            </w:pPr>
-            <w:r>
-              <w:rPr>
-                <w:sz w:val="21"/>
+            <w:tcW w:type="dxa" w:w="1054"/>
+          </w:tcPr>
+          <w:p>
+            <w:pPr>
+              <w:pStyle w:val="Compact"/>
+              <w:jc w:val="left"/>
+            </w:pPr>
+            <w:r>
+              <w:rPr>
+                <w:sz w:val="19"/>
               </w:rPr>
               <w:t xml:space="preserve">Claude</w:t>
             </w:r>
@@ -1857,16 +1857,16 @@
         </w:tc>
         <w:tc>
           <w:tcPr>
-            <w:tcW w:type="dxa" w:w="1996"/>
-          </w:tcPr>
-          <w:p>
-            <w:pPr>
-              <w:pStyle w:val="Compact"/>
-              <w:jc w:val="left"/>
-            </w:pPr>
-            <w:r>
-              <w:rPr>
-                <w:sz w:val="21"/>
+            <w:tcW w:type="dxa" w:w="1992"/>
+          </w:tcPr>
+          <w:p>
+            <w:pPr>
+              <w:pStyle w:val="Compact"/>
+              <w:jc w:val="left"/>
+            </w:pPr>
+            <w:r>
+              <w:rPr>
+                <w:sz w:val="19"/>
               </w:rPr>
               <w:t xml:space="preserve">Check every figure quoted in the documentation against the file it claims to come from, and check that tags and links resolve</w:t>
             </w:r>
@@ -1874,41 +1874,41 @@
         </w:tc>
         <w:tc>
           <w:tcPr>
-            <w:tcW w:type="dxa" w:w="1996"/>
-          </w:tcPr>
-          <w:p>
-            <w:pPr>
-              <w:pStyle w:val="Compact"/>
-              <w:jc w:val="left"/>
-            </w:pPr>
-            <w:r>
-              <w:rPr>
-                <w:sz w:val="21"/>
+            <w:tcW w:type="dxa" w:w="1875"/>
+          </w:tcPr>
+          <w:p>
+            <w:pPr>
+              <w:pStyle w:val="Compact"/>
+              <w:jc w:val="left"/>
+            </w:pPr>
+            <w:r>
+              <w:rPr>
+                <w:sz w:val="19"/>
               </w:rPr>
               <w:t xml:space="preserve">Documentation and</w:t>
             </w:r>
             <w:r>
               <w:rPr>
-                <w:sz w:val="21"/>
+                <w:sz w:val="19"/>
               </w:rPr>
               <w:t xml:space="preserve"> </w:t>
             </w:r>
             <w:r>
               <w:rPr>
                 <w:rStyle w:val="VerbatimChar"/>
-                <w:sz w:val="21"/>
+                <w:sz w:val="19"/>
               </w:rPr>
               <w:t xml:space="preserve">output/</w:t>
             </w:r>
             <w:r>
               <w:rPr>
-                <w:sz w:val="21"/>
+                <w:sz w:val="19"/>
               </w:rPr>
               <w:t xml:space="preserve"> </w:t>
             </w:r>
             <w:r>
               <w:rPr>
-                <w:sz w:val="21"/>
+                <w:sz w:val="19"/>
               </w:rPr>
               <w:t xml:space="preserve">files</w:t>
             </w:r>
@@ -1916,7 +1916,7 @@
         </w:tc>
         <w:tc>
           <w:tcPr>
-            <w:tcW w:type="dxa" w:w="2124"/>
+            <w:tcW w:type="dxa" w:w="2113"/>
           </w:tcPr>
           <w:p>
             <w:pPr>
@@ -1927,19 +1927,19 @@
               <w:rPr>
                 <w:b/>
                 <w:bCs/>
-                <w:sz w:val="21"/>
+                <w:sz w:val="19"/>
               </w:rPr>
               <w:t xml:space="preserve">Accepted after verification.</w:t>
             </w:r>
             <w:r>
               <w:rPr>
-                <w:sz w:val="21"/>
+                <w:sz w:val="19"/>
               </w:rPr>
               <w:t xml:space="preserve"> </w:t>
             </w:r>
             <w:r>
               <w:rPr>
-                <w:sz w:val="21"/>
+                <w:sz w:val="19"/>
               </w:rPr>
               <w:t xml:space="preserve">Corrections were applied only where I confirmed the discrepancy against the recorded output myself.</w:t>
             </w:r>
@@ -1949,16 +1949,16 @@
       <w:tr>
         <w:tc>
           <w:tcPr>
-            <w:tcW w:type="dxa" w:w="2121"/>
-          </w:tcPr>
-          <w:p>
-            <w:pPr>
-              <w:pStyle w:val="Compact"/>
-              <w:jc w:val="left"/>
-            </w:pPr>
-            <w:r>
-              <w:rPr>
-                <w:sz w:val="21"/>
+            <w:tcW w:type="dxa" w:w="1992"/>
+          </w:tcPr>
+          <w:p>
+            <w:pPr>
+              <w:pStyle w:val="Compact"/>
+              <w:jc w:val="left"/>
+            </w:pPr>
+            <w:r>
+              <w:rPr>
+                <w:sz w:val="19"/>
               </w:rPr>
               <w:t xml:space="preserve">19 to 25 Aug 2026</w:t>
             </w:r>
@@ -1966,16 +1966,16 @@
         </w:tc>
         <w:tc>
           <w:tcPr>
-            <w:tcW w:type="dxa" w:w="1123"/>
-          </w:tcPr>
-          <w:p>
-            <w:pPr>
-              <w:pStyle w:val="Compact"/>
-              <w:jc w:val="left"/>
-            </w:pPr>
-            <w:r>
-              <w:rPr>
-                <w:sz w:val="21"/>
+            <w:tcW w:type="dxa" w:w="1054"/>
+          </w:tcPr>
+          <w:p>
+            <w:pPr>
+              <w:pStyle w:val="Compact"/>
+              <w:jc w:val="left"/>
+            </w:pPr>
+            <w:r>
+              <w:rPr>
+                <w:sz w:val="19"/>
               </w:rPr>
               <w:t xml:space="preserve">Claude</w:t>
             </w:r>
@@ -1983,16 +1983,16 @@
         </w:tc>
         <w:tc>
           <w:tcPr>
-            <w:tcW w:type="dxa" w:w="1996"/>
-          </w:tcPr>
-          <w:p>
-            <w:pPr>
-              <w:pStyle w:val="Compact"/>
-              <w:jc w:val="left"/>
-            </w:pPr>
-            <w:r>
-              <w:rPr>
-                <w:sz w:val="21"/>
+            <w:tcW w:type="dxa" w:w="1992"/>
+          </w:tcPr>
+          <w:p>
+            <w:pPr>
+              <w:pStyle w:val="Compact"/>
+              <w:jc w:val="left"/>
+            </w:pPr>
+            <w:r>
+              <w:rPr>
+                <w:sz w:val="19"/>
               </w:rPr>
               <w:t xml:space="preserve">Identify what the validation documentation is missing relative to the proposal commitments</w:t>
             </w:r>
@@ -2000,29 +2000,29 @@
         </w:tc>
         <w:tc>
           <w:tcPr>
-            <w:tcW w:type="dxa" w:w="1996"/>
-          </w:tcPr>
-          <w:p>
-            <w:pPr>
-              <w:pStyle w:val="Compact"/>
-              <w:jc w:val="left"/>
-            </w:pPr>
-            <w:r>
-              <w:rPr>
-                <w:sz w:val="21"/>
+            <w:tcW w:type="dxa" w:w="1875"/>
+          </w:tcPr>
+          <w:p>
+            <w:pPr>
+              <w:pStyle w:val="Compact"/>
+              <w:jc w:val="left"/>
+            </w:pPr>
+            <w:r>
+              <w:rPr>
+                <w:sz w:val="19"/>
               </w:rPr>
               <w:t xml:space="preserve">Validation documentation,</w:t>
             </w:r>
             <w:r>
               <w:rPr>
-                <w:sz w:val="21"/>
+                <w:sz w:val="19"/>
               </w:rPr>
               <w:t xml:space="preserve"> </w:t>
             </w:r>
             <w:r>
               <w:rPr>
                 <w:rStyle w:val="VerbatimChar"/>
-                <w:sz w:val="21"/>
+                <w:sz w:val="19"/>
               </w:rPr>
               <w:t xml:space="preserve">output/</w:t>
             </w:r>
@@ -2030,7 +2030,7 @@
         </w:tc>
         <w:tc>
           <w:tcPr>
-            <w:tcW w:type="dxa" w:w="2124"/>
+            <w:tcW w:type="dxa" w:w="2113"/>
           </w:tcPr>
           <w:p>
             <w:pPr>
@@ -2041,44 +2041,44 @@
               <w:rPr>
                 <w:b/>
                 <w:bCs/>
-                <w:sz w:val="21"/>
+                <w:sz w:val="19"/>
               </w:rPr>
               <w:t xml:space="preserve">Accepted in part.</w:t>
             </w:r>
             <w:r>
               <w:rPr>
-                <w:sz w:val="21"/>
+                <w:sz w:val="19"/>
               </w:rPr>
               <w:t xml:space="preserve"> </w:t>
             </w:r>
             <w:r>
               <w:rPr>
-                <w:sz w:val="21"/>
+                <w:sz w:val="19"/>
               </w:rPr>
               <w:t xml:space="preserve">This identified the absence of aggregate confusion counts, baseline figures, effect sizes and a per-component breakdown. Every value added was recomputed from existing project outputs by scripts in</w:t>
             </w:r>
             <w:r>
               <w:rPr>
-                <w:sz w:val="21"/>
+                <w:sz w:val="19"/>
               </w:rPr>
               <w:t xml:space="preserve"> </w:t>
             </w:r>
             <w:r>
               <w:rPr>
                 <w:rStyle w:val="VerbatimChar"/>
-                <w:sz w:val="21"/>
+                <w:sz w:val="19"/>
               </w:rPr>
               <w:t xml:space="preserve">scripts/</w:t>
             </w:r>
             <w:r>
               <w:rPr>
-                <w:sz w:val="21"/>
+                <w:sz w:val="19"/>
               </w:rPr>
               <w:t xml:space="preserve"> </w:t>
             </w:r>
             <w:r>
               <w:rPr>
-                <w:sz w:val="21"/>
+                <w:sz w:val="19"/>
               </w:rPr>
               <w:t xml:space="preserve">and checked by me.</w:t>
             </w:r>
@@ -2088,16 +2088,16 @@
       <w:tr>
         <w:tc>
           <w:tcPr>
-            <w:tcW w:type="dxa" w:w="2121"/>
-          </w:tcPr>
-          <w:p>
-            <w:pPr>
-              <w:pStyle w:val="Compact"/>
-              <w:jc w:val="left"/>
-            </w:pPr>
-            <w:r>
-              <w:rPr>
-                <w:sz w:val="21"/>
+            <w:tcW w:type="dxa" w:w="1992"/>
+          </w:tcPr>
+          <w:p>
+            <w:pPr>
+              <w:pStyle w:val="Compact"/>
+              <w:jc w:val="left"/>
+            </w:pPr>
+            <w:r>
+              <w:rPr>
+                <w:sz w:val="19"/>
               </w:rPr>
               <w:t xml:space="preserve">19 to 25 Aug 2026</w:t>
             </w:r>
@@ -2105,16 +2105,16 @@
         </w:tc>
         <w:tc>
           <w:tcPr>
-            <w:tcW w:type="dxa" w:w="1123"/>
-          </w:tcPr>
-          <w:p>
-            <w:pPr>
-              <w:pStyle w:val="Compact"/>
-              <w:jc w:val="left"/>
-            </w:pPr>
-            <w:r>
-              <w:rPr>
-                <w:sz w:val="21"/>
+            <w:tcW w:type="dxa" w:w="1054"/>
+          </w:tcPr>
+          <w:p>
+            <w:pPr>
+              <w:pStyle w:val="Compact"/>
+              <w:jc w:val="left"/>
+            </w:pPr>
+            <w:r>
+              <w:rPr>
+                <w:sz w:val="19"/>
               </w:rPr>
               <w:t xml:space="preserve">Claude</w:t>
             </w:r>
@@ -2122,16 +2122,16 @@
         </w:tc>
         <w:tc>
           <w:tcPr>
-            <w:tcW w:type="dxa" w:w="1996"/>
-          </w:tcPr>
-          <w:p>
-            <w:pPr>
-              <w:pStyle w:val="Compact"/>
-              <w:jc w:val="left"/>
-            </w:pPr>
-            <w:r>
-              <w:rPr>
-                <w:sz w:val="21"/>
+            <w:tcW w:type="dxa" w:w="1992"/>
+          </w:tcPr>
+          <w:p>
+            <w:pPr>
+              <w:pStyle w:val="Compact"/>
+              <w:jc w:val="left"/>
+            </w:pPr>
+            <w:r>
+              <w:rPr>
+                <w:sz w:val="19"/>
               </w:rPr>
               <w:t xml:space="preserve">Bounded diagnostic on the fabricated false negatives: is there a feature that separates them</w:t>
             </w:r>
@@ -2139,16 +2139,16 @@
         </w:tc>
         <w:tc>
           <w:tcPr>
-            <w:tcW w:type="dxa" w:w="1996"/>
-          </w:tcPr>
-          <w:p>
-            <w:pPr>
-              <w:pStyle w:val="Compact"/>
-              <w:jc w:val="left"/>
-            </w:pPr>
-            <w:r>
-              <w:rPr>
-                <w:sz w:val="21"/>
+            <w:tcW w:type="dxa" w:w="1875"/>
+          </w:tcPr>
+          <w:p>
+            <w:pPr>
+              <w:pStyle w:val="Compact"/>
+              <w:jc w:val="left"/>
+            </w:pPr>
+            <w:r>
+              <w:rPr>
+                <w:sz w:val="19"/>
               </w:rPr>
               <w:t xml:space="preserve">Development seeds 11 and 42 only, synthetic</w:t>
             </w:r>
@@ -2156,7 +2156,7 @@
         </w:tc>
         <w:tc>
           <w:tcPr>
-            <w:tcW w:type="dxa" w:w="2124"/>
+            <w:tcW w:type="dxa" w:w="2113"/>
           </w:tcPr>
           <w:p>
             <w:pPr>
@@ -2167,44 +2167,44 @@
               <w:rPr>
                 <w:b/>
                 <w:bCs/>
-                <w:sz w:val="21"/>
+                <w:sz w:val="19"/>
               </w:rPr>
               <w:t xml:space="preserve">Accepted as diagnosis, rejected as a change.</w:t>
             </w:r>
             <w:r>
               <w:rPr>
-                <w:sz w:val="21"/>
+                <w:sz w:val="19"/>
               </w:rPr>
               <w:t xml:space="preserve"> </w:t>
             </w:r>
             <w:r>
               <w:rPr>
-                <w:sz w:val="21"/>
+                <w:sz w:val="19"/>
               </w:rPr>
               <w:t xml:space="preserve">The finding that entropy separates the missed cases completely is reported in section 6.6 of the report. The threshold correction it motivated was developed, evaluated once, and deliberately not merged; it remains on a separate branch. No threshold on</w:t>
             </w:r>
             <w:r>
               <w:rPr>
-                <w:sz w:val="21"/>
+                <w:sz w:val="19"/>
               </w:rPr>
               <w:t xml:space="preserve"> </w:t>
             </w:r>
             <w:r>
               <w:rPr>
                 <w:rStyle w:val="VerbatimChar"/>
-                <w:sz w:val="21"/>
+                <w:sz w:val="19"/>
               </w:rPr>
               <w:t xml:space="preserve">main</w:t>
             </w:r>
             <w:r>
               <w:rPr>
-                <w:sz w:val="21"/>
+                <w:sz w:val="19"/>
               </w:rPr>
               <w:t xml:space="preserve"> </w:t>
             </w:r>
             <w:r>
               <w:rPr>
-                <w:sz w:val="21"/>
+                <w:sz w:val="19"/>
               </w:rPr>
               <w:t xml:space="preserve">was changed.</w:t>
             </w:r>
@@ -2214,16 +2214,16 @@
       <w:tr>
         <w:tc>
           <w:tcPr>
-            <w:tcW w:type="dxa" w:w="2121"/>
-          </w:tcPr>
-          <w:p>
-            <w:pPr>
-              <w:pStyle w:val="Compact"/>
-              <w:jc w:val="left"/>
-            </w:pPr>
-            <w:r>
-              <w:rPr>
-                <w:sz w:val="21"/>
+            <w:tcW w:type="dxa" w:w="1992"/>
+          </w:tcPr>
+          <w:p>
+            <w:pPr>
+              <w:pStyle w:val="Compact"/>
+              <w:jc w:val="left"/>
+            </w:pPr>
+            <w:r>
+              <w:rPr>
+                <w:sz w:val="19"/>
               </w:rPr>
               <w:t xml:space="preserve">25 Aug to 5 Sep 2026</w:t>
             </w:r>
@@ -2231,16 +2231,16 @@
         </w:tc>
         <w:tc>
           <w:tcPr>
-            <w:tcW w:type="dxa" w:w="1123"/>
-          </w:tcPr>
-          <w:p>
-            <w:pPr>
-              <w:pStyle w:val="Compact"/>
-              <w:jc w:val="left"/>
-            </w:pPr>
-            <w:r>
-              <w:rPr>
-                <w:sz w:val="21"/>
+            <w:tcW w:type="dxa" w:w="1054"/>
+          </w:tcPr>
+          <w:p>
+            <w:pPr>
+              <w:pStyle w:val="Compact"/>
+              <w:jc w:val="left"/>
+            </w:pPr>
+            <w:r>
+              <w:rPr>
+                <w:sz w:val="19"/>
               </w:rPr>
               <w:t xml:space="preserve">Claude</w:t>
             </w:r>
@@ -2248,16 +2248,16 @@
         </w:tc>
         <w:tc>
           <w:tcPr>
-            <w:tcW w:type="dxa" w:w="1996"/>
-          </w:tcPr>
-          <w:p>
-            <w:pPr>
-              <w:pStyle w:val="Compact"/>
-              <w:jc w:val="left"/>
-            </w:pPr>
-            <w:r>
-              <w:rPr>
-                <w:sz w:val="21"/>
+            <w:tcW w:type="dxa" w:w="1992"/>
+          </w:tcPr>
+          <w:p>
+            <w:pPr>
+              <w:pStyle w:val="Compact"/>
+              <w:jc w:val="left"/>
+            </w:pPr>
+            <w:r>
+              <w:rPr>
+                <w:sz w:val="19"/>
               </w:rPr>
               <w:t xml:space="preserve">Locate stale or contradictory wording across the report, validation document and presentation; assemble front matter, figures and appendices</w:t>
             </w:r>
@@ -2265,41 +2265,41 @@
         </w:tc>
         <w:tc>
           <w:tcPr>
-            <w:tcW w:type="dxa" w:w="1996"/>
-          </w:tcPr>
-          <w:p>
-            <w:pPr>
-              <w:pStyle w:val="Compact"/>
-              <w:jc w:val="left"/>
-            </w:pPr>
-            <w:r>
-              <w:rPr>
-                <w:sz w:val="21"/>
+            <w:tcW w:type="dxa" w:w="1875"/>
+          </w:tcPr>
+          <w:p>
+            <w:pPr>
+              <w:pStyle w:val="Compact"/>
+              <w:jc w:val="left"/>
+            </w:pPr>
+            <w:r>
+              <w:rPr>
+                <w:sz w:val="19"/>
               </w:rPr>
               <w:t xml:space="preserve">Documentation and</w:t>
             </w:r>
             <w:r>
               <w:rPr>
-                <w:sz w:val="21"/>
+                <w:sz w:val="19"/>
               </w:rPr>
               <w:t xml:space="preserve"> </w:t>
             </w:r>
             <w:r>
               <w:rPr>
                 <w:rStyle w:val="VerbatimChar"/>
-                <w:sz w:val="21"/>
+                <w:sz w:val="19"/>
               </w:rPr>
               <w:t xml:space="preserve">output/</w:t>
             </w:r>
             <w:r>
               <w:rPr>
-                <w:sz w:val="21"/>
+                <w:sz w:val="19"/>
               </w:rPr>
               <w:t xml:space="preserve"> </w:t>
             </w:r>
             <w:r>
               <w:rPr>
-                <w:sz w:val="21"/>
+                <w:sz w:val="19"/>
               </w:rPr>
               <w:t xml:space="preserve">files</w:t>
             </w:r>
@@ -2307,7 +2307,7 @@
         </w:tc>
         <w:tc>
           <w:tcPr>
-            <w:tcW w:type="dxa" w:w="2124"/>
+            <w:tcW w:type="dxa" w:w="2113"/>
           </w:tcPr>
           <w:p>
             <w:pPr>
@@ -2318,44 +2318,44 @@
               <w:rPr>
                 <w:b/>
                 <w:bCs/>
-                <w:sz w:val="21"/>
+                <w:sz w:val="19"/>
               </w:rPr>
               <w:t xml:space="preserve">Modified.</w:t>
             </w:r>
             <w:r>
               <w:rPr>
-                <w:sz w:val="21"/>
+                <w:sz w:val="19"/>
               </w:rPr>
               <w:t xml:space="preserve"> </w:t>
             </w:r>
             <w:r>
               <w:rPr>
-                <w:sz w:val="21"/>
+                <w:sz w:val="19"/>
               </w:rPr>
               <w:t xml:space="preserve">Corrections were made against recorded outputs. The report figures are generated by</w:t>
             </w:r>
             <w:r>
               <w:rPr>
-                <w:sz w:val="21"/>
+                <w:sz w:val="19"/>
               </w:rPr>
               <w:t xml:space="preserve"> </w:t>
             </w:r>
             <w:r>
               <w:rPr>
                 <w:rStyle w:val="VerbatimChar"/>
-                <w:sz w:val="21"/>
+                <w:sz w:val="19"/>
               </w:rPr>
               <w:t xml:space="preserve">scripts/build_report_figures.py</w:t>
             </w:r>
             <w:r>
               <w:rPr>
-                <w:sz w:val="21"/>
+                <w:sz w:val="19"/>
               </w:rPr>
               <w:t xml:space="preserve"> </w:t>
             </w:r>
             <w:r>
               <w:rPr>
-                <w:sz w:val="21"/>
+                <w:sz w:val="19"/>
               </w:rPr>
               <w:t xml:space="preserve">from values transcribed from recorded output files, and I checked each plotted value against its source.</w:t>
             </w:r>
@@ -2365,16 +2365,16 @@
       <w:tr>
         <w:tc>
           <w:tcPr>
-            <w:tcW w:type="dxa" w:w="2121"/>
-          </w:tcPr>
-          <w:p>
-            <w:pPr>
-              <w:pStyle w:val="Compact"/>
-              <w:jc w:val="left"/>
-            </w:pPr>
-            <w:r>
-              <w:rPr>
-                <w:sz w:val="21"/>
+            <w:tcW w:type="dxa" w:w="1992"/>
+          </w:tcPr>
+          <w:p>
+            <w:pPr>
+              <w:pStyle w:val="Compact"/>
+              <w:jc w:val="left"/>
+            </w:pPr>
+            <w:r>
+              <w:rPr>
+                <w:sz w:val="19"/>
               </w:rPr>
               <w:t xml:space="preserve">10 to 16 Sep 2026</w:t>
             </w:r>
@@ -2382,16 +2382,16 @@
         </w:tc>
         <w:tc>
           <w:tcPr>
-            <w:tcW w:type="dxa" w:w="1123"/>
-          </w:tcPr>
-          <w:p>
-            <w:pPr>
-              <w:pStyle w:val="Compact"/>
-              <w:jc w:val="left"/>
-            </w:pPr>
-            <w:r>
-              <w:rPr>
-                <w:sz w:val="21"/>
+            <w:tcW w:type="dxa" w:w="1054"/>
+          </w:tcPr>
+          <w:p>
+            <w:pPr>
+              <w:pStyle w:val="Compact"/>
+              <w:jc w:val="left"/>
+            </w:pPr>
+            <w:r>
+              <w:rPr>
+                <w:sz w:val="19"/>
               </w:rPr>
               <w:t xml:space="preserve">Claude Code (Claude Opus 5)</w:t>
             </w:r>
@@ -2399,16 +2399,16 @@
         </w:tc>
         <w:tc>
           <w:tcPr>
-            <w:tcW w:type="dxa" w:w="1996"/>
-          </w:tcPr>
-          <w:p>
-            <w:pPr>
-              <w:pStyle w:val="Compact"/>
-              <w:jc w:val="left"/>
-            </w:pPr>
-            <w:r>
-              <w:rPr>
-                <w:sz w:val="21"/>
+            <w:tcW w:type="dxa" w:w="1992"/>
+          </w:tcPr>
+          <w:p>
+            <w:pPr>
+              <w:pStyle w:val="Compact"/>
+              <w:jc w:val="left"/>
+            </w:pPr>
+            <w:r>
+              <w:rPr>
+                <w:sz w:val="19"/>
               </w:rPr>
               <w:t xml:space="preserve">Check every reference against its primary source, obtain and read the open-access full texts, and rebuild section 2 from them; draft the corrections the supervisor's review required</w:t>
             </w:r>
@@ -2416,16 +2416,16 @@
         </w:tc>
         <w:tc>
           <w:tcPr>
-            <w:tcW w:type="dxa" w:w="1996"/>
-          </w:tcPr>
-          <w:p>
-            <w:pPr>
-              <w:pStyle w:val="Compact"/>
-              <w:jc w:val="left"/>
-            </w:pPr>
-            <w:r>
-              <w:rPr>
-                <w:sz w:val="21"/>
+            <w:tcW w:type="dxa" w:w="1875"/>
+          </w:tcPr>
+          <w:p>
+            <w:pPr>
+              <w:pStyle w:val="Compact"/>
+              <w:jc w:val="left"/>
+            </w:pPr>
+            <w:r>
+              <w:rPr>
+                <w:sz w:val="19"/>
               </w:rPr>
               <w:t xml:space="preserve">The repository, the report, and public sources fetched from the web</w:t>
             </w:r>
@@ -2433,7 +2433,7 @@
         </w:tc>
         <w:tc>
           <w:tcPr>
-            <w:tcW w:type="dxa" w:w="2124"/>
+            <w:tcW w:type="dxa" w:w="2113"/>
           </w:tcPr>
           <w:p>
             <w:pPr>
@@ -2444,21 +2444,21 @@
               <w:rPr>
                 <w:b/>
                 <w:bCs/>
-                <w:sz w:val="21"/>
+                <w:sz w:val="19"/>
               </w:rPr>
               <w:t xml:space="preserve">Modified.</w:t>
             </w:r>
             <w:r>
               <w:rPr>
-                <w:sz w:val="21"/>
+                <w:sz w:val="19"/>
               </w:rPr>
               <w:t xml:space="preserve"> </w:t>
             </w:r>
             <w:r>
               <w:rPr>
-                <w:sz w:val="21"/>
-              </w:rPr>
-              <w:t xml:space="preserve">The tool carried out the bibliographic checks, read the sources that were obtainable, and drafted the rebuilt literature review, the comparison in section 7, appendices E and F and the reflection in section 9.1. Appendix E of the report records how far each source was verified; no claim in section 2 rests on a source listed there as abstract-level or not consulted. The drafted prose is mine to read, correct and endorse before submission.</w:t>
+                <w:sz w:val="19"/>
+              </w:rPr>
+              <w:t xml:space="preserve">The tool carried out the bibliographic checks, read the sources that were obtainable, and drafted the rebuilt literature review, the comparison in section 7, appendices E and F and the reflection in section 9.2. Appendix E of the report records how far each source was verified; no claim in section 2 rests on a source listed there as abstract-level or not consulted. The drafted prose is mine to read, correct and endorse before submission.</w:t>
             </w:r>
           </w:p>
         </w:tc>
@@ -2466,16 +2466,16 @@
       <w:tr>
         <w:tc>
           <w:tcPr>
-            <w:tcW w:type="dxa" w:w="2121"/>
-          </w:tcPr>
-          <w:p>
-            <w:pPr>
-              <w:pStyle w:val="Compact"/>
-              <w:jc w:val="left"/>
-            </w:pPr>
-            <w:r>
-              <w:rPr>
-                <w:sz w:val="21"/>
+            <w:tcW w:type="dxa" w:w="1992"/>
+          </w:tcPr>
+          <w:p>
+            <w:pPr>
+              <w:pStyle w:val="Compact"/>
+              <w:jc w:val="left"/>
+            </w:pPr>
+            <w:r>
+              <w:rPr>
+                <w:sz w:val="19"/>
               </w:rPr>
               <w:t xml:space="preserve">10 to 16 Sep 2026</w:t>
             </w:r>
@@ -2483,16 +2483,16 @@
         </w:tc>
         <w:tc>
           <w:tcPr>
-            <w:tcW w:type="dxa" w:w="1123"/>
-          </w:tcPr>
-          <w:p>
-            <w:pPr>
-              <w:pStyle w:val="Compact"/>
-              <w:jc w:val="left"/>
-            </w:pPr>
-            <w:r>
-              <w:rPr>
-                <w:sz w:val="21"/>
+            <w:tcW w:type="dxa" w:w="1054"/>
+          </w:tcPr>
+          <w:p>
+            <w:pPr>
+              <w:pStyle w:val="Compact"/>
+              <w:jc w:val="left"/>
+            </w:pPr>
+            <w:r>
+              <w:rPr>
+                <w:sz w:val="19"/>
               </w:rPr>
               <w:t xml:space="preserve">Claude Code (Claude Opus 5)</w:t>
             </w:r>
@@ -2500,16 +2500,16 @@
         </w:tc>
         <w:tc>
           <w:tcPr>
-            <w:tcW w:type="dxa" w:w="1996"/>
-          </w:tcPr>
-          <w:p>
-            <w:pPr>
-              <w:pStyle w:val="Compact"/>
-              <w:jc w:val="left"/>
-            </w:pPr>
-            <w:r>
-              <w:rPr>
-                <w:sz w:val="21"/>
+            <w:tcW w:type="dxa" w:w="1992"/>
+          </w:tcPr>
+          <w:p>
+            <w:pPr>
+              <w:pStyle w:val="Compact"/>
+              <w:jc w:val="left"/>
+            </w:pPr>
+            <w:r>
+              <w:rPr>
+                <w:sz w:val="19"/>
               </w:rPr>
               <w:t xml:space="preserve">Make the fence multiplier configurable, add the regression tests the review found missing, and build the baseline, platform parity and memory analyses it asked for</w:t>
             </w:r>
@@ -2517,16 +2517,16 @@
         </w:tc>
         <w:tc>
           <w:tcPr>
-            <w:tcW w:type="dxa" w:w="1996"/>
-          </w:tcPr>
-          <w:p>
-            <w:pPr>
-              <w:pStyle w:val="Compact"/>
-              <w:jc w:val="left"/>
-            </w:pPr>
-            <w:r>
-              <w:rPr>
-                <w:sz w:val="21"/>
+            <w:tcW w:type="dxa" w:w="1875"/>
+          </w:tcPr>
+          <w:p>
+            <w:pPr>
+              <w:pStyle w:val="Compact"/>
+              <w:jc w:val="left"/>
+            </w:pPr>
+            <w:r>
+              <w:rPr>
+                <w:sz w:val="19"/>
               </w:rPr>
               <w:t xml:space="preserve">The repository</w:t>
             </w:r>
@@ -2534,7 +2534,7 @@
         </w:tc>
         <w:tc>
           <w:tcPr>
-            <w:tcW w:type="dxa" w:w="2124"/>
+            <w:tcW w:type="dxa" w:w="2113"/>
           </w:tcPr>
           <w:p>
             <w:pPr>
@@ -2545,21 +2545,65 @@
               <w:rPr>
                 <w:b/>
                 <w:bCs/>
-                <w:sz w:val="21"/>
+                <w:sz w:val="19"/>
               </w:rPr>
               <w:t xml:space="preserve">Accepted after verification.</w:t>
             </w:r>
             <w:r>
               <w:rPr>
-                <w:sz w:val="21"/>
+                <w:sz w:val="19"/>
               </w:rPr>
               <w:t xml:space="preserve"> </w:t>
             </w:r>
             <w:r>
               <w:rPr>
-                <w:sz w:val="21"/>
-              </w:rPr>
-              <w:t xml:space="preserve">Every change is covered by a test or reproduces a recorded output: the suite is now forty-two tests, the baseline script reproduces Table 3 of the report exactly, the platform parity check is anchored to a SurveyCTO rendering that is byte-identical to the file the robustness round evaluated, and the whole of Appendix D was run in a clean environment with every recorded number reproducing.</w:t>
+                <w:sz w:val="19"/>
+              </w:rPr>
+              <w:t xml:space="preserve">Every change is covered by a test or reproduces a recorded output: the suite reached forty-three tests at</w:t>
+            </w:r>
+            <w:r>
+              <w:rPr>
+                <w:sz w:val="19"/>
+              </w:rPr>
+              <w:t xml:space="preserve"> </w:t>
+            </w:r>
+            <w:r>
+              <w:rPr>
+                <w:rStyle w:val="VerbatimChar"/>
+                <w:sz w:val="19"/>
+              </w:rPr>
+              <w:t xml:space="preserve">v-resubmission</w:t>
+            </w:r>
+            <w:r>
+              <w:rPr>
+                <w:sz w:val="19"/>
+              </w:rPr>
+              <w:t xml:space="preserve"> </w:t>
+            </w:r>
+            <w:r>
+              <w:rPr>
+                <w:sz w:val="19"/>
+              </w:rPr>
+              <w:t xml:space="preserve">and forty-four at</w:t>
+            </w:r>
+            <w:r>
+              <w:rPr>
+                <w:sz w:val="19"/>
+              </w:rPr>
+              <w:t xml:space="preserve"> </w:t>
+            </w:r>
+            <w:r>
+              <w:rPr>
+                <w:rStyle w:val="VerbatimChar"/>
+                <w:sz w:val="19"/>
+              </w:rPr>
+              <w:t xml:space="preserve">v-final-release</w:t>
+            </w:r>
+            <w:r>
+              <w:rPr>
+                <w:sz w:val="19"/>
+              </w:rPr>
+              <w:t xml:space="preserve">, the baseline script reproduces Table 3 of the report exactly, the platform parity check is anchored to a SurveyCTO rendering that is byte-identical to the file the robustness round evaluated, and the whole of Appendix D was run in a clean environment with every recorded number reproducing.</w:t>
             </w:r>
           </w:p>
         </w:tc>
@@ -2567,16 +2611,16 @@
       <w:tr>
         <w:tc>
           <w:tcPr>
-            <w:tcW w:type="dxa" w:w="2121"/>
-          </w:tcPr>
-          <w:p>
-            <w:pPr>
-              <w:pStyle w:val="Compact"/>
-              <w:jc w:val="left"/>
-            </w:pPr>
-            <w:r>
-              <w:rPr>
-                <w:sz w:val="21"/>
+            <w:tcW w:type="dxa" w:w="1992"/>
+          </w:tcPr>
+          <w:p>
+            <w:pPr>
+              <w:pStyle w:val="Compact"/>
+              <w:jc w:val="left"/>
+            </w:pPr>
+            <w:r>
+              <w:rPr>
+                <w:sz w:val="19"/>
               </w:rPr>
               <w:t xml:space="preserve">21 to 22 Sep 2026</w:t>
             </w:r>
@@ -2584,16 +2628,16 @@
         </w:tc>
         <w:tc>
           <w:tcPr>
-            <w:tcW w:type="dxa" w:w="1123"/>
-          </w:tcPr>
-          <w:p>
-            <w:pPr>
-              <w:pStyle w:val="Compact"/>
-              <w:jc w:val="left"/>
-            </w:pPr>
-            <w:r>
-              <w:rPr>
-                <w:sz w:val="21"/>
+            <w:tcW w:type="dxa" w:w="1054"/>
+          </w:tcPr>
+          <w:p>
+            <w:pPr>
+              <w:pStyle w:val="Compact"/>
+              <w:jc w:val="left"/>
+            </w:pPr>
+            <w:r>
+              <w:rPr>
+                <w:sz w:val="19"/>
               </w:rPr>
               <w:t xml:space="preserve">Claude Code (Claude Opus 5)</w:t>
             </w:r>
@@ -2601,41 +2645,41 @@
         </w:tc>
         <w:tc>
           <w:tcPr>
-            <w:tcW w:type="dxa" w:w="1996"/>
-          </w:tcPr>
-          <w:p>
-            <w:pPr>
-              <w:pStyle w:val="Compact"/>
-              <w:jc w:val="left"/>
-            </w:pPr>
-            <w:r>
-              <w:rPr>
-                <w:sz w:val="21"/>
+            <w:tcW w:type="dxa" w:w="1992"/>
+          </w:tcPr>
+          <w:p>
+            <w:pPr>
+              <w:pStyle w:val="Compact"/>
+              <w:jc w:val="left"/>
+            </w:pPr>
+            <w:r>
+              <w:rPr>
+                <w:sz w:val="19"/>
               </w:rPr>
               <w:t xml:space="preserve">Pin the two packages Appendix D needed, measure the prevalence envelope beyond thirty percent, carry the entropy fence onto</w:t>
             </w:r>
             <w:r>
               <w:rPr>
-                <w:sz w:val="21"/>
+                <w:sz w:val="19"/>
               </w:rPr>
               <w:t xml:space="preserve"> </w:t>
             </w:r>
             <w:r>
               <w:rPr>
                 <w:rStyle w:val="VerbatimChar"/>
-                <w:sz w:val="21"/>
+                <w:sz w:val="19"/>
               </w:rPr>
               <w:t xml:space="preserve">main</w:t>
             </w:r>
             <w:r>
               <w:rPr>
-                <w:sz w:val="21"/>
+                <w:sz w:val="19"/>
               </w:rPr>
               <w:t xml:space="preserve"> </w:t>
             </w:r>
             <w:r>
               <w:rPr>
-                <w:sz w:val="21"/>
+                <w:sz w:val="19"/>
               </w:rPr>
               <w:t xml:space="preserve">as an option that is off by default, and repeat the check of every reference, both that it exists and that it supports the claim it is cited for, against the full text wherever one could be obtained</w:t>
             </w:r>
@@ -2643,16 +2687,16 @@
         </w:tc>
         <w:tc>
           <w:tcPr>
-            <w:tcW w:type="dxa" w:w="1996"/>
-          </w:tcPr>
-          <w:p>
-            <w:pPr>
-              <w:pStyle w:val="Compact"/>
-              <w:jc w:val="left"/>
-            </w:pPr>
-            <w:r>
-              <w:rPr>
-                <w:sz w:val="21"/>
+            <w:tcW w:type="dxa" w:w="1875"/>
+          </w:tcPr>
+          <w:p>
+            <w:pPr>
+              <w:pStyle w:val="Compact"/>
+              <w:jc w:val="left"/>
+            </w:pPr>
+            <w:r>
+              <w:rPr>
+                <w:sz w:val="19"/>
               </w:rPr>
               <w:t xml:space="preserve">The repository, the Crossref registry, Open Library and the cited web pages</w:t>
             </w:r>
@@ -2660,7 +2704,7 @@
         </w:tc>
         <w:tc>
           <w:tcPr>
-            <w:tcW w:type="dxa" w:w="2124"/>
+            <w:tcW w:type="dxa" w:w="2113"/>
           </w:tcPr>
           <w:p>
             <w:pPr>
@@ -2671,21 +2715,135 @@
               <w:rPr>
                 <w:b/>
                 <w:bCs/>
-                <w:sz w:val="21"/>
+                <w:sz w:val="19"/>
               </w:rPr>
               <w:t xml:space="preserve">Accepted after verification.</w:t>
             </w:r>
             <w:r>
               <w:rPr>
-                <w:sz w:val="21"/>
+                <w:sz w:val="19"/>
               </w:rPr>
               <w:t xml:space="preserve"> </w:t>
             </w:r>
             <w:r>
               <w:rPr>
-                <w:sz w:val="21"/>
+                <w:sz w:val="19"/>
               </w:rPr>
               <w:t xml:space="preserve">The envelope script reproduces Table 5 exactly at the prevalences they share, and its eighty runs were made in the pinned environment; the mechanism described in section 6.4 was read from the flags recorded against each interview. With the fence off, the full robustness round reproduces its committed table exactly; with it on, every held-out figure recorded on the branch reproduces exactly. The limitation text in sections 6.4 and 8 was drafted by the tool and revised by me. The reference recheck found two entries not cited in the text, Hawkins (1980) and Tukey (1977), now removed from the list; citations that claimed more than the source supports, for Couper (1998), Yan and Tourangeau (2008), Zhang and Conrad (2014), Hoogeveen and Pape (2020), Iglewicz and Hoaglin (1993), Japkowicz and Stephen (2002), Kreuter (2013) and the three falsification papers cited in section 1.1; and wrong pinpoints for Birnbaum et al., Chandola et al., Goel et al. and Hodge and Austin. Each correction was checked against the source text and is recorded in Appendix E.</w:t>
+            </w:r>
+          </w:p>
+        </w:tc>
+      </w:tr>
+      <w:tr>
+        <w:tc>
+          <w:tcPr>
+            <w:tcW w:type="dxa" w:w="1992"/>
+          </w:tcPr>
+          <w:p>
+            <w:pPr>
+              <w:pStyle w:val="Compact"/>
+              <w:jc w:val="left"/>
+            </w:pPr>
+            <w:r>
+              <w:rPr>
+                <w:sz w:val="19"/>
+              </w:rPr>
+              <w:t xml:space="preserve">17 to 21 Oct 2026</w:t>
+            </w:r>
+          </w:p>
+        </w:tc>
+        <w:tc>
+          <w:tcPr>
+            <w:tcW w:type="dxa" w:w="1054"/>
+          </w:tcPr>
+          <w:p>
+            <w:pPr>
+              <w:pStyle w:val="Compact"/>
+              <w:jc w:val="left"/>
+            </w:pPr>
+            <w:r>
+              <w:rPr>
+                <w:sz w:val="19"/>
+              </w:rPr>
+              <w:t xml:space="preserve">Claude Code (Claude Opus 5.5)</w:t>
+            </w:r>
+          </w:p>
+        </w:tc>
+        <w:tc>
+          <w:tcPr>
+            <w:tcW w:type="dxa" w:w="1992"/>
+          </w:tcPr>
+          <w:p>
+            <w:pPr>
+              <w:pStyle w:val="Compact"/>
+              <w:jc w:val="left"/>
+            </w:pPr>
+            <w:r>
+              <w:rPr>
+                <w:sz w:val="19"/>
+              </w:rPr>
+              <w:t xml:space="preserve">Bring the report to the 2026 template, reconcile the test and package counts with the tagged state, draft a requirements section and an evaluation against the objectives from the proposal, verify the two CRISP-DM sources used on the slides, and re-run Appendix D at</w:t>
+            </w:r>
+            <w:r>
+              <w:rPr>
+                <w:sz w:val="19"/>
+              </w:rPr>
+              <w:t xml:space="preserve"> </w:t>
+            </w:r>
+            <w:r>
+              <w:rPr>
+                <w:rStyle w:val="VerbatimChar"/>
+                <w:sz w:val="19"/>
+              </w:rPr>
+              <w:t xml:space="preserve">v-final-release</w:t>
+            </w:r>
+          </w:p>
+        </w:tc>
+        <w:tc>
+          <w:tcPr>
+            <w:tcW w:type="dxa" w:w="1875"/>
+          </w:tcPr>
+          <w:p>
+            <w:pPr>
+              <w:pStyle w:val="Compact"/>
+              <w:jc w:val="left"/>
+            </w:pPr>
+            <w:r>
+              <w:rPr>
+                <w:sz w:val="19"/>
+              </w:rPr>
+              <w:t xml:space="preserve">The repository, the proposal, and the two CRISP-DM sources fetched from the web</w:t>
+            </w:r>
+          </w:p>
+        </w:tc>
+        <w:tc>
+          <w:tcPr>
+            <w:tcW w:type="dxa" w:w="2113"/>
+          </w:tcPr>
+          <w:p>
+            <w:pPr>
+              <w:pStyle w:val="Compact"/>
+              <w:jc w:val="left"/>
+            </w:pPr>
+            <w:r>
+              <w:rPr>
+                <w:b/>
+                <w:bCs/>
+                <w:sz w:val="19"/>
+              </w:rPr>
+              <w:t xml:space="preserve">Reviewed, revised and endorsed on 19 Oct 2026.</w:t>
+            </w:r>
+            <w:r>
+              <w:rPr>
+                <w:sz w:val="19"/>
+              </w:rPr>
+              <w:t xml:space="preserve"> </w:t>
+            </w:r>
+            <w:r>
+              <w:rPr>
+                <w:sz w:val="19"/>
+              </w:rPr>
+              <w:t xml:space="preserve">The tool drafted section 1.5, section 9.1 with Table 9, the paragraph on CRISP-DM in section 3, the restated argument in section 2.4, the list of abbreviations, the shortened abstract and the title page lines, corrected the counts in sections 4, A.3, A.4 and A.6, and later added the five results-site tests named in section 4 and re-ran Appendix D at the final tag, recording that run in Appendix D. No pipeline code and no result changed. I reviewed and revised the prose and checked the factual statements against the report and its recorded outputs before endorsing it.</w:t>
             </w:r>
           </w:p>
         </w:tc>
@@ -2958,43 +3116,49 @@
         <w:t xml:space="preserve"> </w:t>
       </w:r>
       <w:r>
-        <w:t xml:space="preserve">appendices E and F and the reflection in section 9.1, wrote the three analysis</w:t>
-      </w:r>
-      <w:r>
-        <w:t xml:space="preserve"> </w:t>
-      </w:r>
-      <w:r>
-        <w:t xml:space="preserve">scripts and the regression tests added in section 4, and applied the</w:t>
-      </w:r>
-      <w:r>
-        <w:t xml:space="preserve"> </w:t>
-      </w:r>
-      <w:r>
-        <w:t xml:space="preserve">corrections the supervisor's review listed. Two boundaries were held</w:t>
-      </w:r>
-      <w:r>
-        <w:t xml:space="preserve"> </w:t>
-      </w:r>
-      <w:r>
-        <w:t xml:space="preserve">throughout. No claim was written about a source that had not been read: where</w:t>
-      </w:r>
-      <w:r>
-        <w:t xml:space="preserve"> </w:t>
-      </w:r>
-      <w:r>
-        <w:t xml:space="preserve">a source could not be obtained, Appendix E says so and the claim is held at</w:t>
-      </w:r>
-      <w:r>
-        <w:t xml:space="preserve"> </w:t>
-      </w:r>
-      <w:r>
-        <w:t xml:space="preserve">the level the abstract or publisher record supports. And no number was taken</w:t>
-      </w:r>
-      <w:r>
-        <w:t xml:space="preserve"> </w:t>
-      </w:r>
-      <w:r>
-        <w:t xml:space="preserve">on trust: every figure in the new tables is reproduced from a file under</w:t>
+        <w:t xml:space="preserve">appendices E and F and an earlier version of the reflection in section 9.2,</w:t>
+      </w:r>
+      <w:r>
+        <w:t xml:space="preserve"> </w:t>
+      </w:r>
+      <w:r>
+        <w:t xml:space="preserve">since rewritten by me, wrote the three analysis scripts and the regression</w:t>
+      </w:r>
+      <w:r>
+        <w:t xml:space="preserve"> </w:t>
+      </w:r>
+      <w:r>
+        <w:t xml:space="preserve">tests added in section 4, and applied the corrections the supervisor's review</w:t>
+      </w:r>
+      <w:r>
+        <w:t xml:space="preserve"> </w:t>
+      </w:r>
+      <w:r>
+        <w:t xml:space="preserve">listed. Two boundaries were held throughout. No claim was written about a</w:t>
+      </w:r>
+      <w:r>
+        <w:t xml:space="preserve"> </w:t>
+      </w:r>
+      <w:r>
+        <w:t xml:space="preserve">source that had not been read: where a source could not be obtained, Appendix</w:t>
+      </w:r>
+      <w:r>
+        <w:t xml:space="preserve"> </w:t>
+      </w:r>
+      <w:r>
+        <w:t xml:space="preserve">E says so and the claim is held at the level the abstract or publisher record</w:t>
+      </w:r>
+      <w:r>
+        <w:t xml:space="preserve"> </w:t>
+      </w:r>
+      <w:r>
+        <w:t xml:space="preserve">supports. And no number was taken on trust: every figure in the new tables is</w:t>
+      </w:r>
+      <w:r>
+        <w:t xml:space="preserve"> </w:t>
+      </w:r>
+      <w:r>
+        <w:t xml:space="preserve">reproduced from a file under</w:t>
       </w:r>
       <w:r>
         <w:t xml:space="preserve"> </w:t>
@@ -3006,25 +3170,65 @@
         <w:t xml:space="preserve">output/</w:t>
       </w:r>
       <w:r>
-        <w:t xml:space="preserve">, and the whole of Appendix D was re-run in a clean environment to</w:t>
-      </w:r>
-      <w:r>
-        <w:t xml:space="preserve"> </w:t>
-      </w:r>
-      <w:r>
-        <w:t xml:space="preserve">confirm it. What remains mine is the obligation to read the drafted prose,</w:t>
-      </w:r>
-      <w:r>
-        <w:t xml:space="preserve"> </w:t>
-      </w:r>
-      <w:r>
-        <w:t xml:space="preserve">confirm that it says what I am prepared to defend, and obtain the nine sources</w:t>
-      </w:r>
-      <w:r>
-        <w:t xml:space="preserve"> </w:t>
-      </w:r>
-      <w:r>
-        <w:t xml:space="preserve">still listed in Appendix E as unread.</w:t>
+        <w:t xml:space="preserve">, and the whole of Appendix D was re-run</w:t>
+      </w:r>
+      <w:r>
+        <w:t xml:space="preserve"> </w:t>
+      </w:r>
+      <w:r>
+        <w:t xml:space="preserve">in a clean environment to confirm it.</w:t>
+      </w:r>
+      <w:r>
+        <w:t xml:space="preserve"> </w:t>
+      </w:r>
+      <w:r>
+        <w:rPr>
+          <w:b/>
+          <w:bCs/>
+        </w:rPr>
+        <w:t xml:space="preserve">Endorsement, 19 October 2026:</w:t>
+      </w:r>
+      <w:r>
+        <w:t xml:space="preserve"> </w:t>
+      </w:r>
+      <w:r>
+        <w:t xml:space="preserve">I have</w:t>
+      </w:r>
+      <w:r>
+        <w:t xml:space="preserve"> </w:t>
+      </w:r>
+      <w:r>
+        <w:t xml:space="preserve">read and revised the AI-drafted prose in this report, including sections 1.5</w:t>
+      </w:r>
+      <w:r>
+        <w:t xml:space="preserve"> </w:t>
+      </w:r>
+      <w:r>
+        <w:t xml:space="preserve">and 9.1, and I endorse it as an accurate account of the work and evidence</w:t>
+      </w:r>
+      <w:r>
+        <w:t xml:space="preserve"> </w:t>
+      </w:r>
+      <w:r>
+        <w:t xml:space="preserve">presented. The reflection in section 9.2 is in my own words. I have checked</w:t>
+      </w:r>
+      <w:r>
+        <w:t xml:space="preserve"> </w:t>
+      </w:r>
+      <w:r>
+        <w:t xml:space="preserve">the factual claims against the report and its recorded outputs. The nine</w:t>
+      </w:r>
+      <w:r>
+        <w:t xml:space="preserve"> </w:t>
+      </w:r>
+      <w:r>
+        <w:t xml:space="preserve">sources listed in Appendix E as unread remain outstanding and are not relied</w:t>
+      </w:r>
+      <w:r>
+        <w:t xml:space="preserve"> </w:t>
+      </w:r>
+      <w:r>
+        <w:t xml:space="preserve">on for claims beyond the verification recorded there.</w:t>
       </w:r>
     </w:p>
     <w:p>
@@ -3204,7 +3408,7 @@
         <w:t xml:space="preserve"> </w:t>
       </w:r>
       <w:r>
-        <w:t xml:space="preserve">are each covered by a test in the suite of forty-three, which passes in full</w:t>
+        <w:t xml:space="preserve">are each covered by a test in the suite of forty-nine, which passes in full</w:t>
       </w:r>
       <w:r>
         <w:t xml:space="preserve"> </w:t>
@@ -3377,6 +3581,7 @@
       <w:footnotePr>
         <w:numRestart w:val="eachSect"/>
       </w:footnotePr>
+      <w:pgSz w:h="16838" w:w="11906"/>
     </w:sectPr>
   </w:body>
 </w:document>

</xml_diff>

<commit_message>
Keep the report at the final tag and note the dashboard in the scope
</commit_message>
<xml_diff>
--- a/docs/deliverables/AI_Usage_Log.docx
+++ b/docs/deliverables/AI_Usage_Log.docx
@@ -2843,7 +2843,7 @@
               <w:rPr>
                 <w:sz w:val="19"/>
               </w:rPr>
-              <w:t xml:space="preserve">The tool drafted section 1.5, section 9.1 with Table 9, the paragraph on CRISP-DM in section 3, the restated argument in section 2.4, the list of abbreviations, the shortened abstract and the title page lines, corrected the counts in sections 4, A.3, A.4 and A.6, and later added the five results-site tests named in section 4 and re-ran Appendix D at the final tag, recording that run in Appendix D. No pipeline code and no result changed. I reviewed and revised the prose and checked the factual statements against the report and its recorded outputs before endorsing it.</w:t>
+              <w:t xml:space="preserve">The tool drafted section 1.5, section 9.1 with Table 9, the paragraph on CRISP-DM in section 3, the restated argument in section 2.4, the list of abbreviations, the shortened abstract and the title page lines, corrected the counts in sections 4, A.3, A.4 and A.6, built the review dashboard described in section 1.4 and its five tests on 18 October, and on 21 October re-ran Appendix D at the final tag, recording that run in Appendix D. No pipeline code and no result changed. I reviewed and revised the prose and checked the factual statements against the report and its recorded outputs before endorsing it.</w:t>
             </w:r>
           </w:p>
         </w:tc>
@@ -3198,37 +3198,43 @@
         <w:t xml:space="preserve"> </w:t>
       </w:r>
       <w:r>
-        <w:t xml:space="preserve">read and revised the AI-drafted prose in this report, including sections 1.5</w:t>
-      </w:r>
-      <w:r>
-        <w:t xml:space="preserve"> </w:t>
-      </w:r>
-      <w:r>
-        <w:t xml:space="preserve">and 9.1, and I endorse it as an accurate account of the work and evidence</w:t>
-      </w:r>
-      <w:r>
-        <w:t xml:space="preserve"> </w:t>
-      </w:r>
-      <w:r>
-        <w:t xml:space="preserve">presented. The reflection in section 9.2 is in my own words. I have checked</w:t>
-      </w:r>
-      <w:r>
-        <w:t xml:space="preserve"> </w:t>
-      </w:r>
-      <w:r>
-        <w:t xml:space="preserve">the factual claims against the report and its recorded outputs. The nine</w:t>
-      </w:r>
-      <w:r>
-        <w:t xml:space="preserve"> </w:t>
-      </w:r>
-      <w:r>
-        <w:t xml:space="preserve">sources listed in Appendix E as unread remain outstanding and are not relied</w:t>
-      </w:r>
-      <w:r>
-        <w:t xml:space="preserve"> </w:t>
-      </w:r>
-      <w:r>
-        <w:t xml:space="preserve">on for claims beyond the verification recorded there.</w:t>
+        <w:t xml:space="preserve">read and revised the AI-drafted prose in this report, including sections 2 and</w:t>
+      </w:r>
+      <w:r>
+        <w:t xml:space="preserve"> </w:t>
+      </w:r>
+      <w:r>
+        <w:t xml:space="preserve">7, Appendices E and F, and sections 1.5 and 9.1, and I endorse it as an</w:t>
+      </w:r>
+      <w:r>
+        <w:t xml:space="preserve"> </w:t>
+      </w:r>
+      <w:r>
+        <w:t xml:space="preserve">accurate account of the work and evidence presented. The reflection in section</w:t>
+      </w:r>
+      <w:r>
+        <w:t xml:space="preserve"> </w:t>
+      </w:r>
+      <w:r>
+        <w:t xml:space="preserve">9.2 is in my own words. I have checked the factual claims against the report</w:t>
+      </w:r>
+      <w:r>
+        <w:t xml:space="preserve"> </w:t>
+      </w:r>
+      <w:r>
+        <w:t xml:space="preserve">and its recorded outputs. The nine sources listed in Appendix E as unread</w:t>
+      </w:r>
+      <w:r>
+        <w:t xml:space="preserve"> </w:t>
+      </w:r>
+      <w:r>
+        <w:t xml:space="preserve">remain outstanding and are not relied on for claims beyond the verification</w:t>
+      </w:r>
+      <w:r>
+        <w:t xml:space="preserve"> </w:t>
+      </w:r>
+      <w:r>
+        <w:t xml:space="preserve">recorded there.</w:t>
       </w:r>
     </w:p>
     <w:p>
@@ -3408,7 +3414,7 @@
         <w:t xml:space="preserve"> </w:t>
       </w:r>
       <w:r>
-        <w:t xml:space="preserve">are each covered by a test in the suite of forty-nine, which passes in full</w:t>
+        <w:t xml:space="preserve">are each covered by a test in the suite of forty-four, which passes in full</w:t>
       </w:r>
       <w:r>
         <w:t xml:space="preserve"> </w:t>

</xml_diff>